<commit_message>
Add orchestration concepts and examples to documentation
</commit_message>
<xml_diff>
--- a/documentation/Gen AI and Agentic AI.docx
+++ b/documentation/Gen AI and Agentic AI.docx
@@ -4802,6 +4802,435 @@
       </w:r>
     </w:p>
     <w:p/>
+    <w:p>
+      <w:pPr>
+        <w:rPr>
+          <w:b/>
+          <w:bCs/>
+        </w:rPr>
+      </w:pPr>
+      <w:r>
+        <w:rPr>
+          <w:b/>
+          <w:bCs/>
+        </w:rPr>
+        <w:t>Day2</w:t>
+      </w:r>
+      <w:r>
+        <w:rPr>
+          <w:b/>
+          <w:bCs/>
+        </w:rPr>
+        <w:t>7</w:t>
+      </w:r>
+      <w:r>
+        <w:rPr>
+          <w:b/>
+          <w:bCs/>
+        </w:rPr>
+        <w:t>:</w:t>
+      </w:r>
+    </w:p>
+    <w:p>
+      <w:r>
+        <w:t>Orchestration</w:t>
+      </w:r>
+      <w:r>
+        <w:br/>
+        <w:t xml:space="preserve">    └── Workflow</w:t>
+      </w:r>
+      <w:r>
+        <w:br/>
+        <w:t xml:space="preserve">            └── Pipeline</w:t>
+      </w:r>
+    </w:p>
+    <w:p/>
+    <w:tbl>
+      <w:tblPr>
+        <w:tblW w:w="0" w:type="auto"/>
+        <w:tblCellSpacing w:w="15" w:type="dxa"/>
+        <w:tblCellMar>
+          <w:top w:w="15" w:type="dxa"/>
+          <w:left w:w="15" w:type="dxa"/>
+          <w:bottom w:w="15" w:type="dxa"/>
+          <w:right w:w="15" w:type="dxa"/>
+        </w:tblCellMar>
+        <w:tblLook w:val="04A0" w:firstRow="1" w:lastRow="0" w:firstColumn="1" w:lastColumn="0" w:noHBand="0" w:noVBand="1"/>
+      </w:tblPr>
+      <w:tblGrid>
+        <w:gridCol w:w="1587"/>
+        <w:gridCol w:w="5749"/>
+        <w:gridCol w:w="2024"/>
+      </w:tblGrid>
+      <w:tr>
+        <w:trPr>
+          <w:tblHeader/>
+          <w:tblCellSpacing w:w="15" w:type="dxa"/>
+        </w:trPr>
+        <w:tc>
+          <w:tcPr>
+            <w:tcW w:w="0" w:type="auto"/>
+            <w:vAlign w:val="center"/>
+            <w:hideMark/>
+          </w:tcPr>
+          <w:p>
+            <w:pPr>
+              <w:rPr>
+                <w:b/>
+                <w:bCs/>
+              </w:rPr>
+            </w:pPr>
+            <w:r>
+              <w:rPr>
+                <w:b/>
+                <w:bCs/>
+              </w:rPr>
+              <w:lastRenderedPageBreak/>
+              <w:t>Term</w:t>
+            </w:r>
+          </w:p>
+        </w:tc>
+        <w:tc>
+          <w:tcPr>
+            <w:tcW w:w="0" w:type="auto"/>
+            <w:vAlign w:val="center"/>
+            <w:hideMark/>
+          </w:tcPr>
+          <w:p>
+            <w:pPr>
+              <w:rPr>
+                <w:b/>
+                <w:bCs/>
+              </w:rPr>
+            </w:pPr>
+            <w:r>
+              <w:rPr>
+                <w:b/>
+                <w:bCs/>
+              </w:rPr>
+              <w:t>What it means</w:t>
+            </w:r>
+          </w:p>
+        </w:tc>
+        <w:tc>
+          <w:tcPr>
+            <w:tcW w:w="0" w:type="auto"/>
+            <w:vAlign w:val="center"/>
+            <w:hideMark/>
+          </w:tcPr>
+          <w:p>
+            <w:pPr>
+              <w:rPr>
+                <w:b/>
+                <w:bCs/>
+              </w:rPr>
+            </w:pPr>
+            <w:r>
+              <w:rPr>
+                <w:b/>
+                <w:bCs/>
+              </w:rPr>
+              <w:t>Focus</w:t>
+            </w:r>
+          </w:p>
+        </w:tc>
+      </w:tr>
+      <w:tr>
+        <w:trPr>
+          <w:tblCellSpacing w:w="15" w:type="dxa"/>
+        </w:trPr>
+        <w:tc>
+          <w:tcPr>
+            <w:tcW w:w="0" w:type="auto"/>
+            <w:vAlign w:val="center"/>
+            <w:hideMark/>
+          </w:tcPr>
+          <w:p>
+            <w:r>
+              <w:rPr>
+                <w:b/>
+                <w:bCs/>
+              </w:rPr>
+              <w:t>Pipeline</w:t>
+            </w:r>
+          </w:p>
+        </w:tc>
+        <w:tc>
+          <w:tcPr>
+            <w:tcW w:w="0" w:type="auto"/>
+            <w:vAlign w:val="center"/>
+            <w:hideMark/>
+          </w:tcPr>
+          <w:p>
+            <w:r>
+              <w:t>A sequence of processing steps where the output of one step becomes the input of the next.</w:t>
+            </w:r>
+          </w:p>
+        </w:tc>
+        <w:tc>
+          <w:tcPr>
+            <w:tcW w:w="0" w:type="auto"/>
+            <w:vAlign w:val="center"/>
+            <w:hideMark/>
+          </w:tcPr>
+          <w:p>
+            <w:r>
+              <w:t>Data flow</w:t>
+            </w:r>
+          </w:p>
+        </w:tc>
+      </w:tr>
+      <w:tr>
+        <w:trPr>
+          <w:tblCellSpacing w:w="15" w:type="dxa"/>
+        </w:trPr>
+        <w:tc>
+          <w:tcPr>
+            <w:tcW w:w="0" w:type="auto"/>
+            <w:vAlign w:val="center"/>
+            <w:hideMark/>
+          </w:tcPr>
+          <w:p>
+            <w:r>
+              <w:rPr>
+                <w:b/>
+                <w:bCs/>
+              </w:rPr>
+              <w:t>Workflow</w:t>
+            </w:r>
+          </w:p>
+        </w:tc>
+        <w:tc>
+          <w:tcPr>
+            <w:tcW w:w="0" w:type="auto"/>
+            <w:vAlign w:val="center"/>
+            <w:hideMark/>
+          </w:tcPr>
+          <w:p>
+            <w:r>
+              <w:t>A defined business or operational process that describes tasks, decisions, approvals, and execution logic.</w:t>
+            </w:r>
+          </w:p>
+        </w:tc>
+        <w:tc>
+          <w:tcPr>
+            <w:tcW w:w="0" w:type="auto"/>
+            <w:vAlign w:val="center"/>
+            <w:hideMark/>
+          </w:tcPr>
+          <w:p>
+            <w:r>
+              <w:t>Process flow</w:t>
+            </w:r>
+          </w:p>
+        </w:tc>
+      </w:tr>
+      <w:tr>
+        <w:trPr>
+          <w:tblCellSpacing w:w="15" w:type="dxa"/>
+        </w:trPr>
+        <w:tc>
+          <w:tcPr>
+            <w:tcW w:w="0" w:type="auto"/>
+            <w:vAlign w:val="center"/>
+            <w:hideMark/>
+          </w:tcPr>
+          <w:p>
+            <w:r>
+              <w:rPr>
+                <w:b/>
+                <w:bCs/>
+              </w:rPr>
+              <w:t>Orchestration</w:t>
+            </w:r>
+          </w:p>
+        </w:tc>
+        <w:tc>
+          <w:tcPr>
+            <w:tcW w:w="0" w:type="auto"/>
+            <w:vAlign w:val="center"/>
+            <w:hideMark/>
+          </w:tcPr>
+          <w:p>
+            <w:r>
+              <w:t>Coordination and management of multiple workflows, services, systems, or pipelines.</w:t>
+            </w:r>
+          </w:p>
+        </w:tc>
+        <w:tc>
+          <w:tcPr>
+            <w:tcW w:w="0" w:type="auto"/>
+            <w:vAlign w:val="center"/>
+            <w:hideMark/>
+          </w:tcPr>
+          <w:p>
+            <w:r>
+              <w:t>System-wide coordination</w:t>
+            </w:r>
+          </w:p>
+        </w:tc>
+      </w:tr>
+    </w:tbl>
+    <w:p/>
+    <w:p>
+      <w:r>
+        <w:t>Example in an AI application:</w:t>
+      </w:r>
+    </w:p>
+    <w:p>
+      <w:pPr>
+        <w:numPr>
+          <w:ilvl w:val="0"/>
+          <w:numId w:val="23"/>
+        </w:numPr>
+      </w:pPr>
+      <w:r>
+        <w:t xml:space="preserve">Pipeline: Retrieve documents → Rank results → Generate answer </w:t>
+      </w:r>
+    </w:p>
+    <w:p>
+      <w:pPr>
+        <w:numPr>
+          <w:ilvl w:val="0"/>
+          <w:numId w:val="23"/>
+        </w:numPr>
+      </w:pPr>
+      <w:r>
+        <w:t xml:space="preserve">Workflow: Handle user query, approval checks, retries, notifications </w:t>
+      </w:r>
+    </w:p>
+    <w:p>
+      <w:pPr>
+        <w:numPr>
+          <w:ilvl w:val="0"/>
+          <w:numId w:val="23"/>
+        </w:numPr>
+      </w:pPr>
+      <w:r>
+        <w:t xml:space="preserve">Orchestration: Coordinate multiple agents, workflows, databases, APIs, and monitoring across the entire platform </w:t>
+      </w:r>
+    </w:p>
+    <w:p>
+      <w:r>
+        <w:t>A simple rule of thumb:</w:t>
+      </w:r>
+    </w:p>
+    <w:p>
+      <w:pPr>
+        <w:numPr>
+          <w:ilvl w:val="0"/>
+          <w:numId w:val="24"/>
+        </w:numPr>
+      </w:pPr>
+      <w:r>
+        <w:t xml:space="preserve">Pipeline = sequence of transformations </w:t>
+      </w:r>
+    </w:p>
+    <w:p>
+      <w:pPr>
+        <w:numPr>
+          <w:ilvl w:val="0"/>
+          <w:numId w:val="24"/>
+        </w:numPr>
+      </w:pPr>
+      <w:r>
+        <w:t xml:space="preserve">Workflow = sequence of tasks with business logic </w:t>
+      </w:r>
+    </w:p>
+    <w:p>
+      <w:pPr>
+        <w:numPr>
+          <w:ilvl w:val="0"/>
+          <w:numId w:val="24"/>
+        </w:numPr>
+      </w:pPr>
+      <w:r>
+        <w:t>Orchestration = coordination of workflows and systems</w:t>
+      </w:r>
+    </w:p>
+    <w:p/>
+    <w:p>
+      <w:r>
+        <w:rPr>
+          <w:b/>
+          <w:bCs/>
+        </w:rPr>
+        <w:t>Assignments</w:t>
+      </w:r>
+      <w:r>
+        <w:t>: implement a customer support pipeline</w:t>
+      </w:r>
+    </w:p>
+    <w:p>
+      <w:r>
+        <w:t>Customer sends a message -</w:t>
+      </w:r>
+      <w:r>
+        <w:t>&gt; Sentiment</w:t>
+      </w:r>
+      <w:r>
+        <w:t xml:space="preserve"> analysis -&gt; Priority detection -&gt; Knowledge Graph/docs -&gt; AI Response generation </w:t>
+      </w:r>
+      <w:r>
+        <w:t>-&gt; response delivered to the USER -&gt; CRM Updated</w:t>
+      </w:r>
+    </w:p>
+    <w:p>
+      <w:r>
+        <w:rPr>
+          <w:color w:val="EE0000"/>
+        </w:rPr>
+        <w:t xml:space="preserve">On Fail </w:t>
+      </w:r>
+      <w:r>
+        <w:rPr>
+          <w:color w:val="EE0000"/>
+        </w:rPr>
+        <w:t>Over:</w:t>
+      </w:r>
+      <w:r>
+        <w:t xml:space="preserve"> retry</w:t>
+      </w:r>
+      <w:r>
+        <w:t xml:space="preserve"> -&gt; </w:t>
+      </w:r>
+      <w:r>
+        <w:t>fallbacks (</w:t>
+      </w:r>
+      <w:r>
+        <w:t>backup system, or alternative path</w:t>
+      </w:r>
+      <w:r>
+        <w:t>)</w:t>
+      </w:r>
+      <w:r>
+        <w:t xml:space="preserve"> – Error handling </w:t>
+      </w:r>
+    </w:p>
+    <w:p>
+      <w:r>
+        <w:t xml:space="preserve">Use Cases: HR, </w:t>
+      </w:r>
+      <w:r>
+        <w:t>IT,</w:t>
+      </w:r>
+      <w:r>
+        <w:t xml:space="preserve"> </w:t>
+      </w:r>
+      <w:r>
+        <w:t>Finance,</w:t>
+      </w:r>
+      <w:r>
+        <w:t xml:space="preserve"> </w:t>
+      </w:r>
+      <w:r>
+        <w:t>Support,</w:t>
+      </w:r>
+      <w:r>
+        <w:t xml:space="preserve"> Sales</w:t>
+      </w:r>
+    </w:p>
+    <w:p/>
     <w:p/>
     <w:p/>
     <w:p>
@@ -4881,6 +5310,155 @@
 <file path=word/numbering.xml><?xml version="1.0" encoding="utf-8"?>
 <w:numbering xmlns:wpc="http://schemas.microsoft.com/office/word/2010/wordprocessingCanvas" xmlns:cx="http://schemas.microsoft.com/office/drawing/2014/chartex" xmlns:cx1="http://schemas.microsoft.com/office/drawing/2015/9/8/chartex" xmlns:cx2="http://schemas.microsoft.com/office/drawing/2015/10/21/chartex" xmlns:cx3="http://schemas.microsoft.com/office/drawing/2016/5/9/chartex" xmlns:cx4="http://schemas.microsoft.com/office/drawing/2016/5/10/chartex" xmlns:cx5="http://schemas.microsoft.com/office/drawing/2016/5/11/chartex" xmlns:cx6="http://schemas.microsoft.com/office/drawing/2016/5/12/chartex" xmlns:cx7="http://schemas.microsoft.com/office/drawing/2016/5/13/chartex" xmlns:cx8="http://schemas.microsoft.com/office/drawing/2016/5/14/chartex" xmlns:mc="http://schemas.openxmlformats.org/markup-compatibility/2006" xmlns:aink="http://schemas.microsoft.com/office/drawing/2016/ink" xmlns:am3d="http://schemas.microsoft.com/office/drawing/2017/model3d" xmlns:o="urn:schemas-microsoft-com:office:office" xmlns:oel="http://schemas.microsoft.com/office/2019/extlst" xmlns:r="http://schemas.openxmlformats.org/officeDocument/2006/relationships" xmlns:m="http://schemas.openxmlformats.org/officeDocument/2006/math" xmlns:v="urn:schemas-microsoft-com:vml" xmlns:wp14="http://schemas.microsoft.com/office/word/2010/wordprocessingDrawing" xmlns:wp="http://schemas.openxmlformats.org/drawingml/2006/wordprocessingDrawing" xmlns:w10="urn:schemas-microsoft-com:office:word" xmlns:w="http://schemas.openxmlformats.org/wordprocessingml/2006/main" xmlns:w14="http://schemas.microsoft.com/office/word/2010/wordml" xmlns:w15="http://schemas.microsoft.com/office/word/2012/wordml" xmlns:w16cex="http://schemas.microsoft.com/office/word/2018/wordml/cex" xmlns:w16cid="http://schemas.microsoft.com/office/word/2016/wordml/cid" xmlns:w16="http://schemas.microsoft.com/office/word/2018/wordml" xmlns:w16du="http://schemas.microsoft.com/office/word/2023/wordml/word16du" xmlns:w16sdtdh="http://schemas.microsoft.com/office/word/2020/wordml/sdtdatahash" xmlns:w16sdtfl="http://schemas.microsoft.com/office/word/2024/wordml/sdtformatlock" xmlns:w16se="http://schemas.microsoft.com/office/word/2015/wordml/symex" xmlns:wpg="http://schemas.microsoft.com/office/word/2010/wordprocessingGroup" xmlns:wpi="http://schemas.microsoft.com/office/word/2010/wordprocessingInk" xmlns:wne="http://schemas.microsoft.com/office/word/2006/wordml" xmlns:wps="http://schemas.microsoft.com/office/word/2010/wordprocessingShape" mc:Ignorable="w14 w15 w16se w16cid w16 w16cex w16sdtdh w16sdtfl w16du wp14">
   <w:abstractNum w:abstractNumId="0" w15:restartNumberingAfterBreak="0">
+    <w:nsid w:val="03492974"/>
+    <w:multiLevelType w:val="multilevel"/>
+    <w:tmpl w:val="F9C0CD90"/>
+    <w:lvl w:ilvl="0">
+      <w:start w:val="1"/>
+      <w:numFmt w:val="bullet"/>
+      <w:lvlText w:val=""/>
+      <w:lvlJc w:val="left"/>
+      <w:pPr>
+        <w:tabs>
+          <w:tab w:val="num" w:pos="720"/>
+        </w:tabs>
+        <w:ind w:left="720" w:hanging="360"/>
+      </w:pPr>
+      <w:rPr>
+        <w:rFonts w:ascii="Symbol" w:hAnsi="Symbol" w:hint="default"/>
+        <w:sz w:val="20"/>
+      </w:rPr>
+    </w:lvl>
+    <w:lvl w:ilvl="1" w:tentative="1">
+      <w:start w:val="1"/>
+      <w:numFmt w:val="bullet"/>
+      <w:lvlText w:val="o"/>
+      <w:lvlJc w:val="left"/>
+      <w:pPr>
+        <w:tabs>
+          <w:tab w:val="num" w:pos="1440"/>
+        </w:tabs>
+        <w:ind w:left="1440" w:hanging="360"/>
+      </w:pPr>
+      <w:rPr>
+        <w:rFonts w:ascii="Courier New" w:hAnsi="Courier New" w:hint="default"/>
+        <w:sz w:val="20"/>
+      </w:rPr>
+    </w:lvl>
+    <w:lvl w:ilvl="2" w:tentative="1">
+      <w:start w:val="1"/>
+      <w:numFmt w:val="bullet"/>
+      <w:lvlText w:val=""/>
+      <w:lvlJc w:val="left"/>
+      <w:pPr>
+        <w:tabs>
+          <w:tab w:val="num" w:pos="2160"/>
+        </w:tabs>
+        <w:ind w:left="2160" w:hanging="360"/>
+      </w:pPr>
+      <w:rPr>
+        <w:rFonts w:ascii="Wingdings" w:hAnsi="Wingdings" w:hint="default"/>
+        <w:sz w:val="20"/>
+      </w:rPr>
+    </w:lvl>
+    <w:lvl w:ilvl="3" w:tentative="1">
+      <w:start w:val="1"/>
+      <w:numFmt w:val="bullet"/>
+      <w:lvlText w:val=""/>
+      <w:lvlJc w:val="left"/>
+      <w:pPr>
+        <w:tabs>
+          <w:tab w:val="num" w:pos="2880"/>
+        </w:tabs>
+        <w:ind w:left="2880" w:hanging="360"/>
+      </w:pPr>
+      <w:rPr>
+        <w:rFonts w:ascii="Wingdings" w:hAnsi="Wingdings" w:hint="default"/>
+        <w:sz w:val="20"/>
+      </w:rPr>
+    </w:lvl>
+    <w:lvl w:ilvl="4" w:tentative="1">
+      <w:start w:val="1"/>
+      <w:numFmt w:val="bullet"/>
+      <w:lvlText w:val=""/>
+      <w:lvlJc w:val="left"/>
+      <w:pPr>
+        <w:tabs>
+          <w:tab w:val="num" w:pos="3600"/>
+        </w:tabs>
+        <w:ind w:left="3600" w:hanging="360"/>
+      </w:pPr>
+      <w:rPr>
+        <w:rFonts w:ascii="Wingdings" w:hAnsi="Wingdings" w:hint="default"/>
+        <w:sz w:val="20"/>
+      </w:rPr>
+    </w:lvl>
+    <w:lvl w:ilvl="5" w:tentative="1">
+      <w:start w:val="1"/>
+      <w:numFmt w:val="bullet"/>
+      <w:lvlText w:val=""/>
+      <w:lvlJc w:val="left"/>
+      <w:pPr>
+        <w:tabs>
+          <w:tab w:val="num" w:pos="4320"/>
+        </w:tabs>
+        <w:ind w:left="4320" w:hanging="360"/>
+      </w:pPr>
+      <w:rPr>
+        <w:rFonts w:ascii="Wingdings" w:hAnsi="Wingdings" w:hint="default"/>
+        <w:sz w:val="20"/>
+      </w:rPr>
+    </w:lvl>
+    <w:lvl w:ilvl="6" w:tentative="1">
+      <w:start w:val="1"/>
+      <w:numFmt w:val="bullet"/>
+      <w:lvlText w:val=""/>
+      <w:lvlJc w:val="left"/>
+      <w:pPr>
+        <w:tabs>
+          <w:tab w:val="num" w:pos="5040"/>
+        </w:tabs>
+        <w:ind w:left="5040" w:hanging="360"/>
+      </w:pPr>
+      <w:rPr>
+        <w:rFonts w:ascii="Wingdings" w:hAnsi="Wingdings" w:hint="default"/>
+        <w:sz w:val="20"/>
+      </w:rPr>
+    </w:lvl>
+    <w:lvl w:ilvl="7" w:tentative="1">
+      <w:start w:val="1"/>
+      <w:numFmt w:val="bullet"/>
+      <w:lvlText w:val=""/>
+      <w:lvlJc w:val="left"/>
+      <w:pPr>
+        <w:tabs>
+          <w:tab w:val="num" w:pos="5760"/>
+        </w:tabs>
+        <w:ind w:left="5760" w:hanging="360"/>
+      </w:pPr>
+      <w:rPr>
+        <w:rFonts w:ascii="Wingdings" w:hAnsi="Wingdings" w:hint="default"/>
+        <w:sz w:val="20"/>
+      </w:rPr>
+    </w:lvl>
+    <w:lvl w:ilvl="8" w:tentative="1">
+      <w:start w:val="1"/>
+      <w:numFmt w:val="bullet"/>
+      <w:lvlText w:val=""/>
+      <w:lvlJc w:val="left"/>
+      <w:pPr>
+        <w:tabs>
+          <w:tab w:val="num" w:pos="6480"/>
+        </w:tabs>
+        <w:ind w:left="6480" w:hanging="360"/>
+      </w:pPr>
+      <w:rPr>
+        <w:rFonts w:ascii="Wingdings" w:hAnsi="Wingdings" w:hint="default"/>
+        <w:sz w:val="20"/>
+      </w:rPr>
+    </w:lvl>
+  </w:abstractNum>
+  <w:abstractNum w:abstractNumId="1" w15:restartNumberingAfterBreak="0">
     <w:nsid w:val="0FB11F84"/>
     <w:multiLevelType w:val="hybridMultilevel"/>
     <w:tmpl w:val="833E6F84"/>
@@ -4969,7 +5547,7 @@
       </w:pPr>
     </w:lvl>
   </w:abstractNum>
-  <w:abstractNum w:abstractNumId="1" w15:restartNumberingAfterBreak="0">
+  <w:abstractNum w:abstractNumId="2" w15:restartNumberingAfterBreak="0">
     <w:nsid w:val="12742E8C"/>
     <w:multiLevelType w:val="hybridMultilevel"/>
     <w:tmpl w:val="B3E2921C"/>
@@ -5058,7 +5636,7 @@
       </w:pPr>
     </w:lvl>
   </w:abstractNum>
-  <w:abstractNum w:abstractNumId="2" w15:restartNumberingAfterBreak="0">
+  <w:abstractNum w:abstractNumId="3" w15:restartNumberingAfterBreak="0">
     <w:nsid w:val="16EA531D"/>
     <w:multiLevelType w:val="hybridMultilevel"/>
     <w:tmpl w:val="C1CEAA96"/>
@@ -5147,7 +5725,7 @@
       </w:pPr>
     </w:lvl>
   </w:abstractNum>
-  <w:abstractNum w:abstractNumId="3" w15:restartNumberingAfterBreak="0">
+  <w:abstractNum w:abstractNumId="4" w15:restartNumberingAfterBreak="0">
     <w:nsid w:val="181F1647"/>
     <w:multiLevelType w:val="hybridMultilevel"/>
     <w:tmpl w:val="19260786"/>
@@ -5236,7 +5814,156 @@
       </w:pPr>
     </w:lvl>
   </w:abstractNum>
-  <w:abstractNum w:abstractNumId="4" w15:restartNumberingAfterBreak="0">
+  <w:abstractNum w:abstractNumId="5" w15:restartNumberingAfterBreak="0">
+    <w:nsid w:val="18A060DB"/>
+    <w:multiLevelType w:val="multilevel"/>
+    <w:tmpl w:val="0B5889FA"/>
+    <w:lvl w:ilvl="0">
+      <w:start w:val="1"/>
+      <w:numFmt w:val="bullet"/>
+      <w:lvlText w:val=""/>
+      <w:lvlJc w:val="left"/>
+      <w:pPr>
+        <w:tabs>
+          <w:tab w:val="num" w:pos="720"/>
+        </w:tabs>
+        <w:ind w:left="720" w:hanging="360"/>
+      </w:pPr>
+      <w:rPr>
+        <w:rFonts w:ascii="Symbol" w:hAnsi="Symbol" w:hint="default"/>
+        <w:sz w:val="20"/>
+      </w:rPr>
+    </w:lvl>
+    <w:lvl w:ilvl="1" w:tentative="1">
+      <w:start w:val="1"/>
+      <w:numFmt w:val="bullet"/>
+      <w:lvlText w:val="o"/>
+      <w:lvlJc w:val="left"/>
+      <w:pPr>
+        <w:tabs>
+          <w:tab w:val="num" w:pos="1440"/>
+        </w:tabs>
+        <w:ind w:left="1440" w:hanging="360"/>
+      </w:pPr>
+      <w:rPr>
+        <w:rFonts w:ascii="Courier New" w:hAnsi="Courier New" w:hint="default"/>
+        <w:sz w:val="20"/>
+      </w:rPr>
+    </w:lvl>
+    <w:lvl w:ilvl="2" w:tentative="1">
+      <w:start w:val="1"/>
+      <w:numFmt w:val="bullet"/>
+      <w:lvlText w:val=""/>
+      <w:lvlJc w:val="left"/>
+      <w:pPr>
+        <w:tabs>
+          <w:tab w:val="num" w:pos="2160"/>
+        </w:tabs>
+        <w:ind w:left="2160" w:hanging="360"/>
+      </w:pPr>
+      <w:rPr>
+        <w:rFonts w:ascii="Wingdings" w:hAnsi="Wingdings" w:hint="default"/>
+        <w:sz w:val="20"/>
+      </w:rPr>
+    </w:lvl>
+    <w:lvl w:ilvl="3" w:tentative="1">
+      <w:start w:val="1"/>
+      <w:numFmt w:val="bullet"/>
+      <w:lvlText w:val=""/>
+      <w:lvlJc w:val="left"/>
+      <w:pPr>
+        <w:tabs>
+          <w:tab w:val="num" w:pos="2880"/>
+        </w:tabs>
+        <w:ind w:left="2880" w:hanging="360"/>
+      </w:pPr>
+      <w:rPr>
+        <w:rFonts w:ascii="Wingdings" w:hAnsi="Wingdings" w:hint="default"/>
+        <w:sz w:val="20"/>
+      </w:rPr>
+    </w:lvl>
+    <w:lvl w:ilvl="4" w:tentative="1">
+      <w:start w:val="1"/>
+      <w:numFmt w:val="bullet"/>
+      <w:lvlText w:val=""/>
+      <w:lvlJc w:val="left"/>
+      <w:pPr>
+        <w:tabs>
+          <w:tab w:val="num" w:pos="3600"/>
+        </w:tabs>
+        <w:ind w:left="3600" w:hanging="360"/>
+      </w:pPr>
+      <w:rPr>
+        <w:rFonts w:ascii="Wingdings" w:hAnsi="Wingdings" w:hint="default"/>
+        <w:sz w:val="20"/>
+      </w:rPr>
+    </w:lvl>
+    <w:lvl w:ilvl="5" w:tentative="1">
+      <w:start w:val="1"/>
+      <w:numFmt w:val="bullet"/>
+      <w:lvlText w:val=""/>
+      <w:lvlJc w:val="left"/>
+      <w:pPr>
+        <w:tabs>
+          <w:tab w:val="num" w:pos="4320"/>
+        </w:tabs>
+        <w:ind w:left="4320" w:hanging="360"/>
+      </w:pPr>
+      <w:rPr>
+        <w:rFonts w:ascii="Wingdings" w:hAnsi="Wingdings" w:hint="default"/>
+        <w:sz w:val="20"/>
+      </w:rPr>
+    </w:lvl>
+    <w:lvl w:ilvl="6" w:tentative="1">
+      <w:start w:val="1"/>
+      <w:numFmt w:val="bullet"/>
+      <w:lvlText w:val=""/>
+      <w:lvlJc w:val="left"/>
+      <w:pPr>
+        <w:tabs>
+          <w:tab w:val="num" w:pos="5040"/>
+        </w:tabs>
+        <w:ind w:left="5040" w:hanging="360"/>
+      </w:pPr>
+      <w:rPr>
+        <w:rFonts w:ascii="Wingdings" w:hAnsi="Wingdings" w:hint="default"/>
+        <w:sz w:val="20"/>
+      </w:rPr>
+    </w:lvl>
+    <w:lvl w:ilvl="7" w:tentative="1">
+      <w:start w:val="1"/>
+      <w:numFmt w:val="bullet"/>
+      <w:lvlText w:val=""/>
+      <w:lvlJc w:val="left"/>
+      <w:pPr>
+        <w:tabs>
+          <w:tab w:val="num" w:pos="5760"/>
+        </w:tabs>
+        <w:ind w:left="5760" w:hanging="360"/>
+      </w:pPr>
+      <w:rPr>
+        <w:rFonts w:ascii="Wingdings" w:hAnsi="Wingdings" w:hint="default"/>
+        <w:sz w:val="20"/>
+      </w:rPr>
+    </w:lvl>
+    <w:lvl w:ilvl="8" w:tentative="1">
+      <w:start w:val="1"/>
+      <w:numFmt w:val="bullet"/>
+      <w:lvlText w:val=""/>
+      <w:lvlJc w:val="left"/>
+      <w:pPr>
+        <w:tabs>
+          <w:tab w:val="num" w:pos="6480"/>
+        </w:tabs>
+        <w:ind w:left="6480" w:hanging="360"/>
+      </w:pPr>
+      <w:rPr>
+        <w:rFonts w:ascii="Wingdings" w:hAnsi="Wingdings" w:hint="default"/>
+        <w:sz w:val="20"/>
+      </w:rPr>
+    </w:lvl>
+  </w:abstractNum>
+  <w:abstractNum w:abstractNumId="6" w15:restartNumberingAfterBreak="0">
     <w:nsid w:val="26BE7F6F"/>
     <w:multiLevelType w:val="hybridMultilevel"/>
     <w:tmpl w:val="C5468F5A"/>
@@ -5325,7 +6052,7 @@
       </w:pPr>
     </w:lvl>
   </w:abstractNum>
-  <w:abstractNum w:abstractNumId="5" w15:restartNumberingAfterBreak="0">
+  <w:abstractNum w:abstractNumId="7" w15:restartNumberingAfterBreak="0">
     <w:nsid w:val="2E842943"/>
     <w:multiLevelType w:val="multilevel"/>
     <w:tmpl w:val="556EC812"/>
@@ -5474,7 +6201,7 @@
       </w:rPr>
     </w:lvl>
   </w:abstractNum>
-  <w:abstractNum w:abstractNumId="6" w15:restartNumberingAfterBreak="0">
+  <w:abstractNum w:abstractNumId="8" w15:restartNumberingAfterBreak="0">
     <w:nsid w:val="31E8512B"/>
     <w:multiLevelType w:val="multilevel"/>
     <w:tmpl w:val="E558EF64"/>
@@ -5615,7 +6342,7 @@
       </w:rPr>
     </w:lvl>
   </w:abstractNum>
-  <w:abstractNum w:abstractNumId="7" w15:restartNumberingAfterBreak="0">
+  <w:abstractNum w:abstractNumId="9" w15:restartNumberingAfterBreak="0">
     <w:nsid w:val="32ED79B3"/>
     <w:multiLevelType w:val="multilevel"/>
     <w:tmpl w:val="33628A3C"/>
@@ -5764,7 +6491,7 @@
       </w:rPr>
     </w:lvl>
   </w:abstractNum>
-  <w:abstractNum w:abstractNumId="8" w15:restartNumberingAfterBreak="0">
+  <w:abstractNum w:abstractNumId="10" w15:restartNumberingAfterBreak="0">
     <w:nsid w:val="3F8F23A1"/>
     <w:multiLevelType w:val="multilevel"/>
     <w:tmpl w:val="7ECCBCB4"/>
@@ -5908,7 +6635,7 @@
       </w:rPr>
     </w:lvl>
   </w:abstractNum>
-  <w:abstractNum w:abstractNumId="9" w15:restartNumberingAfterBreak="0">
+  <w:abstractNum w:abstractNumId="11" w15:restartNumberingAfterBreak="0">
     <w:nsid w:val="4335094D"/>
     <w:multiLevelType w:val="multilevel"/>
     <w:tmpl w:val="E2F696F8"/>
@@ -6053,7 +6780,7 @@
       </w:rPr>
     </w:lvl>
   </w:abstractNum>
-  <w:abstractNum w:abstractNumId="10" w15:restartNumberingAfterBreak="0">
+  <w:abstractNum w:abstractNumId="12" w15:restartNumberingAfterBreak="0">
     <w:nsid w:val="4AEE4377"/>
     <w:multiLevelType w:val="hybridMultilevel"/>
     <w:tmpl w:val="72440734"/>
@@ -6142,7 +6869,7 @@
       </w:pPr>
     </w:lvl>
   </w:abstractNum>
-  <w:abstractNum w:abstractNumId="11" w15:restartNumberingAfterBreak="0">
+  <w:abstractNum w:abstractNumId="13" w15:restartNumberingAfterBreak="0">
     <w:nsid w:val="4C4F3E43"/>
     <w:multiLevelType w:val="multilevel"/>
     <w:tmpl w:val="7DCEB57C"/>
@@ -6291,7 +7018,7 @@
       </w:rPr>
     </w:lvl>
   </w:abstractNum>
-  <w:abstractNum w:abstractNumId="12" w15:restartNumberingAfterBreak="0">
+  <w:abstractNum w:abstractNumId="14" w15:restartNumberingAfterBreak="0">
     <w:nsid w:val="5516795B"/>
     <w:multiLevelType w:val="multilevel"/>
     <w:tmpl w:val="EEB8C188"/>
@@ -6440,7 +7167,7 @@
       </w:rPr>
     </w:lvl>
   </w:abstractNum>
-  <w:abstractNum w:abstractNumId="13" w15:restartNumberingAfterBreak="0">
+  <w:abstractNum w:abstractNumId="15" w15:restartNumberingAfterBreak="0">
     <w:nsid w:val="56205641"/>
     <w:multiLevelType w:val="hybridMultilevel"/>
     <w:tmpl w:val="E05E16C6"/>
@@ -6529,7 +7256,7 @@
       </w:pPr>
     </w:lvl>
   </w:abstractNum>
-  <w:abstractNum w:abstractNumId="14" w15:restartNumberingAfterBreak="0">
+  <w:abstractNum w:abstractNumId="16" w15:restartNumberingAfterBreak="0">
     <w:nsid w:val="5968420F"/>
     <w:multiLevelType w:val="hybridMultilevel"/>
     <w:tmpl w:val="B6207FFC"/>
@@ -6618,7 +7345,7 @@
       </w:pPr>
     </w:lvl>
   </w:abstractNum>
-  <w:abstractNum w:abstractNumId="15" w15:restartNumberingAfterBreak="0">
+  <w:abstractNum w:abstractNumId="17" w15:restartNumberingAfterBreak="0">
     <w:nsid w:val="5E3D0D02"/>
     <w:multiLevelType w:val="hybridMultilevel"/>
     <w:tmpl w:val="A2C03018"/>
@@ -6707,7 +7434,7 @@
       </w:pPr>
     </w:lvl>
   </w:abstractNum>
-  <w:abstractNum w:abstractNumId="16" w15:restartNumberingAfterBreak="0">
+  <w:abstractNum w:abstractNumId="18" w15:restartNumberingAfterBreak="0">
     <w:nsid w:val="6095782C"/>
     <w:multiLevelType w:val="hybridMultilevel"/>
     <w:tmpl w:val="06EE4D14"/>
@@ -6796,7 +7523,7 @@
       </w:pPr>
     </w:lvl>
   </w:abstractNum>
-  <w:abstractNum w:abstractNumId="17" w15:restartNumberingAfterBreak="0">
+  <w:abstractNum w:abstractNumId="19" w15:restartNumberingAfterBreak="0">
     <w:nsid w:val="62965CA0"/>
     <w:multiLevelType w:val="hybridMultilevel"/>
     <w:tmpl w:val="B540E736"/>
@@ -6885,7 +7612,7 @@
       </w:pPr>
     </w:lvl>
   </w:abstractNum>
-  <w:abstractNum w:abstractNumId="18" w15:restartNumberingAfterBreak="0">
+  <w:abstractNum w:abstractNumId="20" w15:restartNumberingAfterBreak="0">
     <w:nsid w:val="63102536"/>
     <w:multiLevelType w:val="multilevel"/>
     <w:tmpl w:val="45FE758A"/>
@@ -7026,7 +7753,7 @@
       </w:rPr>
     </w:lvl>
   </w:abstractNum>
-  <w:abstractNum w:abstractNumId="19" w15:restartNumberingAfterBreak="0">
+  <w:abstractNum w:abstractNumId="21" w15:restartNumberingAfterBreak="0">
     <w:nsid w:val="6BA431A0"/>
     <w:multiLevelType w:val="hybridMultilevel"/>
     <w:tmpl w:val="6C823EEE"/>
@@ -7115,7 +7842,7 @@
       </w:pPr>
     </w:lvl>
   </w:abstractNum>
-  <w:abstractNum w:abstractNumId="20" w15:restartNumberingAfterBreak="0">
+  <w:abstractNum w:abstractNumId="22" w15:restartNumberingAfterBreak="0">
     <w:nsid w:val="6F351E87"/>
     <w:multiLevelType w:val="hybridMultilevel"/>
     <w:tmpl w:val="BCA6A040"/>
@@ -7204,7 +7931,7 @@
       </w:pPr>
     </w:lvl>
   </w:abstractNum>
-  <w:abstractNum w:abstractNumId="21" w15:restartNumberingAfterBreak="0">
+  <w:abstractNum w:abstractNumId="23" w15:restartNumberingAfterBreak="0">
     <w:nsid w:val="74A06A07"/>
     <w:multiLevelType w:val="multilevel"/>
     <w:tmpl w:val="B372AAC2"/>
@@ -7354,70 +8081,76 @@
     </w:lvl>
   </w:abstractNum>
   <w:num w:numId="1" w16cid:durableId="2027361450">
+    <w:abstractNumId w:val="3"/>
+  </w:num>
+  <w:num w:numId="2" w16cid:durableId="89474774">
+    <w:abstractNumId w:val="1"/>
+  </w:num>
+  <w:num w:numId="3" w16cid:durableId="1565987135">
+    <w:abstractNumId w:val="19"/>
+  </w:num>
+  <w:num w:numId="4" w16cid:durableId="1894853876">
+    <w:abstractNumId w:val="7"/>
+  </w:num>
+  <w:num w:numId="5" w16cid:durableId="1079862085">
+    <w:abstractNumId w:val="9"/>
+  </w:num>
+  <w:num w:numId="6" w16cid:durableId="1162701932">
+    <w:abstractNumId w:val="20"/>
+  </w:num>
+  <w:num w:numId="7" w16cid:durableId="1583375958">
+    <w:abstractNumId w:val="10"/>
+  </w:num>
+  <w:num w:numId="8" w16cid:durableId="757484132">
+    <w:abstractNumId w:val="11"/>
+  </w:num>
+  <w:num w:numId="9" w16cid:durableId="1965428134">
+    <w:abstractNumId w:val="8"/>
+  </w:num>
+  <w:num w:numId="10" w16cid:durableId="226041387">
+    <w:abstractNumId w:val="14"/>
+  </w:num>
+  <w:num w:numId="11" w16cid:durableId="256597975">
+    <w:abstractNumId w:val="18"/>
+  </w:num>
+  <w:num w:numId="12" w16cid:durableId="444689046">
+    <w:abstractNumId w:val="17"/>
+  </w:num>
+  <w:num w:numId="13" w16cid:durableId="592905992">
+    <w:abstractNumId w:val="6"/>
+  </w:num>
+  <w:num w:numId="14" w16cid:durableId="1496647040">
+    <w:abstractNumId w:val="12"/>
+  </w:num>
+  <w:num w:numId="15" w16cid:durableId="1951038081">
+    <w:abstractNumId w:val="15"/>
+  </w:num>
+  <w:num w:numId="16" w16cid:durableId="2078043842">
+    <w:abstractNumId w:val="22"/>
+  </w:num>
+  <w:num w:numId="17" w16cid:durableId="822041288">
+    <w:abstractNumId w:val="23"/>
+  </w:num>
+  <w:num w:numId="18" w16cid:durableId="1990745772">
+    <w:abstractNumId w:val="13"/>
+  </w:num>
+  <w:num w:numId="19" w16cid:durableId="1348405061">
+    <w:abstractNumId w:val="4"/>
+  </w:num>
+  <w:num w:numId="20" w16cid:durableId="756633860">
+    <w:abstractNumId w:val="16"/>
+  </w:num>
+  <w:num w:numId="21" w16cid:durableId="138809987">
     <w:abstractNumId w:val="2"/>
   </w:num>
-  <w:num w:numId="2" w16cid:durableId="89474774">
-    <w:abstractNumId w:val="0"/>
+  <w:num w:numId="22" w16cid:durableId="484662782">
+    <w:abstractNumId w:val="21"/>
   </w:num>
-  <w:num w:numId="3" w16cid:durableId="1565987135">
-    <w:abstractNumId w:val="17"/>
-  </w:num>
-  <w:num w:numId="4" w16cid:durableId="1894853876">
+  <w:num w:numId="23" w16cid:durableId="1642954586">
     <w:abstractNumId w:val="5"/>
   </w:num>
-  <w:num w:numId="5" w16cid:durableId="1079862085">
-    <w:abstractNumId w:val="7"/>
-  </w:num>
-  <w:num w:numId="6" w16cid:durableId="1162701932">
-    <w:abstractNumId w:val="18"/>
-  </w:num>
-  <w:num w:numId="7" w16cid:durableId="1583375958">
-    <w:abstractNumId w:val="8"/>
-  </w:num>
-  <w:num w:numId="8" w16cid:durableId="757484132">
-    <w:abstractNumId w:val="9"/>
-  </w:num>
-  <w:num w:numId="9" w16cid:durableId="1965428134">
-    <w:abstractNumId w:val="6"/>
-  </w:num>
-  <w:num w:numId="10" w16cid:durableId="226041387">
-    <w:abstractNumId w:val="12"/>
-  </w:num>
-  <w:num w:numId="11" w16cid:durableId="256597975">
-    <w:abstractNumId w:val="16"/>
-  </w:num>
-  <w:num w:numId="12" w16cid:durableId="444689046">
-    <w:abstractNumId w:val="15"/>
-  </w:num>
-  <w:num w:numId="13" w16cid:durableId="592905992">
-    <w:abstractNumId w:val="4"/>
-  </w:num>
-  <w:num w:numId="14" w16cid:durableId="1496647040">
-    <w:abstractNumId w:val="10"/>
-  </w:num>
-  <w:num w:numId="15" w16cid:durableId="1951038081">
-    <w:abstractNumId w:val="13"/>
-  </w:num>
-  <w:num w:numId="16" w16cid:durableId="2078043842">
-    <w:abstractNumId w:val="20"/>
-  </w:num>
-  <w:num w:numId="17" w16cid:durableId="822041288">
-    <w:abstractNumId w:val="21"/>
-  </w:num>
-  <w:num w:numId="18" w16cid:durableId="1990745772">
-    <w:abstractNumId w:val="11"/>
-  </w:num>
-  <w:num w:numId="19" w16cid:durableId="1348405061">
-    <w:abstractNumId w:val="3"/>
-  </w:num>
-  <w:num w:numId="20" w16cid:durableId="756633860">
-    <w:abstractNumId w:val="14"/>
-  </w:num>
-  <w:num w:numId="21" w16cid:durableId="138809987">
-    <w:abstractNumId w:val="1"/>
-  </w:num>
-  <w:num w:numId="22" w16cid:durableId="484662782">
-    <w:abstractNumId w:val="19"/>
+  <w:num w:numId="24" w16cid:durableId="1188521179">
+    <w:abstractNumId w:val="0"/>
   </w:num>
 </w:numbering>
 </file>
@@ -7822,7 +8555,7 @@
   <w:style w:type="paragraph" w:default="1" w:styleId="Normal">
     <w:name w:val="Normal"/>
     <w:qFormat/>
-    <w:rsid w:val="00702871"/>
+    <w:rsid w:val="00FE6CC9"/>
   </w:style>
   <w:style w:type="paragraph" w:styleId="Heading1">
     <w:name w:val="heading 1"/>

</xml_diff>

<commit_message>
Add enterprise standard FastAPI application and update requirements
</commit_message>
<xml_diff>
--- a/documentation/Gen AI and Agentic AI.docx
+++ b/documentation/Gen AI and Agentic AI.docx
@@ -56,7 +56,6 @@
         </w:rPr>
       </w:pPr>
       <w:hyperlink r:id="rId6" w:history="1">
-        <w:proofErr w:type="spellStart"/>
         <w:r>
           <w:rPr>
             <w:rStyle w:val="Hyperlink"/>
@@ -65,7 +64,6 @@
           </w:rPr>
           <w:t>Ollama</w:t>
         </w:r>
-        <w:proofErr w:type="spellEnd"/>
       </w:hyperlink>
       <w:r>
         <w:rPr>
@@ -174,21 +172,7 @@
           <w:rPr>
             <w:rStyle w:val="Hyperlink"/>
           </w:rPr>
-          <w:t xml:space="preserve">ChatGPT - </w:t>
-        </w:r>
-        <w:proofErr w:type="spellStart"/>
-        <w:r>
-          <w:rPr>
-            <w:rStyle w:val="Hyperlink"/>
-          </w:rPr>
-          <w:t>NutriPro</w:t>
-        </w:r>
-        <w:proofErr w:type="spellEnd"/>
-        <w:r>
-          <w:rPr>
-            <w:rStyle w:val="Hyperlink"/>
-          </w:rPr>
-          <w:t xml:space="preserve"> -Ghar Ka Khana</w:t>
+          <w:t>ChatGPT - NutriPro -Ghar Ka Khana</w:t>
         </w:r>
       </w:hyperlink>
     </w:p>
@@ -1362,7 +1346,6 @@
         </w:rPr>
       </w:pPr>
       <w:hyperlink r:id="rId17" w:history="1">
-        <w:proofErr w:type="spellStart"/>
         <w:r>
           <w:rPr>
             <w:rStyle w:val="Hyperlink"/>
@@ -1371,7 +1354,6 @@
           </w:rPr>
           <w:t>Ollama</w:t>
         </w:r>
-        <w:proofErr w:type="spellEnd"/>
       </w:hyperlink>
     </w:p>
     <w:p>
@@ -1393,7 +1375,6 @@
       </w:hyperlink>
     </w:p>
     <w:p>
-      <w:proofErr w:type="spellStart"/>
       <w:r>
         <w:rPr>
           <w:b/>
@@ -1401,7 +1382,6 @@
         </w:rPr>
         <w:t>Ollama</w:t>
       </w:r>
-      <w:proofErr w:type="spellEnd"/>
       <w:r>
         <w:t xml:space="preserve"> is a tool that lets you </w:t>
       </w:r>
@@ -1423,7 +1403,6 @@
           <w:bCs/>
         </w:rPr>
       </w:pPr>
-      <w:proofErr w:type="spellStart"/>
       <w:r>
         <w:rPr>
           <w:b/>
@@ -1431,7 +1410,6 @@
         </w:rPr>
         <w:t>Ollama</w:t>
       </w:r>
-      <w:proofErr w:type="spellEnd"/>
       <w:r>
         <w:rPr>
           <w:b/>
@@ -1468,46 +1446,30 @@
       </w:r>
     </w:p>
     <w:p>
-      <w:proofErr w:type="spellStart"/>
+      <w:r>
+        <w:t>ollama run “model name”</w:t>
+      </w:r>
+    </w:p>
+    <w:p>
       <w:r>
         <w:t>ollama</w:t>
       </w:r>
-      <w:proofErr w:type="spellEnd"/>
-      <w:r>
-        <w:t xml:space="preserve"> run “model name”</w:t>
-      </w:r>
-    </w:p>
-    <w:p>
-      <w:proofErr w:type="spellStart"/>
+      <w:r>
+        <w:t xml:space="preserve"> ls</w:t>
+      </w:r>
+    </w:p>
+    <w:p>
       <w:r>
         <w:t>ollama</w:t>
       </w:r>
-      <w:proofErr w:type="spellEnd"/>
-      <w:r>
-        <w:t xml:space="preserve"> ls</w:t>
-      </w:r>
-    </w:p>
-    <w:p>
-      <w:proofErr w:type="spellStart"/>
+      <w:r>
+        <w:t xml:space="preserve"> ps</w:t>
+      </w:r>
+    </w:p>
+    <w:p>
       <w:r>
         <w:t>ollama</w:t>
       </w:r>
-      <w:proofErr w:type="spellEnd"/>
-      <w:r>
-        <w:t xml:space="preserve"> </w:t>
-      </w:r>
-      <w:proofErr w:type="spellStart"/>
-      <w:r>
-        <w:t>ps</w:t>
-      </w:r>
-      <w:proofErr w:type="spellEnd"/>
-    </w:p>
-    <w:p>
-      <w:proofErr w:type="spellStart"/>
-      <w:r>
-        <w:t>ollama</w:t>
-      </w:r>
-      <w:proofErr w:type="spellEnd"/>
       <w:r>
         <w:t xml:space="preserve"> help</w:t>
       </w:r>
@@ -1538,15 +1500,7 @@
     </w:p>
     <w:p>
       <w:r>
-        <w:t xml:space="preserve">Your App → </w:t>
-      </w:r>
-      <w:proofErr w:type="spellStart"/>
-      <w:r>
-        <w:t>Ollama</w:t>
-      </w:r>
-      <w:proofErr w:type="spellEnd"/>
-      <w:r>
-        <w:t xml:space="preserve"> → Local Model → Response</w:t>
+        <w:t>Your App → Ollama → Local Model → Response</w:t>
       </w:r>
     </w:p>
     <w:p>
@@ -1576,17 +1530,8 @@
           <w:b/>
           <w:bCs/>
         </w:rPr>
-        <w:t xml:space="preserve"> Why people use </w:t>
-      </w:r>
-      <w:proofErr w:type="spellStart"/>
-      <w:r>
-        <w:rPr>
-          <w:b/>
-          <w:bCs/>
-        </w:rPr>
-        <w:t>Ollama</w:t>
-      </w:r>
-      <w:proofErr w:type="spellEnd"/>
+        <w:t xml:space="preserve"> Why people use Ollama</w:t>
+      </w:r>
     </w:p>
     <w:p>
       <w:pPr>
@@ -1768,13 +1713,8 @@
       </w:r>
     </w:p>
     <w:p>
-      <w:proofErr w:type="spellStart"/>
-      <w:r>
-        <w:t>ollama</w:t>
-      </w:r>
-      <w:proofErr w:type="spellEnd"/>
-      <w:r>
-        <w:t xml:space="preserve"> create “custom model name”</w:t>
+      <w:r>
+        <w:t>ollama create “custom model name”</w:t>
       </w:r>
     </w:p>
     <w:p>
@@ -1807,39 +1747,24 @@
       </w:r>
     </w:p>
     <w:p>
-      <w:proofErr w:type="spellStart"/>
-      <w:r>
-        <w:rPr>
-          <w:b/>
-          <w:bCs/>
-        </w:rPr>
-        <w:t>cmd</w:t>
-      </w:r>
-      <w:proofErr w:type="spellEnd"/>
-      <w:r>
-        <w:rPr>
-          <w:b/>
-          <w:bCs/>
-        </w:rPr>
-        <w:t>:</w:t>
+      <w:r>
+        <w:rPr>
+          <w:b/>
+          <w:bCs/>
+        </w:rPr>
+        <w:t>cmd:</w:t>
       </w:r>
       <w:r>
         <w:t xml:space="preserve"> </w:t>
       </w:r>
     </w:p>
     <w:p>
-      <w:proofErr w:type="spellStart"/>
       <w:r>
         <w:t>o</w:t>
       </w:r>
       <w:r>
-        <w:t>llama</w:t>
-      </w:r>
-      <w:proofErr w:type="spellEnd"/>
-      <w:r>
-        <w:t xml:space="preserve"> create </w:t>
-      </w:r>
-      <w:proofErr w:type="spellStart"/>
+        <w:t xml:space="preserve">llama create </w:t>
+      </w:r>
       <w:r>
         <w:rPr>
           <w:b/>
@@ -1847,17 +1772,8 @@
         </w:rPr>
         <w:t>KalamCoach</w:t>
       </w:r>
-      <w:proofErr w:type="spellEnd"/>
-      <w:r>
-        <w:t xml:space="preserve"> -f “c:\users\</w:t>
-      </w:r>
-      <w:proofErr w:type="spellStart"/>
-      <w:r>
-        <w:t>hema</w:t>
-      </w:r>
-      <w:proofErr w:type="spellEnd"/>
-      <w:r>
-        <w:t>\downloads\</w:t>
+      <w:r>
+        <w:t xml:space="preserve"> -f “c:\users\hema\downloads\</w:t>
       </w:r>
       <w:r>
         <w:t xml:space="preserve"> </w:t>
@@ -2321,21 +2237,8 @@
     </w:p>
     <w:p>
       <w:r>
-        <w:t xml:space="preserve">python -m </w:t>
-      </w:r>
-      <w:proofErr w:type="spellStart"/>
-      <w:r>
-        <w:t>venv</w:t>
-      </w:r>
-      <w:proofErr w:type="spellEnd"/>
-      <w:r>
-        <w:t xml:space="preserve"> </w:t>
-      </w:r>
-      <w:proofErr w:type="spellStart"/>
-      <w:r>
-        <w:t>venv</w:t>
-      </w:r>
-      <w:proofErr w:type="spellEnd"/>
+        <w:t>python -m venv venv</w:t>
+      </w:r>
     </w:p>
     <w:p>
       <w:pPr>
@@ -2353,13 +2256,8 @@
       </w:r>
     </w:p>
     <w:p>
-      <w:proofErr w:type="spellStart"/>
-      <w:r>
-        <w:t>venv</w:t>
-      </w:r>
-      <w:proofErr w:type="spellEnd"/>
-      <w:r>
-        <w:t>\Scripts\activate</w:t>
+      <w:r>
+        <w:t>venv\Scripts\activate</w:t>
       </w:r>
     </w:p>
     <w:p>
@@ -2705,11 +2603,9 @@
       <w:r>
         <w:t xml:space="preserve"> </w:t>
       </w:r>
-      <w:proofErr w:type="spellStart"/>
       <w:r>
         <w:t>db</w:t>
       </w:r>
-      <w:proofErr w:type="spellEnd"/>
     </w:p>
     <w:p>
       <w:pPr>
@@ -2897,13 +2793,8 @@
         <w:t xml:space="preserve"> </w:t>
       </w:r>
       <w:r>
-        <w:t xml:space="preserve">.pdf, .txt, .md, .doc and </w:t>
-      </w:r>
-      <w:proofErr w:type="spellStart"/>
-      <w:r>
-        <w:t>etc</w:t>
-      </w:r>
-      <w:proofErr w:type="spellEnd"/>
+        <w:t>.pdf, .txt, .md, .doc and etc</w:t>
+      </w:r>
     </w:p>
     <w:p>
       <w:pPr>
@@ -2985,22 +2876,13 @@
           <w:bCs/>
         </w:rPr>
       </w:pPr>
-      <w:proofErr w:type="spellStart"/>
       <w:r>
         <w:rPr>
           <w:b/>
           <w:bCs/>
         </w:rPr>
         <w:lastRenderedPageBreak/>
-        <w:t>Vercel</w:t>
-      </w:r>
-      <w:proofErr w:type="spellEnd"/>
-      <w:r>
-        <w:rPr>
-          <w:b/>
-          <w:bCs/>
-        </w:rPr>
-        <w:t xml:space="preserve"> (React UI)</w:t>
+        <w:t>Vercel (React UI)</w:t>
       </w:r>
     </w:p>
     <w:p>
@@ -3030,23 +2912,7 @@
           <w:b/>
           <w:bCs/>
         </w:rPr>
-        <w:t>Render (</w:t>
-      </w:r>
-      <w:proofErr w:type="spellStart"/>
-      <w:r>
-        <w:rPr>
-          <w:b/>
-          <w:bCs/>
-        </w:rPr>
-        <w:t>FastAPI</w:t>
-      </w:r>
-      <w:proofErr w:type="spellEnd"/>
-      <w:r>
-        <w:rPr>
-          <w:b/>
-          <w:bCs/>
-        </w:rPr>
-        <w:t xml:space="preserve"> MCP + RAG)</w:t>
+        <w:t>Render (FastAPI MCP + RAG)</w:t>
       </w:r>
     </w:p>
     <w:p>
@@ -3071,21 +2937,12 @@
           <w:bCs/>
         </w:rPr>
       </w:pPr>
-      <w:proofErr w:type="spellStart"/>
-      <w:r>
-        <w:rPr>
-          <w:b/>
-          <w:bCs/>
-        </w:rPr>
-        <w:t>Supabase</w:t>
-      </w:r>
-      <w:proofErr w:type="spellEnd"/>
-      <w:r>
-        <w:rPr>
-          <w:b/>
-          <w:bCs/>
-        </w:rPr>
-        <w:t xml:space="preserve"> (DB + Auth + Vector)</w:t>
+      <w:r>
+        <w:rPr>
+          <w:b/>
+          <w:bCs/>
+        </w:rPr>
+        <w:t>Supabase (DB + Auth + Vector)</w:t>
       </w:r>
     </w:p>
     <w:p>
@@ -3321,13 +3178,8 @@
       </w:r>
     </w:p>
     <w:p>
-      <w:proofErr w:type="spellStart"/>
-      <w:r>
-        <w:t>Langchain</w:t>
-      </w:r>
-      <w:proofErr w:type="spellEnd"/>
-      <w:r>
-        <w:t xml:space="preserve"> – chain of </w:t>
+      <w:r>
+        <w:t xml:space="preserve">Langchain – chain of </w:t>
       </w:r>
       <w:r>
         <w:t>thoughts: A -&gt; B-&gt; C</w:t>
@@ -3346,37 +3198,30 @@
       </w:r>
     </w:p>
     <w:p>
-      <w:proofErr w:type="spellStart"/>
-      <w:r>
-        <w:t>langgraph</w:t>
-      </w:r>
-      <w:proofErr w:type="spellEnd"/>
+      <w:r>
+        <w:t xml:space="preserve">langgraph </w:t>
+      </w:r>
+      <w:r>
+        <w:t xml:space="preserve">– </w:t>
+      </w:r>
+      <w:r>
+        <w:t>multi-step, looping, and agent-style workflows</w:t>
+      </w:r>
+    </w:p>
+    <w:p>
+      <w:pPr>
+        <w:rPr>
+          <w:b/>
+          <w:bCs/>
+        </w:rPr>
+      </w:pPr>
+      <w:r>
+        <w:t>langsmith</w:t>
+      </w:r>
       <w:r>
         <w:t xml:space="preserve"> </w:t>
       </w:r>
       <w:r>
-        <w:t xml:space="preserve">– </w:t>
-      </w:r>
-      <w:r>
-        <w:t>multi-step, looping, and agent-style workflows</w:t>
-      </w:r>
-    </w:p>
-    <w:p>
-      <w:pPr>
-        <w:rPr>
-          <w:b/>
-          <w:bCs/>
-        </w:rPr>
-      </w:pPr>
-      <w:proofErr w:type="spellStart"/>
-      <w:r>
-        <w:t>langsmith</w:t>
-      </w:r>
-      <w:proofErr w:type="spellEnd"/>
-      <w:r>
-        <w:t xml:space="preserve"> </w:t>
-      </w:r>
-      <w:r>
         <w:t>- building</w:t>
       </w:r>
       <w:r>
@@ -3412,23 +3257,7 @@
           <w:bCs/>
         </w:rPr>
         <w:lastRenderedPageBreak/>
-        <w:t xml:space="preserve">Additional </w:t>
-      </w:r>
-      <w:proofErr w:type="gramStart"/>
-      <w:r>
-        <w:rPr>
-          <w:b/>
-          <w:bCs/>
-        </w:rPr>
-        <w:t>Session :</w:t>
-      </w:r>
-      <w:proofErr w:type="gramEnd"/>
-      <w:r>
-        <w:rPr>
-          <w:b/>
-          <w:bCs/>
-        </w:rPr>
-        <w:t xml:space="preserve"> </w:t>
+        <w:t xml:space="preserve">Additional Session : </w:t>
       </w:r>
       <w:r>
         <w:rPr>
@@ -4466,13 +4295,8 @@
           <w:numId w:val="6"/>
         </w:numPr>
       </w:pPr>
-      <w:proofErr w:type="spellStart"/>
-      <w:r>
-        <w:t>openai</w:t>
-      </w:r>
-      <w:proofErr w:type="spellEnd"/>
-      <w:r>
-        <w:t>-whisper</w:t>
+      <w:r>
+        <w:t>openai-whisper</w:t>
       </w:r>
     </w:p>
     <w:p>
@@ -4504,14 +4328,12 @@
           <w:numId w:val="20"/>
         </w:numPr>
       </w:pPr>
-      <w:proofErr w:type="spellStart"/>
       <w:r>
         <w:t>P</w:t>
       </w:r>
       <w:r>
         <w:t>ytesseract</w:t>
       </w:r>
-      <w:proofErr w:type="spellEnd"/>
     </w:p>
     <w:p>
       <w:pPr>
@@ -4521,13 +4343,8 @@
           <w:numId w:val="20"/>
         </w:numPr>
       </w:pPr>
-      <w:proofErr w:type="spellStart"/>
-      <w:r>
-        <w:t>dall·e</w:t>
-      </w:r>
-      <w:proofErr w:type="spellEnd"/>
-      <w:r>
-        <w:t xml:space="preserve"> </w:t>
+      <w:r>
+        <w:t xml:space="preserve">dall·e </w:t>
       </w:r>
       <w:r>
         <w:t xml:space="preserve">- </w:t>
@@ -4562,15 +4379,7 @@
         <w:tab/>
       </w:r>
       <w:r>
-        <w:t xml:space="preserve">1.Download the files </w:t>
-      </w:r>
-      <w:proofErr w:type="gramStart"/>
-      <w:r>
-        <w:t>from :ffmpeg</w:t>
-      </w:r>
-      <w:proofErr w:type="gramEnd"/>
-      <w:r>
-        <w:t>-git-full.7z</w:t>
+        <w:t>1.Download the files from :ffmpeg-git-full.7z</w:t>
       </w:r>
     </w:p>
     <w:p>
@@ -4594,13 +4403,8 @@
         <w:ind w:left="720"/>
       </w:pPr>
       <w:r>
-        <w:t>3.Extract and place under C/</w:t>
-      </w:r>
-      <w:proofErr w:type="spellStart"/>
-      <w:r>
-        <w:t>ffmpeg</w:t>
-      </w:r>
-      <w:proofErr w:type="spellEnd"/>
+        <w:t>3.Extract and place under C/ffmpeg</w:t>
+      </w:r>
     </w:p>
     <w:p>
       <w:pPr>
@@ -4613,15 +4417,7 @@
         <w:t xml:space="preserve"> (</w:t>
       </w:r>
       <w:r>
-        <w:t>C:\</w:t>
-      </w:r>
-      <w:proofErr w:type="spellStart"/>
-      <w:r>
-        <w:t>ffmpeg</w:t>
-      </w:r>
-      <w:proofErr w:type="spellEnd"/>
-      <w:r>
-        <w:t>\bin</w:t>
+        <w:t>C:\ffmpeg\bin</w:t>
       </w:r>
       <w:r>
         <w:t>)</w:t>
@@ -4651,33 +4447,7 @@
         <w:ind w:left="720"/>
       </w:pPr>
       <w:r>
-        <w:t>"</w:t>
-      </w:r>
-      <w:proofErr w:type="spellStart"/>
-      <w:proofErr w:type="gramStart"/>
-      <w:r>
-        <w:t>py</w:t>
-      </w:r>
-      <w:proofErr w:type="spellEnd"/>
-      <w:proofErr w:type="gramEnd"/>
-      <w:r>
-        <w:t xml:space="preserve"> -m </w:t>
-      </w:r>
-      <w:proofErr w:type="spellStart"/>
-      <w:r>
-        <w:t>streamlit</w:t>
-      </w:r>
-      <w:proofErr w:type="spellEnd"/>
-      <w:r>
-        <w:t xml:space="preserve"> </w:t>
-      </w:r>
-      <w:proofErr w:type="gramStart"/>
-      <w:r>
-        <w:t>run .</w:t>
-      </w:r>
-      <w:proofErr w:type="gramEnd"/>
-      <w:r>
-        <w:t>\Multimodal.py"</w:t>
+        <w:t>"py -m streamlit run .\Multimodal.py"</w:t>
       </w:r>
     </w:p>
     <w:p/>
@@ -4961,15 +4731,7 @@
     </w:p>
     <w:p>
       <w:r>
-        <w:t>&gt;</w:t>
-      </w:r>
-      <w:proofErr w:type="spellStart"/>
-      <w:r>
-        <w:t>npm</w:t>
-      </w:r>
-      <w:proofErr w:type="spellEnd"/>
-      <w:r>
-        <w:t xml:space="preserve"> install n8n -g</w:t>
+        <w:t>&gt;npm install n8n -g</w:t>
       </w:r>
     </w:p>
     <w:p>
@@ -5491,7 +5253,13 @@
         <w:t xml:space="preserve">Job </w:t>
       </w:r>
       <w:r>
-        <w:t>Search:</w:t>
+        <w:t>Search</w:t>
+      </w:r>
+      <w:r>
+        <w:t xml:space="preserve"> for automation</w:t>
+      </w:r>
+      <w:r>
+        <w:t>:</w:t>
       </w:r>
     </w:p>
     <w:p>
@@ -5514,14 +5282,168 @@
         </w:r>
       </w:hyperlink>
     </w:p>
-    <w:p>
-      <w:pPr>
-        <w:rPr>
-          <w:b/>
-          <w:bCs/>
-        </w:rPr>
-      </w:pPr>
-    </w:p>
+    <w:p/>
+    <w:p>
+      <w:r>
+        <w:t xml:space="preserve">Authorization -&gt; Validation -&gt; Moderation -&gt; AI -&gt; Logs -&gt; analytics -&gt; response </w:t>
+      </w:r>
+    </w:p>
+    <w:p>
+      <w:pPr>
+        <w:rPr>
+          <w:b/>
+          <w:bCs/>
+        </w:rPr>
+      </w:pPr>
+      <w:r>
+        <w:rPr>
+          <w:b/>
+          <w:bCs/>
+        </w:rPr>
+        <w:t>Day2</w:t>
+      </w:r>
+      <w:r>
+        <w:rPr>
+          <w:b/>
+          <w:bCs/>
+        </w:rPr>
+        <w:t>9</w:t>
+      </w:r>
+      <w:r>
+        <w:rPr>
+          <w:b/>
+          <w:bCs/>
+        </w:rPr>
+        <w:t>:</w:t>
+      </w:r>
+    </w:p>
+    <w:p>
+      <w:pPr>
+        <w:pStyle w:val="ListParagraph"/>
+        <w:numPr>
+          <w:ilvl w:val="1"/>
+          <w:numId w:val="23"/>
+        </w:numPr>
+      </w:pPr>
+      <w:r>
+        <w:t>Security (PII data)</w:t>
+      </w:r>
+    </w:p>
+    <w:p>
+      <w:pPr>
+        <w:pStyle w:val="ListParagraph"/>
+        <w:numPr>
+          <w:ilvl w:val="1"/>
+          <w:numId w:val="23"/>
+        </w:numPr>
+      </w:pPr>
+      <w:r>
+        <w:t>Pr</w:t>
+      </w:r>
+      <w:r>
+        <w:t>o</w:t>
+      </w:r>
+      <w:r>
+        <w:t>m</w:t>
+      </w:r>
+      <w:r>
+        <w:t>pt</w:t>
+      </w:r>
+      <w:r>
+        <w:t xml:space="preserve"> Injection Risk</w:t>
+      </w:r>
+    </w:p>
+    <w:p>
+      <w:r>
+        <w:rPr>
+          <w:b/>
+          <w:bCs/>
+        </w:rPr>
+        <w:t>Solution</w:t>
+      </w:r>
+      <w:r>
+        <w:t>:</w:t>
+      </w:r>
+      <w:r>
+        <w:t xml:space="preserve"> </w:t>
+      </w:r>
+      <w:r>
+        <w:t>before sending PII data to LLM we should mask</w:t>
+      </w:r>
+      <w:r>
+        <w:t xml:space="preserve"> and needs to be identified patterns (account number, SSN, credit card number </w:t>
+      </w:r>
+      <w:r>
+        <w:t>etc)</w:t>
+      </w:r>
+    </w:p>
+    <w:p>
+      <w:pPr>
+        <w:rPr>
+          <w:b/>
+          <w:bCs/>
+        </w:rPr>
+      </w:pPr>
+    </w:p>
+    <w:p>
+      <w:pPr>
+        <w:rPr>
+          <w:b/>
+          <w:bCs/>
+        </w:rPr>
+      </w:pPr>
+      <w:r>
+        <w:rPr>
+          <w:b/>
+          <w:bCs/>
+        </w:rPr>
+        <w:t>Day</w:t>
+      </w:r>
+      <w:r>
+        <w:rPr>
+          <w:b/>
+          <w:bCs/>
+        </w:rPr>
+        <w:t>30</w:t>
+      </w:r>
+      <w:r>
+        <w:rPr>
+          <w:b/>
+          <w:bCs/>
+        </w:rPr>
+        <w:t>:</w:t>
+      </w:r>
+      <w:r>
+        <w:rPr>
+          <w:b/>
+          <w:bCs/>
+        </w:rPr>
+        <w:t xml:space="preserve"> </w:t>
+      </w:r>
+      <w:r>
+        <w:rPr>
+          <w:b/>
+          <w:bCs/>
+        </w:rPr>
+        <w:t>(</w:t>
+      </w:r>
+      <w:r>
+        <w:rPr>
+          <w:b/>
+          <w:bCs/>
+        </w:rPr>
+        <w:t>Implement Enterprise System</w:t>
+      </w:r>
+      <w:r>
+        <w:rPr>
+          <w:b/>
+          <w:bCs/>
+        </w:rPr>
+        <w:t>)</w:t>
+      </w:r>
+    </w:p>
+    <w:p/>
+    <w:p/>
     <w:p/>
     <w:p>
       <w:pPr>
@@ -6107,7 +6029,7 @@
   <w:abstractNum w:abstractNumId="5" w15:restartNumberingAfterBreak="0">
     <w:nsid w:val="18A060DB"/>
     <w:multiLevelType w:val="multilevel"/>
-    <w:tmpl w:val="0B5889FA"/>
+    <w:tmpl w:val="06400382"/>
     <w:lvl w:ilvl="0">
       <w:start w:val="1"/>
       <w:numFmt w:val="bullet"/>
@@ -6124,20 +6046,16 @@
         <w:sz w:val="20"/>
       </w:rPr>
     </w:lvl>
-    <w:lvl w:ilvl="1" w:tentative="1">
-      <w:start w:val="1"/>
-      <w:numFmt w:val="bullet"/>
-      <w:lvlText w:val="o"/>
-      <w:lvlJc w:val="left"/>
-      <w:pPr>
-        <w:tabs>
-          <w:tab w:val="num" w:pos="1440"/>
-        </w:tabs>
+    <w:lvl w:ilvl="1">
+      <w:start w:val="1"/>
+      <w:numFmt w:val="decimal"/>
+      <w:lvlText w:val="%2."/>
+      <w:lvlJc w:val="left"/>
+      <w:pPr>
         <w:ind w:left="1440" w:hanging="360"/>
       </w:pPr>
       <w:rPr>
-        <w:rFonts w:ascii="Courier New" w:hAnsi="Courier New" w:hint="default"/>
-        <w:sz w:val="20"/>
+        <w:rFonts w:hint="default"/>
       </w:rPr>
     </w:lvl>
     <w:lvl w:ilvl="2" w:tentative="1">

</xml_diff>

<commit_message>
Enhance documentation with Agentic AI frameworks and RAG variants; remove temporary file
</commit_message>
<xml_diff>
--- a/documentation/Gen AI and Agentic AI.docx
+++ b/documentation/Gen AI and Agentic AI.docx
@@ -56,6 +56,7 @@
         </w:rPr>
       </w:pPr>
       <w:hyperlink r:id="rId6" w:history="1">
+        <w:proofErr w:type="spellStart"/>
         <w:r>
           <w:rPr>
             <w:rStyle w:val="Hyperlink"/>
@@ -64,6 +65,7 @@
           </w:rPr>
           <w:t>Ollama</w:t>
         </w:r>
+        <w:proofErr w:type="spellEnd"/>
       </w:hyperlink>
       <w:r>
         <w:rPr>
@@ -172,7 +174,21 @@
           <w:rPr>
             <w:rStyle w:val="Hyperlink"/>
           </w:rPr>
-          <w:t>ChatGPT - NutriPro -Ghar Ka Khana</w:t>
+          <w:t xml:space="preserve">ChatGPT - </w:t>
+        </w:r>
+        <w:proofErr w:type="spellStart"/>
+        <w:r>
+          <w:rPr>
+            <w:rStyle w:val="Hyperlink"/>
+          </w:rPr>
+          <w:t>NutriPro</w:t>
+        </w:r>
+        <w:proofErr w:type="spellEnd"/>
+        <w:r>
+          <w:rPr>
+            <w:rStyle w:val="Hyperlink"/>
+          </w:rPr>
+          <w:t xml:space="preserve"> -Ghar Ka Khana</w:t>
         </w:r>
       </w:hyperlink>
     </w:p>
@@ -1346,6 +1362,7 @@
         </w:rPr>
       </w:pPr>
       <w:hyperlink r:id="rId17" w:history="1">
+        <w:proofErr w:type="spellStart"/>
         <w:r>
           <w:rPr>
             <w:rStyle w:val="Hyperlink"/>
@@ -1354,6 +1371,7 @@
           </w:rPr>
           <w:t>Ollama</w:t>
         </w:r>
+        <w:proofErr w:type="spellEnd"/>
       </w:hyperlink>
     </w:p>
     <w:p>
@@ -1375,6 +1393,7 @@
       </w:hyperlink>
     </w:p>
     <w:p>
+      <w:proofErr w:type="spellStart"/>
       <w:r>
         <w:rPr>
           <w:b/>
@@ -1382,6 +1401,7 @@
         </w:rPr>
         <w:t>Ollama</w:t>
       </w:r>
+      <w:proofErr w:type="spellEnd"/>
       <w:r>
         <w:t xml:space="preserve"> is a tool that lets you </w:t>
       </w:r>
@@ -1403,6 +1423,7 @@
           <w:bCs/>
         </w:rPr>
       </w:pPr>
+      <w:proofErr w:type="spellStart"/>
       <w:r>
         <w:rPr>
           <w:b/>
@@ -1410,6 +1431,7 @@
         </w:rPr>
         <w:t>Ollama</w:t>
       </w:r>
+      <w:proofErr w:type="spellEnd"/>
       <w:r>
         <w:rPr>
           <w:b/>
@@ -1446,30 +1468,46 @@
       </w:r>
     </w:p>
     <w:p>
-      <w:r>
-        <w:t>ollama run “model name”</w:t>
-      </w:r>
-    </w:p>
-    <w:p>
+      <w:proofErr w:type="spellStart"/>
       <w:r>
         <w:t>ollama</w:t>
       </w:r>
+      <w:proofErr w:type="spellEnd"/>
+      <w:r>
+        <w:t xml:space="preserve"> run “model name”</w:t>
+      </w:r>
+    </w:p>
+    <w:p>
+      <w:proofErr w:type="spellStart"/>
+      <w:r>
+        <w:t>ollama</w:t>
+      </w:r>
+      <w:proofErr w:type="spellEnd"/>
       <w:r>
         <w:t xml:space="preserve"> ls</w:t>
       </w:r>
     </w:p>
     <w:p>
+      <w:proofErr w:type="spellStart"/>
       <w:r>
         <w:t>ollama</w:t>
       </w:r>
-      <w:r>
-        <w:t xml:space="preserve"> ps</w:t>
-      </w:r>
-    </w:p>
-    <w:p>
+      <w:proofErr w:type="spellEnd"/>
+      <w:r>
+        <w:t xml:space="preserve"> </w:t>
+      </w:r>
+      <w:proofErr w:type="spellStart"/>
+      <w:r>
+        <w:t>ps</w:t>
+      </w:r>
+      <w:proofErr w:type="spellEnd"/>
+    </w:p>
+    <w:p>
+      <w:proofErr w:type="spellStart"/>
       <w:r>
         <w:t>ollama</w:t>
       </w:r>
+      <w:proofErr w:type="spellEnd"/>
       <w:r>
         <w:t xml:space="preserve"> help</w:t>
       </w:r>
@@ -1500,7 +1538,15 @@
     </w:p>
     <w:p>
       <w:r>
-        <w:t>Your App → Ollama → Local Model → Response</w:t>
+        <w:t xml:space="preserve">Your App → </w:t>
+      </w:r>
+      <w:proofErr w:type="spellStart"/>
+      <w:r>
+        <w:t>Ollama</w:t>
+      </w:r>
+      <w:proofErr w:type="spellEnd"/>
+      <w:r>
+        <w:t xml:space="preserve"> → Local Model → Response</w:t>
       </w:r>
     </w:p>
     <w:p>
@@ -1530,8 +1576,17 @@
           <w:b/>
           <w:bCs/>
         </w:rPr>
-        <w:t xml:space="preserve"> Why people use Ollama</w:t>
-      </w:r>
+        <w:t xml:space="preserve"> Why people use </w:t>
+      </w:r>
+      <w:proofErr w:type="spellStart"/>
+      <w:r>
+        <w:rPr>
+          <w:b/>
+          <w:bCs/>
+        </w:rPr>
+        <w:t>Ollama</w:t>
+      </w:r>
+      <w:proofErr w:type="spellEnd"/>
     </w:p>
     <w:p>
       <w:pPr>
@@ -1713,8 +1768,13 @@
       </w:r>
     </w:p>
     <w:p>
-      <w:r>
-        <w:t>ollama create “custom model name”</w:t>
+      <w:proofErr w:type="spellStart"/>
+      <w:r>
+        <w:t>ollama</w:t>
+      </w:r>
+      <w:proofErr w:type="spellEnd"/>
+      <w:r>
+        <w:t xml:space="preserve"> create “custom model name”</w:t>
       </w:r>
     </w:p>
     <w:p>
@@ -1747,24 +1807,39 @@
       </w:r>
     </w:p>
     <w:p>
-      <w:r>
-        <w:rPr>
-          <w:b/>
-          <w:bCs/>
-        </w:rPr>
-        <w:t>cmd:</w:t>
+      <w:proofErr w:type="spellStart"/>
+      <w:r>
+        <w:rPr>
+          <w:b/>
+          <w:bCs/>
+        </w:rPr>
+        <w:t>cmd</w:t>
+      </w:r>
+      <w:proofErr w:type="spellEnd"/>
+      <w:r>
+        <w:rPr>
+          <w:b/>
+          <w:bCs/>
+        </w:rPr>
+        <w:t>:</w:t>
       </w:r>
       <w:r>
         <w:t xml:space="preserve"> </w:t>
       </w:r>
     </w:p>
     <w:p>
+      <w:proofErr w:type="spellStart"/>
       <w:r>
         <w:t>o</w:t>
       </w:r>
       <w:r>
-        <w:t xml:space="preserve">llama create </w:t>
-      </w:r>
+        <w:t>llama</w:t>
+      </w:r>
+      <w:proofErr w:type="spellEnd"/>
+      <w:r>
+        <w:t xml:space="preserve"> create </w:t>
+      </w:r>
+      <w:proofErr w:type="spellStart"/>
       <w:r>
         <w:rPr>
           <w:b/>
@@ -1772,8 +1847,17 @@
         </w:rPr>
         <w:t>KalamCoach</w:t>
       </w:r>
-      <w:r>
-        <w:t xml:space="preserve"> -f “c:\users\hema\downloads\</w:t>
+      <w:proofErr w:type="spellEnd"/>
+      <w:r>
+        <w:t xml:space="preserve"> -f “c:\users\</w:t>
+      </w:r>
+      <w:proofErr w:type="spellStart"/>
+      <w:r>
+        <w:t>hema</w:t>
+      </w:r>
+      <w:proofErr w:type="spellEnd"/>
+      <w:r>
+        <w:t>\downloads\</w:t>
       </w:r>
       <w:r>
         <w:t xml:space="preserve"> </w:t>
@@ -2237,8 +2321,21 @@
     </w:p>
     <w:p>
       <w:r>
-        <w:t>python -m venv venv</w:t>
-      </w:r>
+        <w:t xml:space="preserve">python -m </w:t>
+      </w:r>
+      <w:proofErr w:type="spellStart"/>
+      <w:r>
+        <w:t>venv</w:t>
+      </w:r>
+      <w:proofErr w:type="spellEnd"/>
+      <w:r>
+        <w:t xml:space="preserve"> </w:t>
+      </w:r>
+      <w:proofErr w:type="spellStart"/>
+      <w:r>
+        <w:t>venv</w:t>
+      </w:r>
+      <w:proofErr w:type="spellEnd"/>
     </w:p>
     <w:p>
       <w:pPr>
@@ -2256,8 +2353,13 @@
       </w:r>
     </w:p>
     <w:p>
-      <w:r>
-        <w:t>venv\Scripts\activate</w:t>
+      <w:proofErr w:type="spellStart"/>
+      <w:r>
+        <w:t>venv</w:t>
+      </w:r>
+      <w:proofErr w:type="spellEnd"/>
+      <w:r>
+        <w:t>\Scripts\activate</w:t>
       </w:r>
     </w:p>
     <w:p>
@@ -2603,9 +2705,11 @@
       <w:r>
         <w:t xml:space="preserve"> </w:t>
       </w:r>
+      <w:proofErr w:type="spellStart"/>
       <w:r>
         <w:t>db</w:t>
       </w:r>
+      <w:proofErr w:type="spellEnd"/>
     </w:p>
     <w:p>
       <w:pPr>
@@ -2621,6 +2725,105 @@
         </w:rPr>
         <w:t xml:space="preserve"> </w:t>
       </w:r>
+    </w:p>
+    <w:p>
+      <w:pPr>
+        <w:rPr>
+          <w:b/>
+          <w:bCs/>
+        </w:rPr>
+      </w:pPr>
+      <w:r>
+        <w:rPr>
+          <w:b/>
+          <w:bCs/>
+        </w:rPr>
+        <w:t>Variants</w:t>
+      </w:r>
+    </w:p>
+    <w:p>
+      <w:pPr>
+        <w:numPr>
+          <w:ilvl w:val="0"/>
+          <w:numId w:val="27"/>
+        </w:numPr>
+        <w:rPr>
+          <w:b/>
+          <w:bCs/>
+        </w:rPr>
+      </w:pPr>
+      <w:r>
+        <w:rPr>
+          <w:b/>
+          <w:bCs/>
+        </w:rPr>
+        <w:t xml:space="preserve">Simple RAG </w:t>
+      </w:r>
+    </w:p>
+    <w:p>
+      <w:pPr>
+        <w:numPr>
+          <w:ilvl w:val="0"/>
+          <w:numId w:val="27"/>
+        </w:numPr>
+        <w:rPr>
+          <w:b/>
+          <w:bCs/>
+        </w:rPr>
+      </w:pPr>
+      <w:r>
+        <w:rPr>
+          <w:b/>
+          <w:bCs/>
+        </w:rPr>
+        <w:t xml:space="preserve">Agentic RAG </w:t>
+      </w:r>
+    </w:p>
+    <w:p>
+      <w:pPr>
+        <w:numPr>
+          <w:ilvl w:val="0"/>
+          <w:numId w:val="27"/>
+        </w:numPr>
+        <w:rPr>
+          <w:b/>
+          <w:bCs/>
+        </w:rPr>
+      </w:pPr>
+      <w:r>
+        <w:rPr>
+          <w:b/>
+          <w:bCs/>
+        </w:rPr>
+        <w:t xml:space="preserve">Graph RAG </w:t>
+      </w:r>
+    </w:p>
+    <w:p>
+      <w:pPr>
+        <w:numPr>
+          <w:ilvl w:val="0"/>
+          <w:numId w:val="27"/>
+        </w:numPr>
+        <w:rPr>
+          <w:b/>
+          <w:bCs/>
+        </w:rPr>
+      </w:pPr>
+      <w:r>
+        <w:rPr>
+          <w:b/>
+          <w:bCs/>
+        </w:rPr>
+        <w:t>Corrective RAG</w:t>
+      </w:r>
+    </w:p>
+    <w:p>
+      <w:pPr>
+        <w:rPr>
+          <w:b/>
+          <w:bCs/>
+        </w:rPr>
+      </w:pPr>
     </w:p>
     <w:p>
       <w:pPr>
@@ -2793,8 +2996,13 @@
         <w:t xml:space="preserve"> </w:t>
       </w:r>
       <w:r>
-        <w:t>.pdf, .txt, .md, .doc and etc</w:t>
-      </w:r>
+        <w:t xml:space="preserve">.pdf, .txt, .md, .doc and </w:t>
+      </w:r>
+      <w:proofErr w:type="spellStart"/>
+      <w:r>
+        <w:t>etc</w:t>
+      </w:r>
+      <w:proofErr w:type="spellEnd"/>
     </w:p>
     <w:p>
       <w:pPr>
@@ -2876,13 +3084,21 @@
           <w:bCs/>
         </w:rPr>
       </w:pPr>
-      <w:r>
-        <w:rPr>
-          <w:b/>
-          <w:bCs/>
-        </w:rPr>
-        <w:lastRenderedPageBreak/>
-        <w:t>Vercel (React UI)</w:t>
+      <w:proofErr w:type="spellStart"/>
+      <w:r>
+        <w:rPr>
+          <w:b/>
+          <w:bCs/>
+        </w:rPr>
+        <w:t>Vercel</w:t>
+      </w:r>
+      <w:proofErr w:type="spellEnd"/>
+      <w:r>
+        <w:rPr>
+          <w:b/>
+          <w:bCs/>
+        </w:rPr>
+        <w:t xml:space="preserve"> (React UI)</w:t>
       </w:r>
     </w:p>
     <w:p>
@@ -2912,7 +3128,23 @@
           <w:b/>
           <w:bCs/>
         </w:rPr>
-        <w:t>Render (FastAPI MCP + RAG)</w:t>
+        <w:t>Render (</w:t>
+      </w:r>
+      <w:proofErr w:type="spellStart"/>
+      <w:r>
+        <w:rPr>
+          <w:b/>
+          <w:bCs/>
+        </w:rPr>
+        <w:t>FastAPI</w:t>
+      </w:r>
+      <w:proofErr w:type="spellEnd"/>
+      <w:r>
+        <w:rPr>
+          <w:b/>
+          <w:bCs/>
+        </w:rPr>
+        <w:t xml:space="preserve"> MCP + RAG)</w:t>
       </w:r>
     </w:p>
     <w:p>
@@ -2937,12 +3169,21 @@
           <w:bCs/>
         </w:rPr>
       </w:pPr>
-      <w:r>
-        <w:rPr>
-          <w:b/>
-          <w:bCs/>
-        </w:rPr>
-        <w:t>Supabase (DB + Auth + Vector)</w:t>
+      <w:proofErr w:type="spellStart"/>
+      <w:r>
+        <w:rPr>
+          <w:b/>
+          <w:bCs/>
+        </w:rPr>
+        <w:t>Supabase</w:t>
+      </w:r>
+      <w:proofErr w:type="spellEnd"/>
+      <w:r>
+        <w:rPr>
+          <w:b/>
+          <w:bCs/>
+        </w:rPr>
+        <w:t xml:space="preserve"> (DB + Auth + Vector)</w:t>
       </w:r>
     </w:p>
     <w:p>
@@ -3178,8 +3419,14 @@
       </w:r>
     </w:p>
     <w:p>
-      <w:r>
-        <w:t xml:space="preserve">Langchain – chain of </w:t>
+      <w:proofErr w:type="spellStart"/>
+      <w:r>
+        <w:lastRenderedPageBreak/>
+        <w:t>Langchain</w:t>
+      </w:r>
+      <w:proofErr w:type="spellEnd"/>
+      <w:r>
+        <w:t xml:space="preserve"> – chain of </w:t>
       </w:r>
       <w:r>
         <w:t>thoughts: A -&gt; B-&gt; C</w:t>
@@ -3198,8 +3445,13 @@
       </w:r>
     </w:p>
     <w:p>
-      <w:r>
-        <w:t xml:space="preserve">langgraph </w:t>
+      <w:proofErr w:type="spellStart"/>
+      <w:r>
+        <w:t>langgraph</w:t>
+      </w:r>
+      <w:proofErr w:type="spellEnd"/>
+      <w:r>
+        <w:t xml:space="preserve"> </w:t>
       </w:r>
       <w:r>
         <w:t xml:space="preserve">– </w:t>
@@ -3215,9 +3467,11 @@
           <w:bCs/>
         </w:rPr>
       </w:pPr>
+      <w:proofErr w:type="spellStart"/>
       <w:r>
         <w:t>langsmith</w:t>
       </w:r>
+      <w:proofErr w:type="spellEnd"/>
       <w:r>
         <w:t xml:space="preserve"> </w:t>
       </w:r>
@@ -3256,8 +3510,23 @@
           <w:b/>
           <w:bCs/>
         </w:rPr>
-        <w:lastRenderedPageBreak/>
-        <w:t xml:space="preserve">Additional Session : </w:t>
+        <w:t xml:space="preserve">Additional </w:t>
+      </w:r>
+      <w:proofErr w:type="gramStart"/>
+      <w:r>
+        <w:rPr>
+          <w:b/>
+          <w:bCs/>
+        </w:rPr>
+        <w:t>Session :</w:t>
+      </w:r>
+      <w:proofErr w:type="gramEnd"/>
+      <w:r>
+        <w:rPr>
+          <w:b/>
+          <w:bCs/>
+        </w:rPr>
+        <w:t xml:space="preserve"> </w:t>
       </w:r>
       <w:r>
         <w:rPr>
@@ -3614,6 +3883,7 @@
         </w:numPr>
       </w:pPr>
       <w:r>
+        <w:lastRenderedPageBreak/>
         <w:t xml:space="preserve">AI workflow orchestration </w:t>
       </w:r>
     </w:p>
@@ -3754,7 +4024,6 @@
         </w:rPr>
       </w:pPr>
       <w:r>
-        <w:lastRenderedPageBreak/>
         <w:br/>
       </w:r>
       <w:r>
@@ -4043,6 +4312,7 @@
           <w:b/>
           <w:bCs/>
         </w:rPr>
+        <w:lastRenderedPageBreak/>
         <w:t>Day</w:t>
       </w:r>
       <w:r>
@@ -4108,7 +4378,6 @@
           <w:b/>
           <w:bCs/>
         </w:rPr>
-        <w:lastRenderedPageBreak/>
         <w:t>Day</w:t>
       </w:r>
       <w:r>
@@ -4295,8 +4564,13 @@
           <w:numId w:val="6"/>
         </w:numPr>
       </w:pPr>
-      <w:r>
-        <w:t>openai-whisper</w:t>
+      <w:proofErr w:type="spellStart"/>
+      <w:r>
+        <w:t>openai</w:t>
+      </w:r>
+      <w:proofErr w:type="spellEnd"/>
+      <w:r>
+        <w:t>-whisper</w:t>
       </w:r>
     </w:p>
     <w:p>
@@ -4328,12 +4602,14 @@
           <w:numId w:val="20"/>
         </w:numPr>
       </w:pPr>
+      <w:proofErr w:type="spellStart"/>
       <w:r>
         <w:t>P</w:t>
       </w:r>
       <w:r>
         <w:t>ytesseract</w:t>
       </w:r>
+      <w:proofErr w:type="spellEnd"/>
     </w:p>
     <w:p>
       <w:pPr>
@@ -4343,8 +4619,13 @@
           <w:numId w:val="20"/>
         </w:numPr>
       </w:pPr>
-      <w:r>
-        <w:t xml:space="preserve">dall·e </w:t>
+      <w:proofErr w:type="spellStart"/>
+      <w:r>
+        <w:t>dall·e</w:t>
+      </w:r>
+      <w:proofErr w:type="spellEnd"/>
+      <w:r>
+        <w:t xml:space="preserve"> </w:t>
       </w:r>
       <w:r>
         <w:t xml:space="preserve">- </w:t>
@@ -4379,7 +4660,15 @@
         <w:tab/>
       </w:r>
       <w:r>
-        <w:t>1.Download the files from :ffmpeg-git-full.7z</w:t>
+        <w:t xml:space="preserve">1.Download the files </w:t>
+      </w:r>
+      <w:proofErr w:type="gramStart"/>
+      <w:r>
+        <w:t>from :ffmpeg</w:t>
+      </w:r>
+      <w:proofErr w:type="gramEnd"/>
+      <w:r>
+        <w:t>-git-full.7z</w:t>
       </w:r>
     </w:p>
     <w:p>
@@ -4403,8 +4692,13 @@
         <w:ind w:left="720"/>
       </w:pPr>
       <w:r>
-        <w:t>3.Extract and place under C/ffmpeg</w:t>
-      </w:r>
+        <w:t>3.Extract and place under C/</w:t>
+      </w:r>
+      <w:proofErr w:type="spellStart"/>
+      <w:r>
+        <w:t>ffmpeg</w:t>
+      </w:r>
+      <w:proofErr w:type="spellEnd"/>
     </w:p>
     <w:p>
       <w:pPr>
@@ -4417,7 +4711,15 @@
         <w:t xml:space="preserve"> (</w:t>
       </w:r>
       <w:r>
-        <w:t>C:\ffmpeg\bin</w:t>
+        <w:t>C:\</w:t>
+      </w:r>
+      <w:proofErr w:type="spellStart"/>
+      <w:r>
+        <w:t>ffmpeg</w:t>
+      </w:r>
+      <w:proofErr w:type="spellEnd"/>
+      <w:r>
+        <w:t>\bin</w:t>
       </w:r>
       <w:r>
         <w:t>)</w:t>
@@ -4447,7 +4749,33 @@
         <w:ind w:left="720"/>
       </w:pPr>
       <w:r>
-        <w:t>"py -m streamlit run .\Multimodal.py"</w:t>
+        <w:t>"</w:t>
+      </w:r>
+      <w:proofErr w:type="spellStart"/>
+      <w:proofErr w:type="gramStart"/>
+      <w:r>
+        <w:t>py</w:t>
+      </w:r>
+      <w:proofErr w:type="spellEnd"/>
+      <w:proofErr w:type="gramEnd"/>
+      <w:r>
+        <w:t xml:space="preserve"> -m </w:t>
+      </w:r>
+      <w:proofErr w:type="spellStart"/>
+      <w:r>
+        <w:t>streamlit</w:t>
+      </w:r>
+      <w:proofErr w:type="spellEnd"/>
+      <w:r>
+        <w:t xml:space="preserve"> </w:t>
+      </w:r>
+      <w:proofErr w:type="gramStart"/>
+      <w:r>
+        <w:t>run .</w:t>
+      </w:r>
+      <w:proofErr w:type="gramEnd"/>
+      <w:r>
+        <w:t>\Multimodal.py"</w:t>
       </w:r>
     </w:p>
     <w:p/>
@@ -4463,6 +4791,7 @@
           <w:b/>
           <w:bCs/>
         </w:rPr>
+        <w:lastRenderedPageBreak/>
         <w:t>Day2</w:t>
       </w:r>
       <w:r>
@@ -4533,7 +4862,6 @@
     </w:p>
     <w:p>
       <w:r>
-        <w:lastRenderedPageBreak/>
         <w:t>An AI pipeline is complex, involving many different tools, data sources, and computing environments. Orchestration acts as the "glue" that connects these disconnected steps into a single, automated, and repeatable loop.</w:t>
       </w:r>
     </w:p>
@@ -4731,7 +5059,15 @@
     </w:p>
     <w:p>
       <w:r>
-        <w:t>&gt;npm install n8n -g</w:t>
+        <w:t>&gt;</w:t>
+      </w:r>
+      <w:proofErr w:type="spellStart"/>
+      <w:r>
+        <w:t>npm</w:t>
+      </w:r>
+      <w:proofErr w:type="spellEnd"/>
+      <w:r>
+        <w:t xml:space="preserve"> install n8n -g</w:t>
       </w:r>
     </w:p>
     <w:p>
@@ -4818,6 +5154,7 @@
     </w:p>
     <w:p>
       <w:r>
+        <w:lastRenderedPageBreak/>
         <w:t>Orchestration</w:t>
       </w:r>
       <w:r>
@@ -4870,7 +5207,6 @@
                 <w:b/>
                 <w:bCs/>
               </w:rPr>
-              <w:lastRenderedPageBreak/>
               <w:t>Term</w:t>
             </w:r>
           </w:p>
@@ -5177,7 +5513,10 @@
         <w:t xml:space="preserve"> retry</w:t>
       </w:r>
       <w:r>
-        <w:t xml:space="preserve"> -&gt; </w:t>
+        <w:t xml:space="preserve"> </w:t>
+      </w:r>
+      <w:r>
+        <w:t xml:space="preserve">or </w:t>
       </w:r>
       <w:r>
         <w:t>fallbacks (</w:t>
@@ -5189,7 +5528,13 @@
         <w:t>)</w:t>
       </w:r>
       <w:r>
-        <w:t xml:space="preserve"> – Error handling </w:t>
+        <w:t xml:space="preserve"> </w:t>
+      </w:r>
+      <w:r>
+        <w:t xml:space="preserve">or </w:t>
+      </w:r>
+      <w:r>
+        <w:t xml:space="preserve">Error handling </w:t>
       </w:r>
     </w:p>
     <w:p>
@@ -5230,7 +5575,6 @@
           <w:b/>
           <w:bCs/>
         </w:rPr>
-        <w:lastRenderedPageBreak/>
         <w:t>Day2</w:t>
       </w:r>
       <w:r>
@@ -5373,8 +5717,13 @@
       <w:r>
         <w:t xml:space="preserve"> and needs to be identified patterns (account number, SSN, credit card number </w:t>
       </w:r>
-      <w:r>
-        <w:t>etc)</w:t>
+      <w:proofErr w:type="spellStart"/>
+      <w:r>
+        <w:t>etc</w:t>
+      </w:r>
+      <w:proofErr w:type="spellEnd"/>
+      <w:r>
+        <w:t>)</w:t>
       </w:r>
     </w:p>
     <w:p>
@@ -5441,6 +5790,1138 @@
         </w:rPr>
         <w:t>)</w:t>
       </w:r>
+    </w:p>
+    <w:p>
+      <w:pPr>
+        <w:rPr>
+          <w:b/>
+          <w:bCs/>
+        </w:rPr>
+      </w:pPr>
+    </w:p>
+    <w:p>
+      <w:pPr>
+        <w:rPr>
+          <w:b/>
+          <w:bCs/>
+        </w:rPr>
+      </w:pPr>
+      <w:r>
+        <w:rPr>
+          <w:b/>
+          <w:bCs/>
+        </w:rPr>
+        <w:t>Day</w:t>
+      </w:r>
+      <w:r>
+        <w:rPr>
+          <w:b/>
+          <w:bCs/>
+        </w:rPr>
+        <w:t>3</w:t>
+      </w:r>
+      <w:r>
+        <w:rPr>
+          <w:b/>
+          <w:bCs/>
+        </w:rPr>
+        <w:t>1</w:t>
+      </w:r>
+      <w:r>
+        <w:rPr>
+          <w:b/>
+          <w:bCs/>
+        </w:rPr>
+        <w:t>:</w:t>
+      </w:r>
+      <w:r>
+        <w:rPr>
+          <w:b/>
+          <w:bCs/>
+        </w:rPr>
+        <w:t xml:space="preserve"> </w:t>
+      </w:r>
+      <w:r>
+        <w:rPr>
+          <w:b/>
+          <w:bCs/>
+        </w:rPr>
+        <w:t xml:space="preserve">(Agentic </w:t>
+      </w:r>
+      <w:r>
+        <w:rPr>
+          <w:b/>
+          <w:bCs/>
+        </w:rPr>
+        <w:t xml:space="preserve">AI </w:t>
+      </w:r>
+      <w:r>
+        <w:rPr>
+          <w:b/>
+          <w:bCs/>
+        </w:rPr>
+        <w:t xml:space="preserve">workflow </w:t>
+      </w:r>
+      <w:r>
+        <w:rPr>
+          <w:b/>
+          <w:bCs/>
+        </w:rPr>
+        <w:t>frameworks</w:t>
+      </w:r>
+      <w:r>
+        <w:rPr>
+          <w:b/>
+          <w:bCs/>
+        </w:rPr>
+        <w:t>)</w:t>
+      </w:r>
+    </w:p>
+    <w:p>
+      <w:r>
+        <w:rPr>
+          <w:b/>
+          <w:bCs/>
+        </w:rPr>
+        <w:t>Agent</w:t>
+      </w:r>
+      <w:r>
+        <w:t xml:space="preserve">: </w:t>
+      </w:r>
+      <w:r>
+        <w:t xml:space="preserve">System can think, redecide and </w:t>
+      </w:r>
+      <w:r>
+        <w:t xml:space="preserve">act -&gt; </w:t>
+      </w:r>
+      <w:r>
+        <w:t>LLM + Memory</w:t>
+      </w:r>
+      <w:r>
+        <w:t xml:space="preserve"> </w:t>
+      </w:r>
+      <w:r>
+        <w:t xml:space="preserve">+ Tools + </w:t>
+      </w:r>
+    </w:p>
+    <w:p>
+      <w:r>
+        <w:t>T</w:t>
+      </w:r>
+      <w:r>
+        <w:t>hink</w:t>
+      </w:r>
+      <w:r>
+        <w:t xml:space="preserve"> – LLM</w:t>
+      </w:r>
+    </w:p>
+    <w:p>
+      <w:r>
+        <w:t>Decide – decision loop</w:t>
+      </w:r>
+    </w:p>
+    <w:p>
+      <w:r>
+        <w:t xml:space="preserve">Act – actions </w:t>
+      </w:r>
+      <w:r>
+        <w:t>(tools)</w:t>
+      </w:r>
+    </w:p>
+    <w:p>
+      <w:pPr>
+        <w:rPr>
+          <w:b/>
+          <w:bCs/>
+          <w:u w:val="single"/>
+        </w:rPr>
+      </w:pPr>
+      <w:r>
+        <w:rPr>
+          <w:b/>
+          <w:bCs/>
+          <w:u w:val="single"/>
+        </w:rPr>
+        <w:t>Agentic AI</w:t>
+      </w:r>
+      <w:r>
+        <w:rPr>
+          <w:b/>
+          <w:bCs/>
+          <w:u w:val="single"/>
+        </w:rPr>
+        <w:t xml:space="preserve"> </w:t>
+      </w:r>
+      <w:r>
+        <w:rPr>
+          <w:b/>
+          <w:bCs/>
+          <w:u w:val="single"/>
+        </w:rPr>
+        <w:t>frameworks</w:t>
+      </w:r>
+      <w:r>
+        <w:rPr>
+          <w:b/>
+          <w:bCs/>
+          <w:u w:val="single"/>
+        </w:rPr>
+        <w:t xml:space="preserve"> (</w:t>
+      </w:r>
+      <w:r>
+        <w:rPr>
+          <w:b/>
+          <w:bCs/>
+          <w:u w:val="single"/>
+        </w:rPr>
+        <w:t>Multi Agents)</w:t>
+      </w:r>
+    </w:p>
+    <w:p>
+      <w:pPr>
+        <w:pStyle w:val="ListParagraph"/>
+        <w:numPr>
+          <w:ilvl w:val="0"/>
+          <w:numId w:val="26"/>
+        </w:numPr>
+      </w:pPr>
+      <w:r>
+        <w:rPr>
+          <w:u w:val="single"/>
+        </w:rPr>
+        <w:t>Lang graph</w:t>
+      </w:r>
+      <w:r>
+        <w:t xml:space="preserve"> </w:t>
+      </w:r>
+      <w:r>
+        <w:t>(controlled flow</w:t>
+      </w:r>
+      <w:r>
+        <w:t xml:space="preserve"> or flow is defined)</w:t>
+      </w:r>
+      <w:r>
+        <w:t xml:space="preserve"> </w:t>
+      </w:r>
+    </w:p>
+    <w:p>
+      <w:pPr>
+        <w:pStyle w:val="ListParagraph"/>
+      </w:pPr>
+      <w:r>
+        <w:t xml:space="preserve">Eg:  </w:t>
+      </w:r>
+      <w:r>
+        <w:t xml:space="preserve">Agentic </w:t>
+      </w:r>
+      <w:r>
+        <w:t xml:space="preserve">RAG, Human in the loop, Enterprise systems </w:t>
+      </w:r>
+    </w:p>
+    <w:p>
+      <w:pPr>
+        <w:pStyle w:val="ListParagraph"/>
+        <w:numPr>
+          <w:ilvl w:val="0"/>
+          <w:numId w:val="26"/>
+        </w:numPr>
+      </w:pPr>
+      <w:r>
+        <w:rPr>
+          <w:u w:val="single"/>
+        </w:rPr>
+        <w:t>Crew AI</w:t>
+      </w:r>
+      <w:r>
+        <w:t xml:space="preserve"> (flow do not defined)</w:t>
+      </w:r>
+      <w:r>
+        <w:t xml:space="preserve"> </w:t>
+      </w:r>
+      <w:r>
+        <w:t>(Multiple</w:t>
+      </w:r>
+      <w:r>
+        <w:t xml:space="preserve"> AI agents working like a team</w:t>
+      </w:r>
+      <w:r>
+        <w:t xml:space="preserve">, coordinating </w:t>
+      </w:r>
+      <w:r>
+        <w:t>themselves</w:t>
+      </w:r>
+      <w:r>
+        <w:t xml:space="preserve">, multi agent </w:t>
+      </w:r>
+      <w:r>
+        <w:t>orchestration)</w:t>
+      </w:r>
+    </w:p>
+    <w:p>
+      <w:pPr>
+        <w:pStyle w:val="ListParagraph"/>
+      </w:pPr>
+      <w:r>
+        <w:t xml:space="preserve">Eg: </w:t>
+      </w:r>
+    </w:p>
+    <w:p>
+      <w:pPr>
+        <w:pStyle w:val="ListParagraph"/>
+        <w:numPr>
+          <w:ilvl w:val="0"/>
+          <w:numId w:val="26"/>
+        </w:numPr>
+      </w:pPr>
+      <w:r>
+        <w:rPr>
+          <w:u w:val="single"/>
+        </w:rPr>
+        <w:lastRenderedPageBreak/>
+        <w:t xml:space="preserve">Auto </w:t>
+      </w:r>
+      <w:r>
+        <w:rPr>
+          <w:u w:val="single"/>
+        </w:rPr>
+        <w:t>gen</w:t>
+      </w:r>
+      <w:r>
+        <w:t xml:space="preserve"> (flow is uncertain) (Research and </w:t>
+      </w:r>
+      <w:r>
+        <w:t>experimentation) (AI Agents are talking to automatically)</w:t>
+      </w:r>
+      <w:r>
+        <w:t xml:space="preserve"> – it will run till we get refined output </w:t>
+      </w:r>
+    </w:p>
+    <w:p>
+      <w:pPr>
+        <w:pStyle w:val="ListParagraph"/>
+      </w:pPr>
+      <w:r>
+        <w:t xml:space="preserve">Eg: </w:t>
+      </w:r>
+      <w:r>
+        <w:t xml:space="preserve">Multi agent </w:t>
+      </w:r>
+      <w:r>
+        <w:t>debate,</w:t>
+      </w:r>
+      <w:r>
+        <w:t xml:space="preserve"> Vibe coding </w:t>
+      </w:r>
+    </w:p>
+    <w:p>
+      <w:pPr>
+        <w:rPr>
+          <w:b/>
+          <w:bCs/>
+        </w:rPr>
+      </w:pPr>
+    </w:p>
+    <w:p>
+      <w:pPr>
+        <w:pStyle w:val="ListParagraph"/>
+        <w:numPr>
+          <w:ilvl w:val="0"/>
+          <w:numId w:val="25"/>
+        </w:numPr>
+      </w:pPr>
+      <w:r>
+        <w:t>Lang chain</w:t>
+      </w:r>
+      <w:r>
+        <w:t xml:space="preserve"> </w:t>
+      </w:r>
+      <w:r>
+        <w:t>(Conversational</w:t>
+      </w:r>
+      <w:r>
+        <w:t xml:space="preserve"> AI)</w:t>
+      </w:r>
+    </w:p>
+    <w:p>
+      <w:pPr>
+        <w:pStyle w:val="ListParagraph"/>
+        <w:numPr>
+          <w:ilvl w:val="0"/>
+          <w:numId w:val="25"/>
+        </w:numPr>
+      </w:pPr>
+      <w:r>
+        <w:t>Lang graph</w:t>
+      </w:r>
+      <w:r>
+        <w:t xml:space="preserve"> (Agentic AI)</w:t>
+      </w:r>
+    </w:p>
+    <w:p>
+      <w:pPr>
+        <w:pStyle w:val="ListParagraph"/>
+        <w:numPr>
+          <w:ilvl w:val="0"/>
+          <w:numId w:val="25"/>
+        </w:numPr>
+      </w:pPr>
+      <w:r>
+        <w:t>Lang smith</w:t>
+      </w:r>
+    </w:p>
+    <w:p>
+      <w:pPr>
+        <w:pStyle w:val="ListParagraph"/>
+        <w:numPr>
+          <w:ilvl w:val="0"/>
+          <w:numId w:val="25"/>
+        </w:numPr>
+      </w:pPr>
+      <w:r>
+        <w:t xml:space="preserve">Lang fuse </w:t>
+      </w:r>
+    </w:p>
+    <w:p>
+      <w:pPr>
+        <w:pStyle w:val="ListParagraph"/>
+        <w:numPr>
+          <w:ilvl w:val="0"/>
+          <w:numId w:val="25"/>
+        </w:numPr>
+      </w:pPr>
+      <w:r>
+        <w:t xml:space="preserve">google </w:t>
+      </w:r>
+      <w:proofErr w:type="spellStart"/>
+      <w:r>
+        <w:t>adk</w:t>
+      </w:r>
+      <w:proofErr w:type="spellEnd"/>
+      <w:r>
+        <w:t>?</w:t>
+      </w:r>
+    </w:p>
+    <w:p>
+      <w:pPr>
+        <w:rPr>
+          <w:b/>
+          <w:bCs/>
+          <w:u w:val="single"/>
+        </w:rPr>
+      </w:pPr>
+      <w:r>
+        <w:rPr>
+          <w:b/>
+          <w:bCs/>
+          <w:u w:val="single"/>
+        </w:rPr>
+        <w:t xml:space="preserve">Agentic </w:t>
+      </w:r>
+      <w:r>
+        <w:rPr>
+          <w:b/>
+          <w:bCs/>
+          <w:u w:val="single"/>
+        </w:rPr>
+        <w:t>Patterns?</w:t>
+      </w:r>
+    </w:p>
+    <w:tbl>
+      <w:tblPr>
+        <w:tblW w:w="0" w:type="auto"/>
+        <w:tblCellSpacing w:w="15" w:type="dxa"/>
+        <w:tblCellMar>
+          <w:top w:w="15" w:type="dxa"/>
+          <w:left w:w="15" w:type="dxa"/>
+          <w:bottom w:w="15" w:type="dxa"/>
+          <w:right w:w="15" w:type="dxa"/>
+        </w:tblCellMar>
+        <w:tblLook w:val="04A0" w:firstRow="1" w:lastRow="0" w:firstColumn="1" w:lastColumn="0" w:noHBand="0" w:noVBand="1"/>
+      </w:tblPr>
+      <w:tblGrid>
+        <w:gridCol w:w="3272"/>
+        <w:gridCol w:w="6088"/>
+      </w:tblGrid>
+      <w:tr>
+        <w:trPr>
+          <w:tblHeader/>
+          <w:tblCellSpacing w:w="15" w:type="dxa"/>
+        </w:trPr>
+        <w:tc>
+          <w:tcPr>
+            <w:tcW w:w="0" w:type="auto"/>
+            <w:vAlign w:val="center"/>
+            <w:hideMark/>
+          </w:tcPr>
+          <w:p>
+            <w:pPr>
+              <w:rPr>
+                <w:b/>
+                <w:bCs/>
+                <w:u w:val="single"/>
+              </w:rPr>
+            </w:pPr>
+            <w:r>
+              <w:rPr>
+                <w:b/>
+                <w:bCs/>
+                <w:u w:val="single"/>
+              </w:rPr>
+              <w:t>Agentic Pattern</w:t>
+            </w:r>
+          </w:p>
+        </w:tc>
+        <w:tc>
+          <w:tcPr>
+            <w:tcW w:w="0" w:type="auto"/>
+            <w:vAlign w:val="center"/>
+            <w:hideMark/>
+          </w:tcPr>
+          <w:p>
+            <w:pPr>
+              <w:rPr>
+                <w:b/>
+                <w:bCs/>
+                <w:u w:val="single"/>
+              </w:rPr>
+            </w:pPr>
+            <w:r>
+              <w:rPr>
+                <w:b/>
+                <w:bCs/>
+                <w:u w:val="single"/>
+              </w:rPr>
+              <w:t>Summary</w:t>
+            </w:r>
+          </w:p>
+        </w:tc>
+      </w:tr>
+      <w:tr>
+        <w:trPr>
+          <w:tblCellSpacing w:w="15" w:type="dxa"/>
+        </w:trPr>
+        <w:tc>
+          <w:tcPr>
+            <w:tcW w:w="0" w:type="auto"/>
+            <w:vAlign w:val="center"/>
+            <w:hideMark/>
+          </w:tcPr>
+          <w:p>
+            <w:proofErr w:type="spellStart"/>
+            <w:r>
+              <w:t>ReAct</w:t>
+            </w:r>
+            <w:proofErr w:type="spellEnd"/>
+            <w:r>
+              <w:t xml:space="preserve"> (Reason + Act)</w:t>
+            </w:r>
+          </w:p>
+        </w:tc>
+        <w:tc>
+          <w:tcPr>
+            <w:tcW w:w="0" w:type="auto"/>
+            <w:vAlign w:val="center"/>
+            <w:hideMark/>
+          </w:tcPr>
+          <w:p>
+            <w:r>
+              <w:t>Agent thinks, uses tools, observes results, and continues iterating.</w:t>
+            </w:r>
+          </w:p>
+        </w:tc>
+      </w:tr>
+      <w:tr>
+        <w:trPr>
+          <w:tblCellSpacing w:w="15" w:type="dxa"/>
+        </w:trPr>
+        <w:tc>
+          <w:tcPr>
+            <w:tcW w:w="0" w:type="auto"/>
+            <w:vAlign w:val="center"/>
+            <w:hideMark/>
+          </w:tcPr>
+          <w:p>
+            <w:r>
+              <w:t>Plan-and-Execute</w:t>
+            </w:r>
+          </w:p>
+        </w:tc>
+        <w:tc>
+          <w:tcPr>
+            <w:tcW w:w="0" w:type="auto"/>
+            <w:vAlign w:val="center"/>
+            <w:hideMark/>
+          </w:tcPr>
+          <w:p>
+            <w:r>
+              <w:t>Agent creates a plan first, then executes tasks step-by-step.</w:t>
+            </w:r>
+          </w:p>
+        </w:tc>
+      </w:tr>
+      <w:tr>
+        <w:trPr>
+          <w:tblCellSpacing w:w="15" w:type="dxa"/>
+        </w:trPr>
+        <w:tc>
+          <w:tcPr>
+            <w:tcW w:w="0" w:type="auto"/>
+            <w:vAlign w:val="center"/>
+            <w:hideMark/>
+          </w:tcPr>
+          <w:p>
+            <w:r>
+              <w:t>Reflection / Self-Critique</w:t>
+            </w:r>
+          </w:p>
+        </w:tc>
+        <w:tc>
+          <w:tcPr>
+            <w:tcW w:w="0" w:type="auto"/>
+            <w:vAlign w:val="center"/>
+            <w:hideMark/>
+          </w:tcPr>
+          <w:p>
+            <w:r>
+              <w:t>Agent reviews and improves its own output before finalizing.</w:t>
+            </w:r>
+          </w:p>
+        </w:tc>
+      </w:tr>
+      <w:tr>
+        <w:trPr>
+          <w:tblCellSpacing w:w="15" w:type="dxa"/>
+        </w:trPr>
+        <w:tc>
+          <w:tcPr>
+            <w:tcW w:w="0" w:type="auto"/>
+            <w:vAlign w:val="center"/>
+            <w:hideMark/>
+          </w:tcPr>
+          <w:p>
+            <w:r>
+              <w:t>Tool-Using Agent</w:t>
+            </w:r>
+          </w:p>
+        </w:tc>
+        <w:tc>
+          <w:tcPr>
+            <w:tcW w:w="0" w:type="auto"/>
+            <w:vAlign w:val="center"/>
+            <w:hideMark/>
+          </w:tcPr>
+          <w:p>
+            <w:r>
+              <w:t>Agent decides when and how to use external tools, APIs, databases, or search.</w:t>
+            </w:r>
+          </w:p>
+        </w:tc>
+      </w:tr>
+      <w:tr>
+        <w:trPr>
+          <w:tblCellSpacing w:w="15" w:type="dxa"/>
+        </w:trPr>
+        <w:tc>
+          <w:tcPr>
+            <w:tcW w:w="0" w:type="auto"/>
+            <w:vAlign w:val="center"/>
+            <w:hideMark/>
+          </w:tcPr>
+          <w:p>
+            <w:r>
+              <w:t>Multi-Agent System</w:t>
+            </w:r>
+          </w:p>
+        </w:tc>
+        <w:tc>
+          <w:tcPr>
+            <w:tcW w:w="0" w:type="auto"/>
+            <w:vAlign w:val="center"/>
+            <w:hideMark/>
+          </w:tcPr>
+          <w:p>
+            <w:r>
+              <w:t>Multiple specialized agents collaborate to solve a problem.</w:t>
+            </w:r>
+          </w:p>
+        </w:tc>
+      </w:tr>
+      <w:tr>
+        <w:trPr>
+          <w:tblCellSpacing w:w="15" w:type="dxa"/>
+        </w:trPr>
+        <w:tc>
+          <w:tcPr>
+            <w:tcW w:w="0" w:type="auto"/>
+            <w:vAlign w:val="center"/>
+            <w:hideMark/>
+          </w:tcPr>
+          <w:p>
+            <w:r>
+              <w:t>Retrieval-Augmented Generation (RAG)</w:t>
+            </w:r>
+          </w:p>
+        </w:tc>
+        <w:tc>
+          <w:tcPr>
+            <w:tcW w:w="0" w:type="auto"/>
+            <w:vAlign w:val="center"/>
+            <w:hideMark/>
+          </w:tcPr>
+          <w:p>
+            <w:r>
+              <w:t>Agent retrieves relevant knowledge before generating a response.</w:t>
+            </w:r>
+          </w:p>
+        </w:tc>
+      </w:tr>
+      <w:tr>
+        <w:trPr>
+          <w:tblCellSpacing w:w="15" w:type="dxa"/>
+        </w:trPr>
+        <w:tc>
+          <w:tcPr>
+            <w:tcW w:w="0" w:type="auto"/>
+            <w:vAlign w:val="center"/>
+            <w:hideMark/>
+          </w:tcPr>
+          <w:p>
+            <w:r>
+              <w:t>Memory-Based Agent</w:t>
+            </w:r>
+          </w:p>
+        </w:tc>
+        <w:tc>
+          <w:tcPr>
+            <w:tcW w:w="0" w:type="auto"/>
+            <w:vAlign w:val="center"/>
+            <w:hideMark/>
+          </w:tcPr>
+          <w:p>
+            <w:r>
+              <w:t>Agent stores and recalls past interactions, preferences, or knowledge.</w:t>
+            </w:r>
+          </w:p>
+        </w:tc>
+      </w:tr>
+      <w:tr>
+        <w:trPr>
+          <w:tblCellSpacing w:w="15" w:type="dxa"/>
+        </w:trPr>
+        <w:tc>
+          <w:tcPr>
+            <w:tcW w:w="0" w:type="auto"/>
+            <w:vAlign w:val="center"/>
+            <w:hideMark/>
+          </w:tcPr>
+          <w:p>
+            <w:r>
+              <w:t>Hierarchical Agent</w:t>
+            </w:r>
+          </w:p>
+        </w:tc>
+        <w:tc>
+          <w:tcPr>
+            <w:tcW w:w="0" w:type="auto"/>
+            <w:vAlign w:val="center"/>
+            <w:hideMark/>
+          </w:tcPr>
+          <w:p>
+            <w:r>
+              <w:t>Manager agent delegates work to specialized sub-agents.</w:t>
+            </w:r>
+          </w:p>
+        </w:tc>
+      </w:tr>
+      <w:tr>
+        <w:trPr>
+          <w:tblCellSpacing w:w="15" w:type="dxa"/>
+        </w:trPr>
+        <w:tc>
+          <w:tcPr>
+            <w:tcW w:w="0" w:type="auto"/>
+            <w:vAlign w:val="center"/>
+            <w:hideMark/>
+          </w:tcPr>
+          <w:p>
+            <w:r>
+              <w:t>Event-Driven Agent</w:t>
+            </w:r>
+          </w:p>
+        </w:tc>
+        <w:tc>
+          <w:tcPr>
+            <w:tcW w:w="0" w:type="auto"/>
+            <w:vAlign w:val="center"/>
+            <w:hideMark/>
+          </w:tcPr>
+          <w:p>
+            <w:r>
+              <w:t>Agent automatically reacts to events, triggers, or notifications.</w:t>
+            </w:r>
+          </w:p>
+        </w:tc>
+      </w:tr>
+      <w:tr>
+        <w:trPr>
+          <w:tblCellSpacing w:w="15" w:type="dxa"/>
+        </w:trPr>
+        <w:tc>
+          <w:tcPr>
+            <w:tcW w:w="0" w:type="auto"/>
+            <w:vAlign w:val="center"/>
+            <w:hideMark/>
+          </w:tcPr>
+          <w:p>
+            <w:r>
+              <w:lastRenderedPageBreak/>
+              <w:t>Autonomous Looping Agent</w:t>
+            </w:r>
+          </w:p>
+        </w:tc>
+        <w:tc>
+          <w:tcPr>
+            <w:tcW w:w="0" w:type="auto"/>
+            <w:vAlign w:val="center"/>
+            <w:hideMark/>
+          </w:tcPr>
+          <w:p>
+            <w:r>
+              <w:t>Agent continuously plans, acts, and evaluates until a goal is achieved.</w:t>
+            </w:r>
+          </w:p>
+        </w:tc>
+      </w:tr>
+    </w:tbl>
+    <w:p>
+      <w:pPr>
+        <w:rPr>
+          <w:b/>
+          <w:bCs/>
+          <w:u w:val="single"/>
+        </w:rPr>
+      </w:pPr>
+    </w:p>
+    <w:p/>
+    <w:tbl>
+      <w:tblPr>
+        <w:tblW w:w="0" w:type="auto"/>
+        <w:tblCellSpacing w:w="15" w:type="dxa"/>
+        <w:tblCellMar>
+          <w:top w:w="15" w:type="dxa"/>
+          <w:left w:w="15" w:type="dxa"/>
+          <w:bottom w:w="15" w:type="dxa"/>
+          <w:right w:w="15" w:type="dxa"/>
+        </w:tblCellMar>
+        <w:tblLook w:val="04A0" w:firstRow="1" w:lastRow="0" w:firstColumn="1" w:lastColumn="0" w:noHBand="0" w:noVBand="1"/>
+      </w:tblPr>
+      <w:tblGrid>
+        <w:gridCol w:w="2053"/>
+        <w:gridCol w:w="4043"/>
+        <w:gridCol w:w="3264"/>
+      </w:tblGrid>
+      <w:tr>
+        <w:trPr>
+          <w:tblHeader/>
+          <w:tblCellSpacing w:w="15" w:type="dxa"/>
+        </w:trPr>
+        <w:tc>
+          <w:tcPr>
+            <w:tcW w:w="0" w:type="auto"/>
+            <w:vAlign w:val="center"/>
+            <w:hideMark/>
+          </w:tcPr>
+          <w:p>
+            <w:pPr>
+              <w:rPr>
+                <w:b/>
+                <w:bCs/>
+              </w:rPr>
+            </w:pPr>
+            <w:r>
+              <w:rPr>
+                <w:b/>
+                <w:bCs/>
+              </w:rPr>
+              <w:t>RAG Type</w:t>
+            </w:r>
+          </w:p>
+        </w:tc>
+        <w:tc>
+          <w:tcPr>
+            <w:tcW w:w="0" w:type="auto"/>
+            <w:vAlign w:val="center"/>
+            <w:hideMark/>
+          </w:tcPr>
+          <w:p>
+            <w:pPr>
+              <w:rPr>
+                <w:b/>
+                <w:bCs/>
+              </w:rPr>
+            </w:pPr>
+            <w:r>
+              <w:rPr>
+                <w:b/>
+                <w:bCs/>
+              </w:rPr>
+              <w:t>Best Frameworks</w:t>
+            </w:r>
+          </w:p>
+        </w:tc>
+        <w:tc>
+          <w:tcPr>
+            <w:tcW w:w="0" w:type="auto"/>
+            <w:vAlign w:val="center"/>
+            <w:hideMark/>
+          </w:tcPr>
+          <w:p>
+            <w:pPr>
+              <w:rPr>
+                <w:b/>
+                <w:bCs/>
+              </w:rPr>
+            </w:pPr>
+            <w:r>
+              <w:rPr>
+                <w:b/>
+                <w:bCs/>
+              </w:rPr>
+              <w:t>When to Use</w:t>
+            </w:r>
+          </w:p>
+        </w:tc>
+      </w:tr>
+      <w:tr>
+        <w:trPr>
+          <w:tblCellSpacing w:w="15" w:type="dxa"/>
+        </w:trPr>
+        <w:tc>
+          <w:tcPr>
+            <w:tcW w:w="0" w:type="auto"/>
+            <w:vAlign w:val="center"/>
+            <w:hideMark/>
+          </w:tcPr>
+          <w:p>
+            <w:r>
+              <w:t>Simple RAG</w:t>
+            </w:r>
+          </w:p>
+        </w:tc>
+        <w:tc>
+          <w:tcPr>
+            <w:tcW w:w="0" w:type="auto"/>
+            <w:vAlign w:val="center"/>
+            <w:hideMark/>
+          </w:tcPr>
+          <w:p>
+            <w:proofErr w:type="spellStart"/>
+            <w:r>
+              <w:t>LangChain</w:t>
+            </w:r>
+            <w:proofErr w:type="spellEnd"/>
+            <w:r>
+              <w:t xml:space="preserve">, </w:t>
+            </w:r>
+            <w:proofErr w:type="spellStart"/>
+            <w:r>
+              <w:t>LlamaIndex</w:t>
+            </w:r>
+            <w:proofErr w:type="spellEnd"/>
+            <w:r>
+              <w:t>, Haystack</w:t>
+            </w:r>
+          </w:p>
+        </w:tc>
+        <w:tc>
+          <w:tcPr>
+            <w:tcW w:w="0" w:type="auto"/>
+            <w:vAlign w:val="center"/>
+            <w:hideMark/>
+          </w:tcPr>
+          <w:p>
+            <w:r>
+              <w:t>Basic document Q&amp;A</w:t>
+            </w:r>
+          </w:p>
+        </w:tc>
+      </w:tr>
+      <w:tr>
+        <w:trPr>
+          <w:tblCellSpacing w:w="15" w:type="dxa"/>
+        </w:trPr>
+        <w:tc>
+          <w:tcPr>
+            <w:tcW w:w="0" w:type="auto"/>
+            <w:vAlign w:val="center"/>
+            <w:hideMark/>
+          </w:tcPr>
+          <w:p>
+            <w:r>
+              <w:t>Agentic RAG</w:t>
+            </w:r>
+          </w:p>
+        </w:tc>
+        <w:tc>
+          <w:tcPr>
+            <w:tcW w:w="0" w:type="auto"/>
+            <w:vAlign w:val="center"/>
+            <w:hideMark/>
+          </w:tcPr>
+          <w:p>
+            <w:proofErr w:type="spellStart"/>
+            <w:r>
+              <w:t>LangGraph</w:t>
+            </w:r>
+            <w:proofErr w:type="spellEnd"/>
+            <w:r>
+              <w:t xml:space="preserve">, </w:t>
+            </w:r>
+            <w:proofErr w:type="spellStart"/>
+            <w:r>
+              <w:t>CrewAI</w:t>
+            </w:r>
+            <w:proofErr w:type="spellEnd"/>
+            <w:r>
+              <w:t xml:space="preserve">, </w:t>
+            </w:r>
+            <w:proofErr w:type="spellStart"/>
+            <w:r>
+              <w:t>AutoGen</w:t>
+            </w:r>
+            <w:proofErr w:type="spellEnd"/>
+            <w:r>
+              <w:t>, OpenAI Agents SDK</w:t>
+            </w:r>
+          </w:p>
+        </w:tc>
+        <w:tc>
+          <w:tcPr>
+            <w:tcW w:w="0" w:type="auto"/>
+            <w:vAlign w:val="center"/>
+            <w:hideMark/>
+          </w:tcPr>
+          <w:p>
+            <w:r>
+              <w:t>Multi-step reasoning and tool usage</w:t>
+            </w:r>
+          </w:p>
+        </w:tc>
+      </w:tr>
+      <w:tr>
+        <w:trPr>
+          <w:tblCellSpacing w:w="15" w:type="dxa"/>
+        </w:trPr>
+        <w:tc>
+          <w:tcPr>
+            <w:tcW w:w="0" w:type="auto"/>
+            <w:vAlign w:val="center"/>
+            <w:hideMark/>
+          </w:tcPr>
+          <w:p>
+            <w:r>
+              <w:t>Graph RAG</w:t>
+            </w:r>
+          </w:p>
+        </w:tc>
+        <w:tc>
+          <w:tcPr>
+            <w:tcW w:w="0" w:type="auto"/>
+            <w:vAlign w:val="center"/>
+            <w:hideMark/>
+          </w:tcPr>
+          <w:p>
+            <w:proofErr w:type="spellStart"/>
+            <w:r>
+              <w:t>GraphRAG</w:t>
+            </w:r>
+            <w:proofErr w:type="spellEnd"/>
+            <w:r>
+              <w:t xml:space="preserve">, Neo4j, </w:t>
+            </w:r>
+            <w:proofErr w:type="spellStart"/>
+            <w:r>
+              <w:t>LlamaIndex</w:t>
+            </w:r>
+            <w:proofErr w:type="spellEnd"/>
+            <w:r>
+              <w:t xml:space="preserve"> Knowledge Graph</w:t>
+            </w:r>
+          </w:p>
+        </w:tc>
+        <w:tc>
+          <w:tcPr>
+            <w:tcW w:w="0" w:type="auto"/>
+            <w:vAlign w:val="center"/>
+            <w:hideMark/>
+          </w:tcPr>
+          <w:p>
+            <w:r>
+              <w:t>Relationship-heavy data</w:t>
+            </w:r>
+          </w:p>
+        </w:tc>
+      </w:tr>
+      <w:tr>
+        <w:trPr>
+          <w:tblCellSpacing w:w="15" w:type="dxa"/>
+        </w:trPr>
+        <w:tc>
+          <w:tcPr>
+            <w:tcW w:w="0" w:type="auto"/>
+            <w:vAlign w:val="center"/>
+            <w:hideMark/>
+          </w:tcPr>
+          <w:p>
+            <w:r>
+              <w:t>Corrective RAG (CRAG)</w:t>
+            </w:r>
+          </w:p>
+        </w:tc>
+        <w:tc>
+          <w:tcPr>
+            <w:tcW w:w="0" w:type="auto"/>
+            <w:vAlign w:val="center"/>
+            <w:hideMark/>
+          </w:tcPr>
+          <w:p>
+            <w:proofErr w:type="spellStart"/>
+            <w:r>
+              <w:t>LangGraph</w:t>
+            </w:r>
+            <w:proofErr w:type="spellEnd"/>
+            <w:r>
+              <w:t xml:space="preserve">, Haystack, </w:t>
+            </w:r>
+            <w:proofErr w:type="spellStart"/>
+            <w:r>
+              <w:t>DSPy</w:t>
+            </w:r>
+            <w:proofErr w:type="spellEnd"/>
+          </w:p>
+        </w:tc>
+        <w:tc>
+          <w:tcPr>
+            <w:tcW w:w="0" w:type="auto"/>
+            <w:vAlign w:val="center"/>
+            <w:hideMark/>
+          </w:tcPr>
+          <w:p>
+            <w:r>
+              <w:t>Retrieval validation and self-correction</w:t>
+            </w:r>
+          </w:p>
+        </w:tc>
+      </w:tr>
+    </w:tbl>
+    <w:p/>
+    <w:p>
+      <w:pPr>
+        <w:rPr>
+          <w:b/>
+          <w:bCs/>
+        </w:rPr>
+      </w:pPr>
     </w:p>
     <w:p/>
     <w:p/>
@@ -7227,6 +8708,95 @@
     </w:lvl>
   </w:abstractNum>
   <w:abstractNum w:abstractNumId="14" w15:restartNumberingAfterBreak="0">
+    <w:nsid w:val="52844F3C"/>
+    <w:multiLevelType w:val="hybridMultilevel"/>
+    <w:tmpl w:val="B5B8D5DA"/>
+    <w:lvl w:ilvl="0" w:tplc="0409000F">
+      <w:start w:val="1"/>
+      <w:numFmt w:val="decimal"/>
+      <w:lvlText w:val="%1."/>
+      <w:lvlJc w:val="left"/>
+      <w:pPr>
+        <w:ind w:left="720" w:hanging="360"/>
+      </w:pPr>
+      <w:rPr>
+        <w:rFonts w:hint="default"/>
+      </w:rPr>
+    </w:lvl>
+    <w:lvl w:ilvl="1" w:tplc="04090019" w:tentative="1">
+      <w:start w:val="1"/>
+      <w:numFmt w:val="lowerLetter"/>
+      <w:lvlText w:val="%2."/>
+      <w:lvlJc w:val="left"/>
+      <w:pPr>
+        <w:ind w:left="1440" w:hanging="360"/>
+      </w:pPr>
+    </w:lvl>
+    <w:lvl w:ilvl="2" w:tplc="0409001B" w:tentative="1">
+      <w:start w:val="1"/>
+      <w:numFmt w:val="lowerRoman"/>
+      <w:lvlText w:val="%3."/>
+      <w:lvlJc w:val="right"/>
+      <w:pPr>
+        <w:ind w:left="2160" w:hanging="180"/>
+      </w:pPr>
+    </w:lvl>
+    <w:lvl w:ilvl="3" w:tplc="0409000F" w:tentative="1">
+      <w:start w:val="1"/>
+      <w:numFmt w:val="decimal"/>
+      <w:lvlText w:val="%4."/>
+      <w:lvlJc w:val="left"/>
+      <w:pPr>
+        <w:ind w:left="2880" w:hanging="360"/>
+      </w:pPr>
+    </w:lvl>
+    <w:lvl w:ilvl="4" w:tplc="04090019" w:tentative="1">
+      <w:start w:val="1"/>
+      <w:numFmt w:val="lowerLetter"/>
+      <w:lvlText w:val="%5."/>
+      <w:lvlJc w:val="left"/>
+      <w:pPr>
+        <w:ind w:left="3600" w:hanging="360"/>
+      </w:pPr>
+    </w:lvl>
+    <w:lvl w:ilvl="5" w:tplc="0409001B" w:tentative="1">
+      <w:start w:val="1"/>
+      <w:numFmt w:val="lowerRoman"/>
+      <w:lvlText w:val="%6."/>
+      <w:lvlJc w:val="right"/>
+      <w:pPr>
+        <w:ind w:left="4320" w:hanging="180"/>
+      </w:pPr>
+    </w:lvl>
+    <w:lvl w:ilvl="6" w:tplc="0409000F" w:tentative="1">
+      <w:start w:val="1"/>
+      <w:numFmt w:val="decimal"/>
+      <w:lvlText w:val="%7."/>
+      <w:lvlJc w:val="left"/>
+      <w:pPr>
+        <w:ind w:left="5040" w:hanging="360"/>
+      </w:pPr>
+    </w:lvl>
+    <w:lvl w:ilvl="7" w:tplc="04090019" w:tentative="1">
+      <w:start w:val="1"/>
+      <w:numFmt w:val="lowerLetter"/>
+      <w:lvlText w:val="%8."/>
+      <w:lvlJc w:val="left"/>
+      <w:pPr>
+        <w:ind w:left="5760" w:hanging="360"/>
+      </w:pPr>
+    </w:lvl>
+    <w:lvl w:ilvl="8" w:tplc="0409001B" w:tentative="1">
+      <w:start w:val="1"/>
+      <w:numFmt w:val="lowerRoman"/>
+      <w:lvlText w:val="%9."/>
+      <w:lvlJc w:val="right"/>
+      <w:pPr>
+        <w:ind w:left="6480" w:hanging="180"/>
+      </w:pPr>
+    </w:lvl>
+  </w:abstractNum>
+  <w:abstractNum w:abstractNumId="15" w15:restartNumberingAfterBreak="0">
     <w:nsid w:val="5516795B"/>
     <w:multiLevelType w:val="multilevel"/>
     <w:tmpl w:val="EEB8C188"/>
@@ -7375,7 +8945,7 @@
       </w:rPr>
     </w:lvl>
   </w:abstractNum>
-  <w:abstractNum w:abstractNumId="15" w15:restartNumberingAfterBreak="0">
+  <w:abstractNum w:abstractNumId="16" w15:restartNumberingAfterBreak="0">
     <w:nsid w:val="56205641"/>
     <w:multiLevelType w:val="hybridMultilevel"/>
     <w:tmpl w:val="E05E16C6"/>
@@ -7464,7 +9034,7 @@
       </w:pPr>
     </w:lvl>
   </w:abstractNum>
-  <w:abstractNum w:abstractNumId="16" w15:restartNumberingAfterBreak="0">
+  <w:abstractNum w:abstractNumId="17" w15:restartNumberingAfterBreak="0">
     <w:nsid w:val="5968420F"/>
     <w:multiLevelType w:val="hybridMultilevel"/>
     <w:tmpl w:val="B6207FFC"/>
@@ -7553,7 +9123,7 @@
       </w:pPr>
     </w:lvl>
   </w:abstractNum>
-  <w:abstractNum w:abstractNumId="17" w15:restartNumberingAfterBreak="0">
+  <w:abstractNum w:abstractNumId="18" w15:restartNumberingAfterBreak="0">
     <w:nsid w:val="5E3D0D02"/>
     <w:multiLevelType w:val="hybridMultilevel"/>
     <w:tmpl w:val="A2C03018"/>
@@ -7642,7 +9212,7 @@
       </w:pPr>
     </w:lvl>
   </w:abstractNum>
-  <w:abstractNum w:abstractNumId="18" w15:restartNumberingAfterBreak="0">
+  <w:abstractNum w:abstractNumId="19" w15:restartNumberingAfterBreak="0">
     <w:nsid w:val="6095782C"/>
     <w:multiLevelType w:val="hybridMultilevel"/>
     <w:tmpl w:val="06EE4D14"/>
@@ -7731,7 +9301,7 @@
       </w:pPr>
     </w:lvl>
   </w:abstractNum>
-  <w:abstractNum w:abstractNumId="19" w15:restartNumberingAfterBreak="0">
+  <w:abstractNum w:abstractNumId="20" w15:restartNumberingAfterBreak="0">
     <w:nsid w:val="62965CA0"/>
     <w:multiLevelType w:val="hybridMultilevel"/>
     <w:tmpl w:val="B540E736"/>
@@ -7820,7 +9390,7 @@
       </w:pPr>
     </w:lvl>
   </w:abstractNum>
-  <w:abstractNum w:abstractNumId="20" w15:restartNumberingAfterBreak="0">
+  <w:abstractNum w:abstractNumId="21" w15:restartNumberingAfterBreak="0">
     <w:nsid w:val="63102536"/>
     <w:multiLevelType w:val="multilevel"/>
     <w:tmpl w:val="45FE758A"/>
@@ -7961,7 +9531,269 @@
       </w:rPr>
     </w:lvl>
   </w:abstractNum>
-  <w:abstractNum w:abstractNumId="21" w15:restartNumberingAfterBreak="0">
+  <w:abstractNum w:abstractNumId="22" w15:restartNumberingAfterBreak="0">
+    <w:nsid w:val="63464809"/>
+    <w:multiLevelType w:val="multilevel"/>
+    <w:tmpl w:val="8278AE30"/>
+    <w:lvl w:ilvl="0">
+      <w:start w:val="1"/>
+      <w:numFmt w:val="bullet"/>
+      <w:lvlText w:val=""/>
+      <w:lvlJc w:val="left"/>
+      <w:pPr>
+        <w:tabs>
+          <w:tab w:val="num" w:pos="720"/>
+        </w:tabs>
+        <w:ind w:left="720" w:hanging="360"/>
+      </w:pPr>
+      <w:rPr>
+        <w:rFonts w:ascii="Symbol" w:hAnsi="Symbol" w:hint="default"/>
+        <w:sz w:val="20"/>
+      </w:rPr>
+    </w:lvl>
+    <w:lvl w:ilvl="1" w:tentative="1">
+      <w:start w:val="1"/>
+      <w:numFmt w:val="bullet"/>
+      <w:lvlText w:val="o"/>
+      <w:lvlJc w:val="left"/>
+      <w:pPr>
+        <w:tabs>
+          <w:tab w:val="num" w:pos="1440"/>
+        </w:tabs>
+        <w:ind w:left="1440" w:hanging="360"/>
+      </w:pPr>
+      <w:rPr>
+        <w:rFonts w:ascii="Courier New" w:hAnsi="Courier New" w:hint="default"/>
+        <w:sz w:val="20"/>
+      </w:rPr>
+    </w:lvl>
+    <w:lvl w:ilvl="2" w:tentative="1">
+      <w:start w:val="1"/>
+      <w:numFmt w:val="bullet"/>
+      <w:lvlText w:val=""/>
+      <w:lvlJc w:val="left"/>
+      <w:pPr>
+        <w:tabs>
+          <w:tab w:val="num" w:pos="2160"/>
+        </w:tabs>
+        <w:ind w:left="2160" w:hanging="360"/>
+      </w:pPr>
+      <w:rPr>
+        <w:rFonts w:ascii="Wingdings" w:hAnsi="Wingdings" w:hint="default"/>
+        <w:sz w:val="20"/>
+      </w:rPr>
+    </w:lvl>
+    <w:lvl w:ilvl="3" w:tentative="1">
+      <w:start w:val="1"/>
+      <w:numFmt w:val="bullet"/>
+      <w:lvlText w:val=""/>
+      <w:lvlJc w:val="left"/>
+      <w:pPr>
+        <w:tabs>
+          <w:tab w:val="num" w:pos="2880"/>
+        </w:tabs>
+        <w:ind w:left="2880" w:hanging="360"/>
+      </w:pPr>
+      <w:rPr>
+        <w:rFonts w:ascii="Wingdings" w:hAnsi="Wingdings" w:hint="default"/>
+        <w:sz w:val="20"/>
+      </w:rPr>
+    </w:lvl>
+    <w:lvl w:ilvl="4" w:tentative="1">
+      <w:start w:val="1"/>
+      <w:numFmt w:val="bullet"/>
+      <w:lvlText w:val=""/>
+      <w:lvlJc w:val="left"/>
+      <w:pPr>
+        <w:tabs>
+          <w:tab w:val="num" w:pos="3600"/>
+        </w:tabs>
+        <w:ind w:left="3600" w:hanging="360"/>
+      </w:pPr>
+      <w:rPr>
+        <w:rFonts w:ascii="Wingdings" w:hAnsi="Wingdings" w:hint="default"/>
+        <w:sz w:val="20"/>
+      </w:rPr>
+    </w:lvl>
+    <w:lvl w:ilvl="5" w:tentative="1">
+      <w:start w:val="1"/>
+      <w:numFmt w:val="bullet"/>
+      <w:lvlText w:val=""/>
+      <w:lvlJc w:val="left"/>
+      <w:pPr>
+        <w:tabs>
+          <w:tab w:val="num" w:pos="4320"/>
+        </w:tabs>
+        <w:ind w:left="4320" w:hanging="360"/>
+      </w:pPr>
+      <w:rPr>
+        <w:rFonts w:ascii="Wingdings" w:hAnsi="Wingdings" w:hint="default"/>
+        <w:sz w:val="20"/>
+      </w:rPr>
+    </w:lvl>
+    <w:lvl w:ilvl="6" w:tentative="1">
+      <w:start w:val="1"/>
+      <w:numFmt w:val="bullet"/>
+      <w:lvlText w:val=""/>
+      <w:lvlJc w:val="left"/>
+      <w:pPr>
+        <w:tabs>
+          <w:tab w:val="num" w:pos="5040"/>
+        </w:tabs>
+        <w:ind w:left="5040" w:hanging="360"/>
+      </w:pPr>
+      <w:rPr>
+        <w:rFonts w:ascii="Wingdings" w:hAnsi="Wingdings" w:hint="default"/>
+        <w:sz w:val="20"/>
+      </w:rPr>
+    </w:lvl>
+    <w:lvl w:ilvl="7" w:tentative="1">
+      <w:start w:val="1"/>
+      <w:numFmt w:val="bullet"/>
+      <w:lvlText w:val=""/>
+      <w:lvlJc w:val="left"/>
+      <w:pPr>
+        <w:tabs>
+          <w:tab w:val="num" w:pos="5760"/>
+        </w:tabs>
+        <w:ind w:left="5760" w:hanging="360"/>
+      </w:pPr>
+      <w:rPr>
+        <w:rFonts w:ascii="Wingdings" w:hAnsi="Wingdings" w:hint="default"/>
+        <w:sz w:val="20"/>
+      </w:rPr>
+    </w:lvl>
+    <w:lvl w:ilvl="8" w:tentative="1">
+      <w:start w:val="1"/>
+      <w:numFmt w:val="bullet"/>
+      <w:lvlText w:val=""/>
+      <w:lvlJc w:val="left"/>
+      <w:pPr>
+        <w:tabs>
+          <w:tab w:val="num" w:pos="6480"/>
+        </w:tabs>
+        <w:ind w:left="6480" w:hanging="360"/>
+      </w:pPr>
+      <w:rPr>
+        <w:rFonts w:ascii="Wingdings" w:hAnsi="Wingdings" w:hint="default"/>
+        <w:sz w:val="20"/>
+      </w:rPr>
+    </w:lvl>
+  </w:abstractNum>
+  <w:abstractNum w:abstractNumId="23" w15:restartNumberingAfterBreak="0">
+    <w:nsid w:val="65C57690"/>
+    <w:multiLevelType w:val="hybridMultilevel"/>
+    <w:tmpl w:val="CF406EE6"/>
+    <w:lvl w:ilvl="0" w:tplc="C92044F6">
+      <w:start w:val="1"/>
+      <w:numFmt w:val="decimal"/>
+      <w:lvlText w:val="%1."/>
+      <w:lvlJc w:val="left"/>
+      <w:pPr>
+        <w:ind w:left="720" w:hanging="360"/>
+      </w:pPr>
+      <w:rPr>
+        <w:rFonts w:asciiTheme="minorHAnsi" w:eastAsiaTheme="minorHAnsi" w:hAnsiTheme="minorHAnsi" w:cstheme="minorBidi"/>
+      </w:rPr>
+    </w:lvl>
+    <w:lvl w:ilvl="1" w:tplc="04090003" w:tentative="1">
+      <w:start w:val="1"/>
+      <w:numFmt w:val="bullet"/>
+      <w:lvlText w:val="o"/>
+      <w:lvlJc w:val="left"/>
+      <w:pPr>
+        <w:ind w:left="1440" w:hanging="360"/>
+      </w:pPr>
+      <w:rPr>
+        <w:rFonts w:ascii="Courier New" w:hAnsi="Courier New" w:cs="Courier New" w:hint="default"/>
+      </w:rPr>
+    </w:lvl>
+    <w:lvl w:ilvl="2" w:tplc="04090005" w:tentative="1">
+      <w:start w:val="1"/>
+      <w:numFmt w:val="bullet"/>
+      <w:lvlText w:val=""/>
+      <w:lvlJc w:val="left"/>
+      <w:pPr>
+        <w:ind w:left="2160" w:hanging="360"/>
+      </w:pPr>
+      <w:rPr>
+        <w:rFonts w:ascii="Wingdings" w:hAnsi="Wingdings" w:hint="default"/>
+      </w:rPr>
+    </w:lvl>
+    <w:lvl w:ilvl="3" w:tplc="04090001" w:tentative="1">
+      <w:start w:val="1"/>
+      <w:numFmt w:val="bullet"/>
+      <w:lvlText w:val=""/>
+      <w:lvlJc w:val="left"/>
+      <w:pPr>
+        <w:ind w:left="2880" w:hanging="360"/>
+      </w:pPr>
+      <w:rPr>
+        <w:rFonts w:ascii="Symbol" w:hAnsi="Symbol" w:hint="default"/>
+      </w:rPr>
+    </w:lvl>
+    <w:lvl w:ilvl="4" w:tplc="04090003" w:tentative="1">
+      <w:start w:val="1"/>
+      <w:numFmt w:val="bullet"/>
+      <w:lvlText w:val="o"/>
+      <w:lvlJc w:val="left"/>
+      <w:pPr>
+        <w:ind w:left="3600" w:hanging="360"/>
+      </w:pPr>
+      <w:rPr>
+        <w:rFonts w:ascii="Courier New" w:hAnsi="Courier New" w:cs="Courier New" w:hint="default"/>
+      </w:rPr>
+    </w:lvl>
+    <w:lvl w:ilvl="5" w:tplc="04090005" w:tentative="1">
+      <w:start w:val="1"/>
+      <w:numFmt w:val="bullet"/>
+      <w:lvlText w:val=""/>
+      <w:lvlJc w:val="left"/>
+      <w:pPr>
+        <w:ind w:left="4320" w:hanging="360"/>
+      </w:pPr>
+      <w:rPr>
+        <w:rFonts w:ascii="Wingdings" w:hAnsi="Wingdings" w:hint="default"/>
+      </w:rPr>
+    </w:lvl>
+    <w:lvl w:ilvl="6" w:tplc="04090001" w:tentative="1">
+      <w:start w:val="1"/>
+      <w:numFmt w:val="bullet"/>
+      <w:lvlText w:val=""/>
+      <w:lvlJc w:val="left"/>
+      <w:pPr>
+        <w:ind w:left="5040" w:hanging="360"/>
+      </w:pPr>
+      <w:rPr>
+        <w:rFonts w:ascii="Symbol" w:hAnsi="Symbol" w:hint="default"/>
+      </w:rPr>
+    </w:lvl>
+    <w:lvl w:ilvl="7" w:tplc="04090003" w:tentative="1">
+      <w:start w:val="1"/>
+      <w:numFmt w:val="bullet"/>
+      <w:lvlText w:val="o"/>
+      <w:lvlJc w:val="left"/>
+      <w:pPr>
+        <w:ind w:left="5760" w:hanging="360"/>
+      </w:pPr>
+      <w:rPr>
+        <w:rFonts w:ascii="Courier New" w:hAnsi="Courier New" w:cs="Courier New" w:hint="default"/>
+      </w:rPr>
+    </w:lvl>
+    <w:lvl w:ilvl="8" w:tplc="04090005" w:tentative="1">
+      <w:start w:val="1"/>
+      <w:numFmt w:val="bullet"/>
+      <w:lvlText w:val=""/>
+      <w:lvlJc w:val="left"/>
+      <w:pPr>
+        <w:ind w:left="6480" w:hanging="360"/>
+      </w:pPr>
+      <w:rPr>
+        <w:rFonts w:ascii="Wingdings" w:hAnsi="Wingdings" w:hint="default"/>
+      </w:rPr>
+    </w:lvl>
+  </w:abstractNum>
+  <w:abstractNum w:abstractNumId="24" w15:restartNumberingAfterBreak="0">
     <w:nsid w:val="6BA431A0"/>
     <w:multiLevelType w:val="hybridMultilevel"/>
     <w:tmpl w:val="6C823EEE"/>
@@ -8050,7 +9882,7 @@
       </w:pPr>
     </w:lvl>
   </w:abstractNum>
-  <w:abstractNum w:abstractNumId="22" w15:restartNumberingAfterBreak="0">
+  <w:abstractNum w:abstractNumId="25" w15:restartNumberingAfterBreak="0">
     <w:nsid w:val="6F351E87"/>
     <w:multiLevelType w:val="hybridMultilevel"/>
     <w:tmpl w:val="BCA6A040"/>
@@ -8139,7 +9971,7 @@
       </w:pPr>
     </w:lvl>
   </w:abstractNum>
-  <w:abstractNum w:abstractNumId="23" w15:restartNumberingAfterBreak="0">
+  <w:abstractNum w:abstractNumId="26" w15:restartNumberingAfterBreak="0">
     <w:nsid w:val="74A06A07"/>
     <w:multiLevelType w:val="multilevel"/>
     <w:tmpl w:val="B372AAC2"/>
@@ -8285,6 +10117,119 @@
       <w:rPr>
         <w:rFonts w:ascii="Wingdings" w:hAnsi="Wingdings" w:hint="default"/>
         <w:sz w:val="20"/>
+      </w:rPr>
+    </w:lvl>
+  </w:abstractNum>
+  <w:abstractNum w:abstractNumId="27" w15:restartNumberingAfterBreak="0">
+    <w:nsid w:val="781E5F23"/>
+    <w:multiLevelType w:val="hybridMultilevel"/>
+    <w:tmpl w:val="0D32B3A0"/>
+    <w:lvl w:ilvl="0" w:tplc="04090001">
+      <w:start w:val="1"/>
+      <w:numFmt w:val="bullet"/>
+      <w:lvlText w:val=""/>
+      <w:lvlJc w:val="left"/>
+      <w:pPr>
+        <w:ind w:left="720" w:hanging="360"/>
+      </w:pPr>
+      <w:rPr>
+        <w:rFonts w:ascii="Symbol" w:hAnsi="Symbol" w:hint="default"/>
+      </w:rPr>
+    </w:lvl>
+    <w:lvl w:ilvl="1" w:tplc="04090003" w:tentative="1">
+      <w:start w:val="1"/>
+      <w:numFmt w:val="bullet"/>
+      <w:lvlText w:val="o"/>
+      <w:lvlJc w:val="left"/>
+      <w:pPr>
+        <w:ind w:left="1440" w:hanging="360"/>
+      </w:pPr>
+      <w:rPr>
+        <w:rFonts w:ascii="Courier New" w:hAnsi="Courier New" w:cs="Courier New" w:hint="default"/>
+      </w:rPr>
+    </w:lvl>
+    <w:lvl w:ilvl="2" w:tplc="04090005" w:tentative="1">
+      <w:start w:val="1"/>
+      <w:numFmt w:val="bullet"/>
+      <w:lvlText w:val=""/>
+      <w:lvlJc w:val="left"/>
+      <w:pPr>
+        <w:ind w:left="2160" w:hanging="360"/>
+      </w:pPr>
+      <w:rPr>
+        <w:rFonts w:ascii="Wingdings" w:hAnsi="Wingdings" w:hint="default"/>
+      </w:rPr>
+    </w:lvl>
+    <w:lvl w:ilvl="3" w:tplc="04090001" w:tentative="1">
+      <w:start w:val="1"/>
+      <w:numFmt w:val="bullet"/>
+      <w:lvlText w:val=""/>
+      <w:lvlJc w:val="left"/>
+      <w:pPr>
+        <w:ind w:left="2880" w:hanging="360"/>
+      </w:pPr>
+      <w:rPr>
+        <w:rFonts w:ascii="Symbol" w:hAnsi="Symbol" w:hint="default"/>
+      </w:rPr>
+    </w:lvl>
+    <w:lvl w:ilvl="4" w:tplc="04090003" w:tentative="1">
+      <w:start w:val="1"/>
+      <w:numFmt w:val="bullet"/>
+      <w:lvlText w:val="o"/>
+      <w:lvlJc w:val="left"/>
+      <w:pPr>
+        <w:ind w:left="3600" w:hanging="360"/>
+      </w:pPr>
+      <w:rPr>
+        <w:rFonts w:ascii="Courier New" w:hAnsi="Courier New" w:cs="Courier New" w:hint="default"/>
+      </w:rPr>
+    </w:lvl>
+    <w:lvl w:ilvl="5" w:tplc="04090005" w:tentative="1">
+      <w:start w:val="1"/>
+      <w:numFmt w:val="bullet"/>
+      <w:lvlText w:val=""/>
+      <w:lvlJc w:val="left"/>
+      <w:pPr>
+        <w:ind w:left="4320" w:hanging="360"/>
+      </w:pPr>
+      <w:rPr>
+        <w:rFonts w:ascii="Wingdings" w:hAnsi="Wingdings" w:hint="default"/>
+      </w:rPr>
+    </w:lvl>
+    <w:lvl w:ilvl="6" w:tplc="04090001" w:tentative="1">
+      <w:start w:val="1"/>
+      <w:numFmt w:val="bullet"/>
+      <w:lvlText w:val=""/>
+      <w:lvlJc w:val="left"/>
+      <w:pPr>
+        <w:ind w:left="5040" w:hanging="360"/>
+      </w:pPr>
+      <w:rPr>
+        <w:rFonts w:ascii="Symbol" w:hAnsi="Symbol" w:hint="default"/>
+      </w:rPr>
+    </w:lvl>
+    <w:lvl w:ilvl="7" w:tplc="04090003" w:tentative="1">
+      <w:start w:val="1"/>
+      <w:numFmt w:val="bullet"/>
+      <w:lvlText w:val="o"/>
+      <w:lvlJc w:val="left"/>
+      <w:pPr>
+        <w:ind w:left="5760" w:hanging="360"/>
+      </w:pPr>
+      <w:rPr>
+        <w:rFonts w:ascii="Courier New" w:hAnsi="Courier New" w:cs="Courier New" w:hint="default"/>
+      </w:rPr>
+    </w:lvl>
+    <w:lvl w:ilvl="8" w:tplc="04090005" w:tentative="1">
+      <w:start w:val="1"/>
+      <w:numFmt w:val="bullet"/>
+      <w:lvlText w:val=""/>
+      <w:lvlJc w:val="left"/>
+      <w:pPr>
+        <w:ind w:left="6480" w:hanging="360"/>
+      </w:pPr>
+      <w:rPr>
+        <w:rFonts w:ascii="Wingdings" w:hAnsi="Wingdings" w:hint="default"/>
       </w:rPr>
     </w:lvl>
   </w:abstractNum>
@@ -8295,7 +10240,7 @@
     <w:abstractNumId w:val="1"/>
   </w:num>
   <w:num w:numId="3" w16cid:durableId="1565987135">
-    <w:abstractNumId w:val="19"/>
+    <w:abstractNumId w:val="20"/>
   </w:num>
   <w:num w:numId="4" w16cid:durableId="1894853876">
     <w:abstractNumId w:val="7"/>
@@ -8304,7 +10249,7 @@
     <w:abstractNumId w:val="9"/>
   </w:num>
   <w:num w:numId="6" w16cid:durableId="1162701932">
-    <w:abstractNumId w:val="20"/>
+    <w:abstractNumId w:val="21"/>
   </w:num>
   <w:num w:numId="7" w16cid:durableId="1583375958">
     <w:abstractNumId w:val="10"/>
@@ -8316,13 +10261,13 @@
     <w:abstractNumId w:val="8"/>
   </w:num>
   <w:num w:numId="10" w16cid:durableId="226041387">
-    <w:abstractNumId w:val="14"/>
+    <w:abstractNumId w:val="15"/>
   </w:num>
   <w:num w:numId="11" w16cid:durableId="256597975">
-    <w:abstractNumId w:val="18"/>
+    <w:abstractNumId w:val="19"/>
   </w:num>
   <w:num w:numId="12" w16cid:durableId="444689046">
-    <w:abstractNumId w:val="17"/>
+    <w:abstractNumId w:val="18"/>
   </w:num>
   <w:num w:numId="13" w16cid:durableId="592905992">
     <w:abstractNumId w:val="6"/>
@@ -8331,13 +10276,13 @@
     <w:abstractNumId w:val="12"/>
   </w:num>
   <w:num w:numId="15" w16cid:durableId="1951038081">
-    <w:abstractNumId w:val="15"/>
+    <w:abstractNumId w:val="16"/>
   </w:num>
   <w:num w:numId="16" w16cid:durableId="2078043842">
-    <w:abstractNumId w:val="22"/>
+    <w:abstractNumId w:val="25"/>
   </w:num>
   <w:num w:numId="17" w16cid:durableId="822041288">
-    <w:abstractNumId w:val="23"/>
+    <w:abstractNumId w:val="26"/>
   </w:num>
   <w:num w:numId="18" w16cid:durableId="1990745772">
     <w:abstractNumId w:val="13"/>
@@ -8346,19 +10291,31 @@
     <w:abstractNumId w:val="4"/>
   </w:num>
   <w:num w:numId="20" w16cid:durableId="756633860">
-    <w:abstractNumId w:val="16"/>
+    <w:abstractNumId w:val="17"/>
   </w:num>
   <w:num w:numId="21" w16cid:durableId="138809987">
     <w:abstractNumId w:val="2"/>
   </w:num>
   <w:num w:numId="22" w16cid:durableId="484662782">
-    <w:abstractNumId w:val="21"/>
+    <w:abstractNumId w:val="24"/>
   </w:num>
   <w:num w:numId="23" w16cid:durableId="1642954586">
     <w:abstractNumId w:val="5"/>
   </w:num>
   <w:num w:numId="24" w16cid:durableId="1188521179">
     <w:abstractNumId w:val="0"/>
+  </w:num>
+  <w:num w:numId="25" w16cid:durableId="652222782">
+    <w:abstractNumId w:val="27"/>
+  </w:num>
+  <w:num w:numId="26" w16cid:durableId="702480462">
+    <w:abstractNumId w:val="23"/>
+  </w:num>
+  <w:num w:numId="27" w16cid:durableId="114450142">
+    <w:abstractNumId w:val="22"/>
+  </w:num>
+  <w:num w:numId="28" w16cid:durableId="1668709182">
+    <w:abstractNumId w:val="14"/>
   </w:num>
 </w:numbering>
 </file>
@@ -8966,7 +10923,6 @@
   <w:style w:type="character" w:default="1" w:styleId="DefaultParagraphFont">
     <w:name w:val="Default Paragraph Font"/>
     <w:uiPriority w:val="1"/>
-    <w:semiHidden/>
     <w:unhideWhenUsed/>
   </w:style>
   <w:style w:type="table" w:default="1" w:styleId="TableNormal">

</xml_diff>

<commit_message>
Add new demo scripts for Agentic AI workflows and update documentation
</commit_message>
<xml_diff>
--- a/documentation/Gen AI and Agentic AI.docx
+++ b/documentation/Gen AI and Agentic AI.docx
@@ -5818,14 +5818,7 @@
           <w:b/>
           <w:bCs/>
         </w:rPr>
-        <w:t>3</w:t>
-      </w:r>
-      <w:r>
-        <w:rPr>
-          <w:b/>
-          <w:bCs/>
-        </w:rPr>
-        <w:t>1</w:t>
+        <w:t>31</w:t>
       </w:r>
       <w:r>
         <w:rPr>
@@ -5906,13 +5899,19 @@
     </w:p>
     <w:p>
       <w:r>
-        <w:t>T</w:t>
-      </w:r>
-      <w:r>
-        <w:t>hink</w:t>
-      </w:r>
-      <w:r>
-        <w:t xml:space="preserve"> – LLM</w:t>
+        <w:rPr>
+          <w:b/>
+          <w:bCs/>
+        </w:rPr>
+        <w:t>Agent</w:t>
+      </w:r>
+      <w:r>
+        <w:t xml:space="preserve"> = Reasoning + Planning + Tool Usage + Memory</w:t>
+      </w:r>
+    </w:p>
+    <w:p>
+      <w:r>
+        <w:t>Think – LLM</w:t>
       </w:r>
     </w:p>
     <w:p>
@@ -5927,7 +5926,114 @@
       <w:r>
         <w:t>(tools)</w:t>
       </w:r>
-    </w:p>
+      <w:r>
+        <w:t xml:space="preserve"> </w:t>
+      </w:r>
+    </w:p>
+    <w:p/>
+    <w:p/>
+    <w:p/>
+    <w:p/>
+    <w:p>
+      <w:r>
+        <w:lastRenderedPageBreak/>
+        <w:t xml:space="preserve">Eg: </w:t>
+      </w:r>
+    </w:p>
+    <w:p>
+      <w:r>
+        <w:t>Manager Agent</w:t>
+      </w:r>
+      <w:r>
+        <w:br/>
+        <w:t>↓</w:t>
+      </w:r>
+      <w:r>
+        <w:br/>
+        <w:t>Research Agent</w:t>
+      </w:r>
+      <w:r>
+        <w:br/>
+        <w:t>↓</w:t>
+      </w:r>
+      <w:r>
+        <w:br/>
+        <w:t>Web Search Tool</w:t>
+      </w:r>
+    </w:p>
+    <w:p/>
+    <w:p>
+      <w:r>
+        <w:t>HR Assistant Agent</w:t>
+      </w:r>
+      <w:r>
+        <w:br/>
+      </w:r>
+      <w:r>
+        <w:rPr>
+          <w:rFonts w:ascii="MS Gothic" w:eastAsia="MS Gothic" w:hAnsi="MS Gothic" w:cs="MS Gothic" w:hint="eastAsia"/>
+        </w:rPr>
+        <w:t>├</w:t>
+      </w:r>
+      <w:r>
+        <w:rPr>
+          <w:rFonts w:ascii="Aptos" w:hAnsi="Aptos" w:cs="Aptos"/>
+        </w:rPr>
+        <w:t>──</w:t>
+      </w:r>
+      <w:r>
+        <w:t xml:space="preserve"> Policy Search Tool</w:t>
+      </w:r>
+      <w:r>
+        <w:br/>
+      </w:r>
+      <w:r>
+        <w:rPr>
+          <w:rFonts w:ascii="MS Gothic" w:eastAsia="MS Gothic" w:hAnsi="MS Gothic" w:cs="MS Gothic" w:hint="eastAsia"/>
+        </w:rPr>
+        <w:t>├</w:t>
+      </w:r>
+      <w:r>
+        <w:rPr>
+          <w:rFonts w:ascii="Aptos" w:hAnsi="Aptos" w:cs="Aptos"/>
+        </w:rPr>
+        <w:t>──</w:t>
+      </w:r>
+      <w:r>
+        <w:t xml:space="preserve"> Leave Balance Tool</w:t>
+      </w:r>
+      <w:r>
+        <w:br/>
+      </w:r>
+      <w:r>
+        <w:rPr>
+          <w:rFonts w:ascii="MS Gothic" w:eastAsia="MS Gothic" w:hAnsi="MS Gothic" w:cs="MS Gothic" w:hint="eastAsia"/>
+        </w:rPr>
+        <w:t>├</w:t>
+      </w:r>
+      <w:r>
+        <w:rPr>
+          <w:rFonts w:ascii="Aptos" w:hAnsi="Aptos" w:cs="Aptos"/>
+        </w:rPr>
+        <w:t>──</w:t>
+      </w:r>
+      <w:r>
+        <w:t xml:space="preserve"> Payroll Tool</w:t>
+      </w:r>
+      <w:r>
+        <w:br/>
+      </w:r>
+      <w:r>
+        <w:rPr>
+          <w:rFonts w:ascii="Aptos" w:hAnsi="Aptos" w:cs="Aptos"/>
+        </w:rPr>
+        <w:t>└──</w:t>
+      </w:r>
+      <w:r>
+        <w:t xml:space="preserve"> Employee Directory Tool</w:t>
+      </w:r>
+    </w:p>
+    <w:p/>
     <w:p>
       <w:pPr>
         <w:rPr>
@@ -5995,14 +6101,32 @@
         <w:t xml:space="preserve"> </w:t>
       </w:r>
       <w:r>
-        <w:t>(controlled flow</w:t>
-      </w:r>
-      <w:r>
-        <w:t xml:space="preserve"> or flow is defined)</w:t>
+        <w:t xml:space="preserve">(controlled </w:t>
+      </w:r>
+      <w:r>
+        <w:t>flow, flow</w:t>
+      </w:r>
+      <w:r>
+        <w:t xml:space="preserve"> is </w:t>
+      </w:r>
+      <w:r>
+        <w:t>defined,</w:t>
       </w:r>
       <w:r>
         <w:t xml:space="preserve"> </w:t>
       </w:r>
+      <w:r>
+        <w:t>sequential flow</w:t>
+      </w:r>
+      <w:r>
+        <w:t xml:space="preserve">, one input is output of next </w:t>
+      </w:r>
+      <w:r>
+        <w:t>flow)</w:t>
+      </w:r>
+      <w:r>
+        <w:t xml:space="preserve"> </w:t>
+      </w:r>
     </w:p>
     <w:p>
       <w:pPr>
@@ -6017,6 +6141,11 @@
       <w:r>
         <w:t xml:space="preserve">RAG, Human in the loop, Enterprise systems </w:t>
       </w:r>
+    </w:p>
+    <w:p>
+      <w:pPr>
+        <w:pStyle w:val="ListParagraph"/>
+      </w:pPr>
     </w:p>
     <w:p>
       <w:pPr>
@@ -6033,7 +6162,13 @@
         <w:t>Crew AI</w:t>
       </w:r>
       <w:r>
-        <w:t xml:space="preserve"> (flow do not defined)</w:t>
+        <w:t xml:space="preserve"> (flow </w:t>
+      </w:r>
+      <w:r>
+        <w:t>is</w:t>
+      </w:r>
+      <w:r>
+        <w:t xml:space="preserve"> not defined)</w:t>
       </w:r>
       <w:r>
         <w:t xml:space="preserve"> </w:t>
@@ -6063,6 +6198,9 @@
       </w:pPr>
       <w:r>
         <w:t xml:space="preserve">Eg: </w:t>
+      </w:r>
+      <w:r>
+        <w:t xml:space="preserve">Role based collaboration </w:t>
       </w:r>
     </w:p>
     <w:p>
@@ -6077,7 +6215,6 @@
         <w:rPr>
           <w:u w:val="single"/>
         </w:rPr>
-        <w:lastRenderedPageBreak/>
         <w:t xml:space="preserve">Auto </w:t>
       </w:r>
       <w:r>
@@ -6090,7 +6227,13 @@
         <w:t xml:space="preserve"> (flow is uncertain) (Research and </w:t>
       </w:r>
       <w:r>
-        <w:t>experimentation) (AI Agents are talking to automatically)</w:t>
+        <w:t xml:space="preserve">experimentation) (AI Agents are talking to </w:t>
+      </w:r>
+      <w:r>
+        <w:t>each other</w:t>
+      </w:r>
+      <w:r>
+        <w:t>)</w:t>
       </w:r>
       <w:r>
         <w:t xml:space="preserve"> – it will run till we get refined output </w:t>
@@ -6203,6 +6346,21 @@
     </w:p>
     <w:p>
       <w:pPr>
+        <w:pStyle w:val="ListParagraph"/>
+      </w:pPr>
+    </w:p>
+    <w:p>
+      <w:pPr>
+        <w:pStyle w:val="ListParagraph"/>
+      </w:pPr>
+    </w:p>
+    <w:p>
+      <w:pPr>
+        <w:pStyle w:val="ListParagraph"/>
+      </w:pPr>
+    </w:p>
+    <w:p>
+      <w:pPr>
         <w:rPr>
           <w:b/>
           <w:bCs/>
@@ -6215,6 +6373,7 @@
           <w:bCs/>
           <w:u w:val="single"/>
         </w:rPr>
+        <w:lastRenderedPageBreak/>
         <w:t xml:space="preserve">Agentic </w:t>
       </w:r>
       <w:r>
@@ -6574,7 +6733,6 @@
           </w:tcPr>
           <w:p>
             <w:r>
-              <w:lastRenderedPageBreak/>
               <w:t>Autonomous Looping Agent</w:t>
             </w:r>
           </w:p>
@@ -6593,15 +6751,6 @@
         </w:tc>
       </w:tr>
     </w:tbl>
-    <w:p>
-      <w:pPr>
-        <w:rPr>
-          <w:b/>
-          <w:bCs/>
-          <w:u w:val="single"/>
-        </w:rPr>
-      </w:pPr>
-    </w:p>
     <w:p/>
     <w:tbl>
       <w:tblPr>
@@ -6820,6 +6969,7 @@
           </w:tcPr>
           <w:p>
             <w:r>
+              <w:lastRenderedPageBreak/>
               <w:t>Graph RAG</w:t>
             </w:r>
           </w:p>
@@ -6914,6 +7064,68 @@
         </w:tc>
       </w:tr>
     </w:tbl>
+    <w:p/>
+    <w:p>
+      <w:pPr>
+        <w:rPr>
+          <w:b/>
+          <w:bCs/>
+        </w:rPr>
+      </w:pPr>
+      <w:r>
+        <w:rPr>
+          <w:b/>
+          <w:bCs/>
+        </w:rPr>
+        <w:t>Day</w:t>
+      </w:r>
+      <w:r>
+        <w:rPr>
+          <w:b/>
+          <w:bCs/>
+        </w:rPr>
+        <w:t>3</w:t>
+      </w:r>
+      <w:r>
+        <w:rPr>
+          <w:b/>
+          <w:bCs/>
+        </w:rPr>
+        <w:t>2</w:t>
+      </w:r>
+      <w:r>
+        <w:rPr>
+          <w:b/>
+          <w:bCs/>
+        </w:rPr>
+        <w:t>:</w:t>
+      </w:r>
+      <w:r>
+        <w:rPr>
+          <w:b/>
+          <w:bCs/>
+        </w:rPr>
+        <w:t xml:space="preserve"> </w:t>
+      </w:r>
+    </w:p>
+    <w:p>
+      <w:r>
+        <w:t xml:space="preserve">Working session of </w:t>
+      </w:r>
+      <w:r>
+        <w:t>Lang</w:t>
+      </w:r>
+      <w:r>
+        <w:t xml:space="preserve"> </w:t>
+      </w:r>
+      <w:r>
+        <w:t>Graph</w:t>
+      </w:r>
+      <w:r>
+        <w:t>, Crew AI, Auto gen</w:t>
+      </w:r>
+    </w:p>
+    <w:p/>
     <w:p/>
     <w:p>
       <w:pPr>

</xml_diff>

<commit_message>
Add new documentation files for Resume Building Session and Session Artifacts
- Added a ZIP file containing the Resume Building Session artifacts.
- Created a Word document for Session Artifacts detailing the session outcomes and materials.
</commit_message>
<xml_diff>
--- a/documentation/Gen AI and Agentic AI.docx
+++ b/documentation/Gen AI and Agentic AI.docx
@@ -56,7 +56,6 @@
         </w:rPr>
       </w:pPr>
       <w:hyperlink r:id="rId6" w:history="1">
-        <w:proofErr w:type="spellStart"/>
         <w:r>
           <w:rPr>
             <w:rStyle w:val="Hyperlink"/>
@@ -65,7 +64,6 @@
           </w:rPr>
           <w:t>Ollama</w:t>
         </w:r>
-        <w:proofErr w:type="spellEnd"/>
       </w:hyperlink>
       <w:r>
         <w:rPr>
@@ -96,12 +94,6 @@
       </w:r>
     </w:p>
     <w:p>
-      <w:pPr>
-        <w:rPr>
-          <w:b/>
-          <w:bCs/>
-        </w:rPr>
-      </w:pPr>
       <w:hyperlink r:id="rId7" w:history="1">
         <w:r>
           <w:rPr>
@@ -115,6 +107,23 @@
     </w:p>
     <w:p>
       <w:pPr>
+        <w:rPr>
+          <w:b/>
+          <w:bCs/>
+        </w:rPr>
+      </w:pPr>
+      <w:r>
+        <w:t xml:space="preserve">Note: Asking about use cases or projects in STAR format </w:t>
+      </w:r>
+      <w:r>
+        <w:t xml:space="preserve">(situation, task, Action, result) </w:t>
+      </w:r>
+      <w:r>
+        <w:t>?</w:t>
+      </w:r>
+    </w:p>
+    <w:p>
+      <w:pPr>
         <w:jc w:val="right"/>
       </w:pPr>
       <w:r>
@@ -174,21 +183,7 @@
           <w:rPr>
             <w:rStyle w:val="Hyperlink"/>
           </w:rPr>
-          <w:t xml:space="preserve">ChatGPT - </w:t>
-        </w:r>
-        <w:proofErr w:type="spellStart"/>
-        <w:r>
-          <w:rPr>
-            <w:rStyle w:val="Hyperlink"/>
-          </w:rPr>
-          <w:t>NutriPro</w:t>
-        </w:r>
-        <w:proofErr w:type="spellEnd"/>
-        <w:r>
-          <w:rPr>
-            <w:rStyle w:val="Hyperlink"/>
-          </w:rPr>
-          <w:t xml:space="preserve"> -Ghar Ka Khana</w:t>
+          <w:t>ChatGPT - NutriPro -Ghar Ka Khana</w:t>
         </w:r>
       </w:hyperlink>
     </w:p>
@@ -677,6 +672,7 @@
     </w:p>
     <w:p>
       <w:r>
+        <w:lastRenderedPageBreak/>
         <w:t xml:space="preserve">Create an own GPT with </w:t>
       </w:r>
       <w:r>
@@ -716,7 +712,6 @@
           <w:bCs/>
           <w:u w:val="single"/>
         </w:rPr>
-        <w:lastRenderedPageBreak/>
         <w:t>System Prompt:</w:t>
       </w:r>
     </w:p>
@@ -889,7 +884,6 @@
     <w:p/>
     <w:p>
       <w:r>
-        <w:lastRenderedPageBreak/>
         <w:t>Example:</w:t>
       </w:r>
     </w:p>
@@ -1174,6 +1168,7 @@
         </w:numPr>
       </w:pPr>
       <w:r>
+        <w:lastRenderedPageBreak/>
         <w:t xml:space="preserve">Together → </w:t>
       </w:r>
       <w:r>
@@ -1329,7 +1324,6 @@
           <w:b/>
           <w:bCs/>
         </w:rPr>
-        <w:lastRenderedPageBreak/>
         <w:t>Day</w:t>
       </w:r>
       <w:r>
@@ -1362,7 +1356,6 @@
         </w:rPr>
       </w:pPr>
       <w:hyperlink r:id="rId17" w:history="1">
-        <w:proofErr w:type="spellStart"/>
         <w:r>
           <w:rPr>
             <w:rStyle w:val="Hyperlink"/>
@@ -1371,7 +1364,6 @@
           </w:rPr>
           <w:t>Ollama</w:t>
         </w:r>
-        <w:proofErr w:type="spellEnd"/>
       </w:hyperlink>
     </w:p>
     <w:p>
@@ -1393,7 +1385,6 @@
       </w:hyperlink>
     </w:p>
     <w:p>
-      <w:proofErr w:type="spellStart"/>
       <w:r>
         <w:rPr>
           <w:b/>
@@ -1401,7 +1392,6 @@
         </w:rPr>
         <w:t>Ollama</w:t>
       </w:r>
-      <w:proofErr w:type="spellEnd"/>
       <w:r>
         <w:t xml:space="preserve"> is a tool that lets you </w:t>
       </w:r>
@@ -1423,7 +1413,6 @@
           <w:bCs/>
         </w:rPr>
       </w:pPr>
-      <w:proofErr w:type="spellStart"/>
       <w:r>
         <w:rPr>
           <w:b/>
@@ -1431,7 +1420,6 @@
         </w:rPr>
         <w:t>Ollama</w:t>
       </w:r>
-      <w:proofErr w:type="spellEnd"/>
       <w:r>
         <w:rPr>
           <w:b/>
@@ -1468,46 +1456,30 @@
       </w:r>
     </w:p>
     <w:p>
-      <w:proofErr w:type="spellStart"/>
+      <w:r>
+        <w:t>ollama run “model name”</w:t>
+      </w:r>
+    </w:p>
+    <w:p>
       <w:r>
         <w:t>ollama</w:t>
       </w:r>
-      <w:proofErr w:type="spellEnd"/>
-      <w:r>
-        <w:t xml:space="preserve"> run “model name”</w:t>
-      </w:r>
-    </w:p>
-    <w:p>
-      <w:proofErr w:type="spellStart"/>
+      <w:r>
+        <w:t xml:space="preserve"> ls</w:t>
+      </w:r>
+    </w:p>
+    <w:p>
       <w:r>
         <w:t>ollama</w:t>
       </w:r>
-      <w:proofErr w:type="spellEnd"/>
-      <w:r>
-        <w:t xml:space="preserve"> ls</w:t>
-      </w:r>
-    </w:p>
-    <w:p>
-      <w:proofErr w:type="spellStart"/>
+      <w:r>
+        <w:t xml:space="preserve"> ps</w:t>
+      </w:r>
+    </w:p>
+    <w:p>
       <w:r>
         <w:t>ollama</w:t>
       </w:r>
-      <w:proofErr w:type="spellEnd"/>
-      <w:r>
-        <w:t xml:space="preserve"> </w:t>
-      </w:r>
-      <w:proofErr w:type="spellStart"/>
-      <w:r>
-        <w:t>ps</w:t>
-      </w:r>
-      <w:proofErr w:type="spellEnd"/>
-    </w:p>
-    <w:p>
-      <w:proofErr w:type="spellStart"/>
-      <w:r>
-        <w:t>ollama</w:t>
-      </w:r>
-      <w:proofErr w:type="spellEnd"/>
       <w:r>
         <w:t xml:space="preserve"> help</w:t>
       </w:r>
@@ -1538,15 +1510,7 @@
     </w:p>
     <w:p>
       <w:r>
-        <w:t xml:space="preserve">Your App → </w:t>
-      </w:r>
-      <w:proofErr w:type="spellStart"/>
-      <w:r>
-        <w:t>Ollama</w:t>
-      </w:r>
-      <w:proofErr w:type="spellEnd"/>
-      <w:r>
-        <w:t xml:space="preserve"> → Local Model → Response</w:t>
+        <w:t>Your App → Ollama → Local Model → Response</w:t>
       </w:r>
     </w:p>
     <w:p>
@@ -1576,17 +1540,8 @@
           <w:b/>
           <w:bCs/>
         </w:rPr>
-        <w:t xml:space="preserve"> Why people use </w:t>
-      </w:r>
-      <w:proofErr w:type="spellStart"/>
-      <w:r>
-        <w:rPr>
-          <w:b/>
-          <w:bCs/>
-        </w:rPr>
-        <w:t>Ollama</w:t>
-      </w:r>
-      <w:proofErr w:type="spellEnd"/>
+        <w:t xml:space="preserve"> Why people use Ollama</w:t>
+      </w:r>
     </w:p>
     <w:p>
       <w:pPr>
@@ -1730,7 +1685,6 @@
           <w:b/>
           <w:bCs/>
         </w:rPr>
-        <w:lastRenderedPageBreak/>
         <w:t>Day8:</w:t>
       </w:r>
     </w:p>
@@ -1768,13 +1722,8 @@
       </w:r>
     </w:p>
     <w:p>
-      <w:proofErr w:type="spellStart"/>
-      <w:r>
-        <w:t>ollama</w:t>
-      </w:r>
-      <w:proofErr w:type="spellEnd"/>
-      <w:r>
-        <w:t xml:space="preserve"> create “custom model name”</w:t>
+      <w:r>
+        <w:t>ollama create “custom model name”</w:t>
       </w:r>
     </w:p>
     <w:p>
@@ -1807,39 +1756,24 @@
       </w:r>
     </w:p>
     <w:p>
-      <w:proofErr w:type="spellStart"/>
-      <w:r>
-        <w:rPr>
-          <w:b/>
-          <w:bCs/>
-        </w:rPr>
-        <w:t>cmd</w:t>
-      </w:r>
-      <w:proofErr w:type="spellEnd"/>
-      <w:r>
-        <w:rPr>
-          <w:b/>
-          <w:bCs/>
-        </w:rPr>
-        <w:t>:</w:t>
+      <w:r>
+        <w:rPr>
+          <w:b/>
+          <w:bCs/>
+        </w:rPr>
+        <w:t>cmd:</w:t>
       </w:r>
       <w:r>
         <w:t xml:space="preserve"> </w:t>
       </w:r>
     </w:p>
     <w:p>
-      <w:proofErr w:type="spellStart"/>
       <w:r>
         <w:t>o</w:t>
       </w:r>
       <w:r>
-        <w:t>llama</w:t>
-      </w:r>
-      <w:proofErr w:type="spellEnd"/>
-      <w:r>
-        <w:t xml:space="preserve"> create </w:t>
-      </w:r>
-      <w:proofErr w:type="spellStart"/>
+        <w:t xml:space="preserve">llama create </w:t>
+      </w:r>
       <w:r>
         <w:rPr>
           <w:b/>
@@ -1847,17 +1781,8 @@
         </w:rPr>
         <w:t>KalamCoach</w:t>
       </w:r>
-      <w:proofErr w:type="spellEnd"/>
-      <w:r>
-        <w:t xml:space="preserve"> -f “c:\users\</w:t>
-      </w:r>
-      <w:proofErr w:type="spellStart"/>
-      <w:r>
-        <w:t>hema</w:t>
-      </w:r>
-      <w:proofErr w:type="spellEnd"/>
-      <w:r>
-        <w:t>\downloads\</w:t>
+      <w:r>
+        <w:t xml:space="preserve"> -f “c:\users\hema\downloads\</w:t>
       </w:r>
       <w:r>
         <w:t xml:space="preserve"> </w:t>
@@ -1967,7 +1892,6 @@
           <w:b/>
           <w:bCs/>
         </w:rPr>
-        <w:lastRenderedPageBreak/>
         <w:t>KoachKohli.md</w:t>
       </w:r>
     </w:p>
@@ -2263,7 +2187,6 @@
           <w:b/>
           <w:bCs/>
         </w:rPr>
-        <w:lastRenderedPageBreak/>
         <w:t>Day</w:t>
       </w:r>
       <w:r>
@@ -2321,21 +2244,8 @@
     </w:p>
     <w:p>
       <w:r>
-        <w:t xml:space="preserve">python -m </w:t>
-      </w:r>
-      <w:proofErr w:type="spellStart"/>
-      <w:r>
-        <w:t>venv</w:t>
-      </w:r>
-      <w:proofErr w:type="spellEnd"/>
-      <w:r>
-        <w:t xml:space="preserve"> </w:t>
-      </w:r>
-      <w:proofErr w:type="spellStart"/>
-      <w:r>
-        <w:t>venv</w:t>
-      </w:r>
-      <w:proofErr w:type="spellEnd"/>
+        <w:t>python -m venv venv</w:t>
+      </w:r>
     </w:p>
     <w:p>
       <w:pPr>
@@ -2353,13 +2263,8 @@
       </w:r>
     </w:p>
     <w:p>
-      <w:proofErr w:type="spellStart"/>
-      <w:r>
-        <w:t>venv</w:t>
-      </w:r>
-      <w:proofErr w:type="spellEnd"/>
-      <w:r>
-        <w:t>\Scripts\activate</w:t>
+      <w:r>
+        <w:t>venv\Scripts\activate</w:t>
       </w:r>
     </w:p>
     <w:p>
@@ -2627,7 +2532,6 @@
           <w:b/>
           <w:bCs/>
         </w:rPr>
-        <w:lastRenderedPageBreak/>
         <w:t>Day</w:t>
       </w:r>
       <w:r>
@@ -2705,11 +2609,9 @@
       <w:r>
         <w:t xml:space="preserve"> </w:t>
       </w:r>
-      <w:proofErr w:type="spellStart"/>
       <w:r>
         <w:t>db</w:t>
       </w:r>
-      <w:proofErr w:type="spellEnd"/>
     </w:p>
     <w:p>
       <w:pPr>
@@ -2986,6 +2888,7 @@
           <w:b/>
           <w:bCs/>
         </w:rPr>
+        <w:lastRenderedPageBreak/>
         <w:t>Multi RAG:</w:t>
       </w:r>
       <w:r>
@@ -2996,13 +2899,8 @@
         <w:t xml:space="preserve"> </w:t>
       </w:r>
       <w:r>
-        <w:t xml:space="preserve">.pdf, .txt, .md, .doc and </w:t>
-      </w:r>
-      <w:proofErr w:type="spellStart"/>
-      <w:r>
-        <w:t>etc</w:t>
-      </w:r>
-      <w:proofErr w:type="spellEnd"/>
+        <w:t>.pdf, .txt, .md, .doc and etc</w:t>
+      </w:r>
     </w:p>
     <w:p>
       <w:pPr>
@@ -3084,21 +2982,12 @@
           <w:bCs/>
         </w:rPr>
       </w:pPr>
-      <w:proofErr w:type="spellStart"/>
-      <w:r>
-        <w:rPr>
-          <w:b/>
-          <w:bCs/>
-        </w:rPr>
-        <w:t>Vercel</w:t>
-      </w:r>
-      <w:proofErr w:type="spellEnd"/>
-      <w:r>
-        <w:rPr>
-          <w:b/>
-          <w:bCs/>
-        </w:rPr>
-        <w:t xml:space="preserve"> (React UI)</w:t>
+      <w:r>
+        <w:rPr>
+          <w:b/>
+          <w:bCs/>
+        </w:rPr>
+        <w:t>Vercel (React UI)</w:t>
       </w:r>
     </w:p>
     <w:p>
@@ -3128,23 +3017,7 @@
           <w:b/>
           <w:bCs/>
         </w:rPr>
-        <w:t>Render (</w:t>
-      </w:r>
-      <w:proofErr w:type="spellStart"/>
-      <w:r>
-        <w:rPr>
-          <w:b/>
-          <w:bCs/>
-        </w:rPr>
-        <w:t>FastAPI</w:t>
-      </w:r>
-      <w:proofErr w:type="spellEnd"/>
-      <w:r>
-        <w:rPr>
-          <w:b/>
-          <w:bCs/>
-        </w:rPr>
-        <w:t xml:space="preserve"> MCP + RAG)</w:t>
+        <w:t>Render (FastAPI MCP + RAG)</w:t>
       </w:r>
     </w:p>
     <w:p>
@@ -3169,21 +3042,12 @@
           <w:bCs/>
         </w:rPr>
       </w:pPr>
-      <w:proofErr w:type="spellStart"/>
-      <w:r>
-        <w:rPr>
-          <w:b/>
-          <w:bCs/>
-        </w:rPr>
-        <w:t>Supabase</w:t>
-      </w:r>
-      <w:proofErr w:type="spellEnd"/>
-      <w:r>
-        <w:rPr>
-          <w:b/>
-          <w:bCs/>
-        </w:rPr>
-        <w:t xml:space="preserve"> (DB + Auth + Vector)</w:t>
+      <w:r>
+        <w:rPr>
+          <w:b/>
+          <w:bCs/>
+        </w:rPr>
+        <w:t>Supabase (DB + Auth + Vector)</w:t>
       </w:r>
     </w:p>
     <w:p>
@@ -3401,6 +3265,7 @@
           <w:b/>
           <w:bCs/>
         </w:rPr>
+        <w:lastRenderedPageBreak/>
         <w:t>Day</w:t>
       </w:r>
       <w:r>
@@ -3419,14 +3284,8 @@
       </w:r>
     </w:p>
     <w:p>
-      <w:proofErr w:type="spellStart"/>
-      <w:r>
-        <w:lastRenderedPageBreak/>
-        <w:t>Langchain</w:t>
-      </w:r>
-      <w:proofErr w:type="spellEnd"/>
-      <w:r>
-        <w:t xml:space="preserve"> – chain of </w:t>
+      <w:r>
+        <w:t xml:space="preserve">Langchain – chain of </w:t>
       </w:r>
       <w:r>
         <w:t>thoughts: A -&gt; B-&gt; C</w:t>
@@ -3445,37 +3304,30 @@
       </w:r>
     </w:p>
     <w:p>
-      <w:proofErr w:type="spellStart"/>
-      <w:r>
-        <w:t>langgraph</w:t>
-      </w:r>
-      <w:proofErr w:type="spellEnd"/>
+      <w:r>
+        <w:t xml:space="preserve">langgraph </w:t>
+      </w:r>
+      <w:r>
+        <w:t xml:space="preserve">– </w:t>
+      </w:r>
+      <w:r>
+        <w:t>multi-step, looping, and agent-style workflows</w:t>
+      </w:r>
+    </w:p>
+    <w:p>
+      <w:pPr>
+        <w:rPr>
+          <w:b/>
+          <w:bCs/>
+        </w:rPr>
+      </w:pPr>
+      <w:r>
+        <w:t>langsmith</w:t>
+      </w:r>
       <w:r>
         <w:t xml:space="preserve"> </w:t>
       </w:r>
       <w:r>
-        <w:t xml:space="preserve">– </w:t>
-      </w:r>
-      <w:r>
-        <w:t>multi-step, looping, and agent-style workflows</w:t>
-      </w:r>
-    </w:p>
-    <w:p>
-      <w:pPr>
-        <w:rPr>
-          <w:b/>
-          <w:bCs/>
-        </w:rPr>
-      </w:pPr>
-      <w:proofErr w:type="spellStart"/>
-      <w:r>
-        <w:t>langsmith</w:t>
-      </w:r>
-      <w:proofErr w:type="spellEnd"/>
-      <w:r>
-        <w:t xml:space="preserve"> </w:t>
-      </w:r>
-      <w:r>
         <w:t>- building</w:t>
       </w:r>
       <w:r>
@@ -3510,23 +3362,7 @@
           <w:b/>
           <w:bCs/>
         </w:rPr>
-        <w:t xml:space="preserve">Additional </w:t>
-      </w:r>
-      <w:proofErr w:type="gramStart"/>
-      <w:r>
-        <w:rPr>
-          <w:b/>
-          <w:bCs/>
-        </w:rPr>
-        <w:t>Session :</w:t>
-      </w:r>
-      <w:proofErr w:type="gramEnd"/>
-      <w:r>
-        <w:rPr>
-          <w:b/>
-          <w:bCs/>
-        </w:rPr>
-        <w:t xml:space="preserve"> </w:t>
+        <w:t xml:space="preserve">Additional Session : </w:t>
       </w:r>
       <w:r>
         <w:rPr>
@@ -3871,6 +3707,7 @@
         </w:numPr>
       </w:pPr>
       <w:r>
+        <w:lastRenderedPageBreak/>
         <w:t xml:space="preserve">Voice AI Assistants </w:t>
       </w:r>
     </w:p>
@@ -3883,7 +3720,6 @@
         </w:numPr>
       </w:pPr>
       <w:r>
-        <w:lastRenderedPageBreak/>
         <w:t xml:space="preserve">AI workflow orchestration </w:t>
       </w:r>
     </w:p>
@@ -4564,13 +4400,8 @@
           <w:numId w:val="6"/>
         </w:numPr>
       </w:pPr>
-      <w:proofErr w:type="spellStart"/>
-      <w:r>
-        <w:t>openai</w:t>
-      </w:r>
-      <w:proofErr w:type="spellEnd"/>
-      <w:r>
-        <w:t>-whisper</w:t>
+      <w:r>
+        <w:t>openai-whisper</w:t>
       </w:r>
     </w:p>
     <w:p>
@@ -4602,14 +4433,12 @@
           <w:numId w:val="20"/>
         </w:numPr>
       </w:pPr>
-      <w:proofErr w:type="spellStart"/>
       <w:r>
         <w:t>P</w:t>
       </w:r>
       <w:r>
         <w:t>ytesseract</w:t>
       </w:r>
-      <w:proofErr w:type="spellEnd"/>
     </w:p>
     <w:p>
       <w:pPr>
@@ -4619,13 +4448,8 @@
           <w:numId w:val="20"/>
         </w:numPr>
       </w:pPr>
-      <w:proofErr w:type="spellStart"/>
-      <w:r>
-        <w:t>dall·e</w:t>
-      </w:r>
-      <w:proofErr w:type="spellEnd"/>
-      <w:r>
-        <w:t xml:space="preserve"> </w:t>
+      <w:r>
+        <w:t xml:space="preserve">dall·e </w:t>
       </w:r>
       <w:r>
         <w:t xml:space="preserve">- </w:t>
@@ -4660,15 +4484,7 @@
         <w:tab/>
       </w:r>
       <w:r>
-        <w:t xml:space="preserve">1.Download the files </w:t>
-      </w:r>
-      <w:proofErr w:type="gramStart"/>
-      <w:r>
-        <w:t>from :ffmpeg</w:t>
-      </w:r>
-      <w:proofErr w:type="gramEnd"/>
-      <w:r>
-        <w:t>-git-full.7z</w:t>
+        <w:t>1.Download the files from :ffmpeg-git-full.7z</w:t>
       </w:r>
     </w:p>
     <w:p>
@@ -4692,13 +4508,8 @@
         <w:ind w:left="720"/>
       </w:pPr>
       <w:r>
-        <w:t>3.Extract and place under C/</w:t>
-      </w:r>
-      <w:proofErr w:type="spellStart"/>
-      <w:r>
-        <w:t>ffmpeg</w:t>
-      </w:r>
-      <w:proofErr w:type="spellEnd"/>
+        <w:t>3.Extract and place under C/ffmpeg</w:t>
+      </w:r>
     </w:p>
     <w:p>
       <w:pPr>
@@ -4711,15 +4522,7 @@
         <w:t xml:space="preserve"> (</w:t>
       </w:r>
       <w:r>
-        <w:t>C:\</w:t>
-      </w:r>
-      <w:proofErr w:type="spellStart"/>
-      <w:r>
-        <w:t>ffmpeg</w:t>
-      </w:r>
-      <w:proofErr w:type="spellEnd"/>
-      <w:r>
-        <w:t>\bin</w:t>
+        <w:t>C:\ffmpeg\bin</w:t>
       </w:r>
       <w:r>
         <w:t>)</w:t>
@@ -4749,33 +4552,7 @@
         <w:ind w:left="720"/>
       </w:pPr>
       <w:r>
-        <w:t>"</w:t>
-      </w:r>
-      <w:proofErr w:type="spellStart"/>
-      <w:proofErr w:type="gramStart"/>
-      <w:r>
-        <w:t>py</w:t>
-      </w:r>
-      <w:proofErr w:type="spellEnd"/>
-      <w:proofErr w:type="gramEnd"/>
-      <w:r>
-        <w:t xml:space="preserve"> -m </w:t>
-      </w:r>
-      <w:proofErr w:type="spellStart"/>
-      <w:r>
-        <w:t>streamlit</w:t>
-      </w:r>
-      <w:proofErr w:type="spellEnd"/>
-      <w:r>
-        <w:t xml:space="preserve"> </w:t>
-      </w:r>
-      <w:proofErr w:type="gramStart"/>
-      <w:r>
-        <w:t>run .</w:t>
-      </w:r>
-      <w:proofErr w:type="gramEnd"/>
-      <w:r>
-        <w:t>\Multimodal.py"</w:t>
+        <w:t>"py -m streamlit run .\Multimodal.py"</w:t>
       </w:r>
     </w:p>
     <w:p/>
@@ -5059,15 +4836,7 @@
     </w:p>
     <w:p>
       <w:r>
-        <w:t>&gt;</w:t>
-      </w:r>
-      <w:proofErr w:type="spellStart"/>
-      <w:r>
-        <w:t>npm</w:t>
-      </w:r>
-      <w:proofErr w:type="spellEnd"/>
-      <w:r>
-        <w:t xml:space="preserve"> install n8n -g</w:t>
+        <w:t>&gt;npm install n8n -g</w:t>
       </w:r>
     </w:p>
     <w:p>
@@ -5717,13 +5486,8 @@
       <w:r>
         <w:t xml:space="preserve"> and needs to be identified patterns (account number, SSN, credit card number </w:t>
       </w:r>
-      <w:proofErr w:type="spellStart"/>
-      <w:r>
-        <w:t>etc</w:t>
-      </w:r>
-      <w:proofErr w:type="spellEnd"/>
-      <w:r>
-        <w:t>)</w:t>
+      <w:r>
+        <w:t>etc)</w:t>
       </w:r>
     </w:p>
     <w:p>
@@ -6333,15 +6097,7 @@
         </w:numPr>
       </w:pPr>
       <w:r>
-        <w:t xml:space="preserve">google </w:t>
-      </w:r>
-      <w:proofErr w:type="spellStart"/>
-      <w:r>
-        <w:t>adk</w:t>
-      </w:r>
-      <w:proofErr w:type="spellEnd"/>
-      <w:r>
-        <w:t>?</w:t>
+        <w:t>google adk?</w:t>
       </w:r>
     </w:p>
     <w:p>
@@ -6466,13 +6222,8 @@
             <w:hideMark/>
           </w:tcPr>
           <w:p>
-            <w:proofErr w:type="spellStart"/>
             <w:r>
-              <w:t>ReAct</w:t>
-            </w:r>
-            <w:proofErr w:type="spellEnd"/>
-            <w:r>
-              <w:t xml:space="preserve"> (Reason + Act)</w:t>
+              <w:t>ReAct (Reason + Act)</w:t>
             </w:r>
           </w:p>
         </w:tc>
@@ -6864,21 +6615,8 @@
             <w:hideMark/>
           </w:tcPr>
           <w:p>
-            <w:proofErr w:type="spellStart"/>
             <w:r>
-              <w:t>LangChain</w:t>
-            </w:r>
-            <w:proofErr w:type="spellEnd"/>
-            <w:r>
-              <w:t xml:space="preserve">, </w:t>
-            </w:r>
-            <w:proofErr w:type="spellStart"/>
-            <w:r>
-              <w:t>LlamaIndex</w:t>
-            </w:r>
-            <w:proofErr w:type="spellEnd"/>
-            <w:r>
-              <w:t>, Haystack</w:t>
+              <w:t>LangChain, LlamaIndex, Haystack</w:t>
             </w:r>
           </w:p>
         </w:tc>
@@ -6918,29 +6656,8 @@
             <w:hideMark/>
           </w:tcPr>
           <w:p>
-            <w:proofErr w:type="spellStart"/>
             <w:r>
-              <w:t>LangGraph</w:t>
-            </w:r>
-            <w:proofErr w:type="spellEnd"/>
-            <w:r>
-              <w:t xml:space="preserve">, </w:t>
-            </w:r>
-            <w:proofErr w:type="spellStart"/>
-            <w:r>
-              <w:t>CrewAI</w:t>
-            </w:r>
-            <w:proofErr w:type="spellEnd"/>
-            <w:r>
-              <w:t xml:space="preserve">, </w:t>
-            </w:r>
-            <w:proofErr w:type="spellStart"/>
-            <w:r>
-              <w:t>AutoGen</w:t>
-            </w:r>
-            <w:proofErr w:type="spellEnd"/>
-            <w:r>
-              <w:t>, OpenAI Agents SDK</w:t>
+              <w:t>LangGraph, CrewAI, AutoGen, OpenAI Agents SDK</w:t>
             </w:r>
           </w:p>
         </w:tc>
@@ -6981,21 +6698,8 @@
             <w:hideMark/>
           </w:tcPr>
           <w:p>
-            <w:proofErr w:type="spellStart"/>
             <w:r>
-              <w:t>GraphRAG</w:t>
-            </w:r>
-            <w:proofErr w:type="spellEnd"/>
-            <w:r>
-              <w:t xml:space="preserve">, Neo4j, </w:t>
-            </w:r>
-            <w:proofErr w:type="spellStart"/>
-            <w:r>
-              <w:t>LlamaIndex</w:t>
-            </w:r>
-            <w:proofErr w:type="spellEnd"/>
-            <w:r>
-              <w:t xml:space="preserve"> Knowledge Graph</w:t>
+              <w:t>GraphRAG, Neo4j, LlamaIndex Knowledge Graph</w:t>
             </w:r>
           </w:p>
         </w:tc>
@@ -7035,19 +6739,9 @@
             <w:hideMark/>
           </w:tcPr>
           <w:p>
-            <w:proofErr w:type="spellStart"/>
             <w:r>
-              <w:t>LangGraph</w:t>
+              <w:t>LangGraph, Haystack, DSPy</w:t>
             </w:r>
-            <w:proofErr w:type="spellEnd"/>
-            <w:r>
-              <w:t xml:space="preserve">, Haystack, </w:t>
-            </w:r>
-            <w:proofErr w:type="spellStart"/>
-            <w:r>
-              <w:t>DSPy</w:t>
-            </w:r>
-            <w:proofErr w:type="spellEnd"/>
           </w:p>
         </w:tc>
         <w:tc>
@@ -7125,6 +6819,51 @@
         <w:t>, Crew AI, Auto gen</w:t>
       </w:r>
     </w:p>
+    <w:p/>
+    <w:p>
+      <w:pPr>
+        <w:rPr>
+          <w:b/>
+          <w:bCs/>
+        </w:rPr>
+      </w:pPr>
+      <w:r>
+        <w:rPr>
+          <w:b/>
+          <w:bCs/>
+        </w:rPr>
+        <w:t>Day</w:t>
+      </w:r>
+      <w:r>
+        <w:rPr>
+          <w:b/>
+          <w:bCs/>
+        </w:rPr>
+        <w:t>3</w:t>
+      </w:r>
+      <w:r>
+        <w:rPr>
+          <w:b/>
+          <w:bCs/>
+        </w:rPr>
+        <w:t>3</w:t>
+      </w:r>
+      <w:r>
+        <w:rPr>
+          <w:b/>
+          <w:bCs/>
+        </w:rPr>
+        <w:t>:</w:t>
+      </w:r>
+      <w:r>
+        <w:rPr>
+          <w:b/>
+          <w:bCs/>
+        </w:rPr>
+        <w:t xml:space="preserve"> </w:t>
+      </w:r>
+    </w:p>
+    <w:p/>
     <w:p/>
     <w:p/>
     <w:p>

</xml_diff>

<commit_message>
Add Day34 content on Git, GitHub, and context caching in AI
</commit_message>
<xml_diff>
--- a/documentation/Gen AI and Agentic AI.docx
+++ b/documentation/Gen AI and Agentic AI.docx
@@ -56,6 +56,7 @@
         </w:rPr>
       </w:pPr>
       <w:hyperlink r:id="rId6" w:history="1">
+        <w:proofErr w:type="spellStart"/>
         <w:r>
           <w:rPr>
             <w:rStyle w:val="Hyperlink"/>
@@ -64,6 +65,7 @@
           </w:rPr>
           <w:t>Ollama</w:t>
         </w:r>
+        <w:proofErr w:type="spellEnd"/>
       </w:hyperlink>
       <w:r>
         <w:rPr>
@@ -183,7 +185,21 @@
           <w:rPr>
             <w:rStyle w:val="Hyperlink"/>
           </w:rPr>
-          <w:t>ChatGPT - NutriPro -Ghar Ka Khana</w:t>
+          <w:t xml:space="preserve">ChatGPT - </w:t>
+        </w:r>
+        <w:proofErr w:type="spellStart"/>
+        <w:r>
+          <w:rPr>
+            <w:rStyle w:val="Hyperlink"/>
+          </w:rPr>
+          <w:t>NutriPro</w:t>
+        </w:r>
+        <w:proofErr w:type="spellEnd"/>
+        <w:r>
+          <w:rPr>
+            <w:rStyle w:val="Hyperlink"/>
+          </w:rPr>
+          <w:t xml:space="preserve"> -Ghar Ka Khana</w:t>
         </w:r>
       </w:hyperlink>
     </w:p>
@@ -1356,6 +1372,7 @@
         </w:rPr>
       </w:pPr>
       <w:hyperlink r:id="rId17" w:history="1">
+        <w:proofErr w:type="spellStart"/>
         <w:r>
           <w:rPr>
             <w:rStyle w:val="Hyperlink"/>
@@ -1364,6 +1381,7 @@
           </w:rPr>
           <w:t>Ollama</w:t>
         </w:r>
+        <w:proofErr w:type="spellEnd"/>
       </w:hyperlink>
     </w:p>
     <w:p>
@@ -1385,6 +1403,7 @@
       </w:hyperlink>
     </w:p>
     <w:p>
+      <w:proofErr w:type="spellStart"/>
       <w:r>
         <w:rPr>
           <w:b/>
@@ -1392,6 +1411,7 @@
         </w:rPr>
         <w:t>Ollama</w:t>
       </w:r>
+      <w:proofErr w:type="spellEnd"/>
       <w:r>
         <w:t xml:space="preserve"> is a tool that lets you </w:t>
       </w:r>
@@ -1413,6 +1433,7 @@
           <w:bCs/>
         </w:rPr>
       </w:pPr>
+      <w:proofErr w:type="spellStart"/>
       <w:r>
         <w:rPr>
           <w:b/>
@@ -1420,6 +1441,7 @@
         </w:rPr>
         <w:t>Ollama</w:t>
       </w:r>
+      <w:proofErr w:type="spellEnd"/>
       <w:r>
         <w:rPr>
           <w:b/>
@@ -1456,30 +1478,46 @@
       </w:r>
     </w:p>
     <w:p>
-      <w:r>
-        <w:t>ollama run “model name”</w:t>
-      </w:r>
-    </w:p>
-    <w:p>
+      <w:proofErr w:type="spellStart"/>
       <w:r>
         <w:t>ollama</w:t>
       </w:r>
+      <w:proofErr w:type="spellEnd"/>
+      <w:r>
+        <w:t xml:space="preserve"> run “model name”</w:t>
+      </w:r>
+    </w:p>
+    <w:p>
+      <w:proofErr w:type="spellStart"/>
+      <w:r>
+        <w:t>ollama</w:t>
+      </w:r>
+      <w:proofErr w:type="spellEnd"/>
       <w:r>
         <w:t xml:space="preserve"> ls</w:t>
       </w:r>
     </w:p>
     <w:p>
+      <w:proofErr w:type="spellStart"/>
       <w:r>
         <w:t>ollama</w:t>
       </w:r>
-      <w:r>
-        <w:t xml:space="preserve"> ps</w:t>
-      </w:r>
-    </w:p>
-    <w:p>
+      <w:proofErr w:type="spellEnd"/>
+      <w:r>
+        <w:t xml:space="preserve"> </w:t>
+      </w:r>
+      <w:proofErr w:type="spellStart"/>
+      <w:r>
+        <w:t>ps</w:t>
+      </w:r>
+      <w:proofErr w:type="spellEnd"/>
+    </w:p>
+    <w:p>
+      <w:proofErr w:type="spellStart"/>
       <w:r>
         <w:t>ollama</w:t>
       </w:r>
+      <w:proofErr w:type="spellEnd"/>
       <w:r>
         <w:t xml:space="preserve"> help</w:t>
       </w:r>
@@ -1510,7 +1548,15 @@
     </w:p>
     <w:p>
       <w:r>
-        <w:t>Your App → Ollama → Local Model → Response</w:t>
+        <w:t xml:space="preserve">Your App → </w:t>
+      </w:r>
+      <w:proofErr w:type="spellStart"/>
+      <w:r>
+        <w:t>Ollama</w:t>
+      </w:r>
+      <w:proofErr w:type="spellEnd"/>
+      <w:r>
+        <w:t xml:space="preserve"> → Local Model → Response</w:t>
       </w:r>
     </w:p>
     <w:p>
@@ -1540,8 +1586,17 @@
           <w:b/>
           <w:bCs/>
         </w:rPr>
-        <w:t xml:space="preserve"> Why people use Ollama</w:t>
-      </w:r>
+        <w:t xml:space="preserve"> Why people use </w:t>
+      </w:r>
+      <w:proofErr w:type="spellStart"/>
+      <w:r>
+        <w:rPr>
+          <w:b/>
+          <w:bCs/>
+        </w:rPr>
+        <w:t>Ollama</w:t>
+      </w:r>
+      <w:proofErr w:type="spellEnd"/>
     </w:p>
     <w:p>
       <w:pPr>
@@ -1722,8 +1777,13 @@
       </w:r>
     </w:p>
     <w:p>
-      <w:r>
-        <w:t>ollama create “custom model name”</w:t>
+      <w:proofErr w:type="spellStart"/>
+      <w:r>
+        <w:t>ollama</w:t>
+      </w:r>
+      <w:proofErr w:type="spellEnd"/>
+      <w:r>
+        <w:t xml:space="preserve"> create “custom model name”</w:t>
       </w:r>
     </w:p>
     <w:p>
@@ -1756,24 +1816,39 @@
       </w:r>
     </w:p>
     <w:p>
-      <w:r>
-        <w:rPr>
-          <w:b/>
-          <w:bCs/>
-        </w:rPr>
-        <w:t>cmd:</w:t>
+      <w:proofErr w:type="spellStart"/>
+      <w:r>
+        <w:rPr>
+          <w:b/>
+          <w:bCs/>
+        </w:rPr>
+        <w:t>cmd</w:t>
+      </w:r>
+      <w:proofErr w:type="spellEnd"/>
+      <w:r>
+        <w:rPr>
+          <w:b/>
+          <w:bCs/>
+        </w:rPr>
+        <w:t>:</w:t>
       </w:r>
       <w:r>
         <w:t xml:space="preserve"> </w:t>
       </w:r>
     </w:p>
     <w:p>
+      <w:proofErr w:type="spellStart"/>
       <w:r>
         <w:t>o</w:t>
       </w:r>
       <w:r>
-        <w:t xml:space="preserve">llama create </w:t>
-      </w:r>
+        <w:t>llama</w:t>
+      </w:r>
+      <w:proofErr w:type="spellEnd"/>
+      <w:r>
+        <w:t xml:space="preserve"> create </w:t>
+      </w:r>
+      <w:proofErr w:type="spellStart"/>
       <w:r>
         <w:rPr>
           <w:b/>
@@ -1781,8 +1856,17 @@
         </w:rPr>
         <w:t>KalamCoach</w:t>
       </w:r>
-      <w:r>
-        <w:t xml:space="preserve"> -f “c:\users\hema\downloads\</w:t>
+      <w:proofErr w:type="spellEnd"/>
+      <w:r>
+        <w:t xml:space="preserve"> -f “c:\users\</w:t>
+      </w:r>
+      <w:proofErr w:type="spellStart"/>
+      <w:r>
+        <w:t>hema</w:t>
+      </w:r>
+      <w:proofErr w:type="spellEnd"/>
+      <w:r>
+        <w:t>\downloads\</w:t>
       </w:r>
       <w:r>
         <w:t xml:space="preserve"> </w:t>
@@ -2244,8 +2328,21 @@
     </w:p>
     <w:p>
       <w:r>
-        <w:t>python -m venv venv</w:t>
-      </w:r>
+        <w:t xml:space="preserve">python -m </w:t>
+      </w:r>
+      <w:proofErr w:type="spellStart"/>
+      <w:r>
+        <w:t>venv</w:t>
+      </w:r>
+      <w:proofErr w:type="spellEnd"/>
+      <w:r>
+        <w:t xml:space="preserve"> </w:t>
+      </w:r>
+      <w:proofErr w:type="spellStart"/>
+      <w:r>
+        <w:t>venv</w:t>
+      </w:r>
+      <w:proofErr w:type="spellEnd"/>
     </w:p>
     <w:p>
       <w:pPr>
@@ -2263,8 +2360,13 @@
       </w:r>
     </w:p>
     <w:p>
-      <w:r>
-        <w:t>venv\Scripts\activate</w:t>
+      <w:proofErr w:type="spellStart"/>
+      <w:r>
+        <w:t>venv</w:t>
+      </w:r>
+      <w:proofErr w:type="spellEnd"/>
+      <w:r>
+        <w:t>\Scripts\activate</w:t>
       </w:r>
     </w:p>
     <w:p>
@@ -2609,9 +2711,11 @@
       <w:r>
         <w:t xml:space="preserve"> </w:t>
       </w:r>
+      <w:proofErr w:type="spellStart"/>
       <w:r>
         <w:t>db</w:t>
       </w:r>
+      <w:proofErr w:type="spellEnd"/>
     </w:p>
     <w:p>
       <w:pPr>
@@ -2899,8 +3003,13 @@
         <w:t xml:space="preserve"> </w:t>
       </w:r>
       <w:r>
-        <w:t>.pdf, .txt, .md, .doc and etc</w:t>
-      </w:r>
+        <w:t xml:space="preserve">.pdf, .txt, .md, .doc and </w:t>
+      </w:r>
+      <w:proofErr w:type="spellStart"/>
+      <w:r>
+        <w:t>etc</w:t>
+      </w:r>
+      <w:proofErr w:type="spellEnd"/>
     </w:p>
     <w:p>
       <w:pPr>
@@ -2982,12 +3091,21 @@
           <w:bCs/>
         </w:rPr>
       </w:pPr>
-      <w:r>
-        <w:rPr>
-          <w:b/>
-          <w:bCs/>
-        </w:rPr>
-        <w:t>Vercel (React UI)</w:t>
+      <w:proofErr w:type="spellStart"/>
+      <w:r>
+        <w:rPr>
+          <w:b/>
+          <w:bCs/>
+        </w:rPr>
+        <w:t>Vercel</w:t>
+      </w:r>
+      <w:proofErr w:type="spellEnd"/>
+      <w:r>
+        <w:rPr>
+          <w:b/>
+          <w:bCs/>
+        </w:rPr>
+        <w:t xml:space="preserve"> (React UI)</w:t>
       </w:r>
     </w:p>
     <w:p>
@@ -3017,7 +3135,23 @@
           <w:b/>
           <w:bCs/>
         </w:rPr>
-        <w:t>Render (FastAPI MCP + RAG)</w:t>
+        <w:t>Render (</w:t>
+      </w:r>
+      <w:proofErr w:type="spellStart"/>
+      <w:r>
+        <w:rPr>
+          <w:b/>
+          <w:bCs/>
+        </w:rPr>
+        <w:t>FastAPI</w:t>
+      </w:r>
+      <w:proofErr w:type="spellEnd"/>
+      <w:r>
+        <w:rPr>
+          <w:b/>
+          <w:bCs/>
+        </w:rPr>
+        <w:t xml:space="preserve"> MCP + RAG)</w:t>
       </w:r>
     </w:p>
     <w:p>
@@ -3042,12 +3176,21 @@
           <w:bCs/>
         </w:rPr>
       </w:pPr>
-      <w:r>
-        <w:rPr>
-          <w:b/>
-          <w:bCs/>
-        </w:rPr>
-        <w:t>Supabase (DB + Auth + Vector)</w:t>
+      <w:proofErr w:type="spellStart"/>
+      <w:r>
+        <w:rPr>
+          <w:b/>
+          <w:bCs/>
+        </w:rPr>
+        <w:t>Supabase</w:t>
+      </w:r>
+      <w:proofErr w:type="spellEnd"/>
+      <w:r>
+        <w:rPr>
+          <w:b/>
+          <w:bCs/>
+        </w:rPr>
+        <w:t xml:space="preserve"> (DB + Auth + Vector)</w:t>
       </w:r>
     </w:p>
     <w:p>
@@ -3284,8 +3427,13 @@
       </w:r>
     </w:p>
     <w:p>
-      <w:r>
-        <w:t xml:space="preserve">Langchain – chain of </w:t>
+      <w:proofErr w:type="spellStart"/>
+      <w:r>
+        <w:t>Langchain</w:t>
+      </w:r>
+      <w:proofErr w:type="spellEnd"/>
+      <w:r>
+        <w:t xml:space="preserve"> – chain of </w:t>
       </w:r>
       <w:r>
         <w:t>thoughts: A -&gt; B-&gt; C</w:t>
@@ -3304,8 +3452,13 @@
       </w:r>
     </w:p>
     <w:p>
-      <w:r>
-        <w:t xml:space="preserve">langgraph </w:t>
+      <w:proofErr w:type="spellStart"/>
+      <w:r>
+        <w:t>langgraph</w:t>
+      </w:r>
+      <w:proofErr w:type="spellEnd"/>
+      <w:r>
+        <w:t xml:space="preserve"> </w:t>
       </w:r>
       <w:r>
         <w:t xml:space="preserve">– </w:t>
@@ -3321,9 +3474,11 @@
           <w:bCs/>
         </w:rPr>
       </w:pPr>
+      <w:proofErr w:type="spellStart"/>
       <w:r>
         <w:t>langsmith</w:t>
       </w:r>
+      <w:proofErr w:type="spellEnd"/>
       <w:r>
         <w:t xml:space="preserve"> </w:t>
       </w:r>
@@ -4400,8 +4555,13 @@
           <w:numId w:val="6"/>
         </w:numPr>
       </w:pPr>
-      <w:r>
-        <w:t>openai-whisper</w:t>
+      <w:proofErr w:type="spellStart"/>
+      <w:r>
+        <w:t>openai</w:t>
+      </w:r>
+      <w:proofErr w:type="spellEnd"/>
+      <w:r>
+        <w:t>-whisper</w:t>
       </w:r>
     </w:p>
     <w:p>
@@ -4433,12 +4593,14 @@
           <w:numId w:val="20"/>
         </w:numPr>
       </w:pPr>
+      <w:proofErr w:type="spellStart"/>
       <w:r>
         <w:t>P</w:t>
       </w:r>
       <w:r>
         <w:t>ytesseract</w:t>
       </w:r>
+      <w:proofErr w:type="spellEnd"/>
     </w:p>
     <w:p>
       <w:pPr>
@@ -4448,8 +4610,13 @@
           <w:numId w:val="20"/>
         </w:numPr>
       </w:pPr>
-      <w:r>
-        <w:t xml:space="preserve">dall·e </w:t>
+      <w:proofErr w:type="spellStart"/>
+      <w:r>
+        <w:t>dall·e</w:t>
+      </w:r>
+      <w:proofErr w:type="spellEnd"/>
+      <w:r>
+        <w:t xml:space="preserve"> </w:t>
       </w:r>
       <w:r>
         <w:t xml:space="preserve">- </w:t>
@@ -4508,8 +4675,13 @@
         <w:ind w:left="720"/>
       </w:pPr>
       <w:r>
-        <w:t>3.Extract and place under C/ffmpeg</w:t>
-      </w:r>
+        <w:t>3.Extract and place under C/</w:t>
+      </w:r>
+      <w:proofErr w:type="spellStart"/>
+      <w:r>
+        <w:t>ffmpeg</w:t>
+      </w:r>
+      <w:proofErr w:type="spellEnd"/>
     </w:p>
     <w:p>
       <w:pPr>
@@ -4522,7 +4694,15 @@
         <w:t xml:space="preserve"> (</w:t>
       </w:r>
       <w:r>
-        <w:t>C:\ffmpeg\bin</w:t>
+        <w:t>C:\</w:t>
+      </w:r>
+      <w:proofErr w:type="spellStart"/>
+      <w:r>
+        <w:t>ffmpeg</w:t>
+      </w:r>
+      <w:proofErr w:type="spellEnd"/>
+      <w:r>
+        <w:t>\bin</w:t>
       </w:r>
       <w:r>
         <w:t>)</w:t>
@@ -4552,7 +4732,23 @@
         <w:ind w:left="720"/>
       </w:pPr>
       <w:r>
-        <w:t>"py -m streamlit run .\Multimodal.py"</w:t>
+        <w:t>"</w:t>
+      </w:r>
+      <w:proofErr w:type="spellStart"/>
+      <w:r>
+        <w:t>py</w:t>
+      </w:r>
+      <w:proofErr w:type="spellEnd"/>
+      <w:r>
+        <w:t xml:space="preserve"> -m </w:t>
+      </w:r>
+      <w:proofErr w:type="spellStart"/>
+      <w:r>
+        <w:t>streamlit</w:t>
+      </w:r>
+      <w:proofErr w:type="spellEnd"/>
+      <w:r>
+        <w:t xml:space="preserve"> run .\Multimodal.py"</w:t>
       </w:r>
     </w:p>
     <w:p/>
@@ -4836,7 +5032,15 @@
     </w:p>
     <w:p>
       <w:r>
-        <w:t>&gt;npm install n8n -g</w:t>
+        <w:t>&gt;</w:t>
+      </w:r>
+      <w:proofErr w:type="spellStart"/>
+      <w:r>
+        <w:t>npm</w:t>
+      </w:r>
+      <w:proofErr w:type="spellEnd"/>
+      <w:r>
+        <w:t xml:space="preserve"> install n8n -g</w:t>
       </w:r>
     </w:p>
     <w:p>
@@ -5486,8 +5690,13 @@
       <w:r>
         <w:t xml:space="preserve"> and needs to be identified patterns (account number, SSN, credit card number </w:t>
       </w:r>
-      <w:r>
-        <w:t>etc)</w:t>
+      <w:proofErr w:type="spellStart"/>
+      <w:r>
+        <w:t>etc</w:t>
+      </w:r>
+      <w:proofErr w:type="spellEnd"/>
+      <w:r>
+        <w:t>)</w:t>
       </w:r>
     </w:p>
     <w:p>
@@ -6097,7 +6306,15 @@
         </w:numPr>
       </w:pPr>
       <w:r>
-        <w:t>google adk?</w:t>
+        <w:t xml:space="preserve">google </w:t>
+      </w:r>
+      <w:proofErr w:type="spellStart"/>
+      <w:r>
+        <w:t>adk</w:t>
+      </w:r>
+      <w:proofErr w:type="spellEnd"/>
+      <w:r>
+        <w:t>?</w:t>
       </w:r>
     </w:p>
     <w:p>
@@ -6222,8 +6439,13 @@
             <w:hideMark/>
           </w:tcPr>
           <w:p>
+            <w:proofErr w:type="spellStart"/>
             <w:r>
-              <w:t>ReAct (Reason + Act)</w:t>
+              <w:t>ReAct</w:t>
+            </w:r>
+            <w:proofErr w:type="spellEnd"/>
+            <w:r>
+              <w:t xml:space="preserve"> (Reason + Act)</w:t>
             </w:r>
           </w:p>
         </w:tc>
@@ -6615,8 +6837,21 @@
             <w:hideMark/>
           </w:tcPr>
           <w:p>
+            <w:proofErr w:type="spellStart"/>
             <w:r>
-              <w:t>LangChain, LlamaIndex, Haystack</w:t>
+              <w:t>LangChain</w:t>
+            </w:r>
+            <w:proofErr w:type="spellEnd"/>
+            <w:r>
+              <w:t xml:space="preserve">, </w:t>
+            </w:r>
+            <w:proofErr w:type="spellStart"/>
+            <w:r>
+              <w:t>LlamaIndex</w:t>
+            </w:r>
+            <w:proofErr w:type="spellEnd"/>
+            <w:r>
+              <w:t>, Haystack</w:t>
             </w:r>
           </w:p>
         </w:tc>
@@ -6656,8 +6891,29 @@
             <w:hideMark/>
           </w:tcPr>
           <w:p>
+            <w:proofErr w:type="spellStart"/>
             <w:r>
-              <w:t>LangGraph, CrewAI, AutoGen, OpenAI Agents SDK</w:t>
+              <w:t>LangGraph</w:t>
+            </w:r>
+            <w:proofErr w:type="spellEnd"/>
+            <w:r>
+              <w:t xml:space="preserve">, </w:t>
+            </w:r>
+            <w:proofErr w:type="spellStart"/>
+            <w:r>
+              <w:t>CrewAI</w:t>
+            </w:r>
+            <w:proofErr w:type="spellEnd"/>
+            <w:r>
+              <w:t xml:space="preserve">, </w:t>
+            </w:r>
+            <w:proofErr w:type="spellStart"/>
+            <w:r>
+              <w:t>AutoGen</w:t>
+            </w:r>
+            <w:proofErr w:type="spellEnd"/>
+            <w:r>
+              <w:t>, OpenAI Agents SDK</w:t>
             </w:r>
           </w:p>
         </w:tc>
@@ -6698,8 +6954,21 @@
             <w:hideMark/>
           </w:tcPr>
           <w:p>
+            <w:proofErr w:type="spellStart"/>
             <w:r>
-              <w:t>GraphRAG, Neo4j, LlamaIndex Knowledge Graph</w:t>
+              <w:t>GraphRAG</w:t>
+            </w:r>
+            <w:proofErr w:type="spellEnd"/>
+            <w:r>
+              <w:t xml:space="preserve">, Neo4j, </w:t>
+            </w:r>
+            <w:proofErr w:type="spellStart"/>
+            <w:r>
+              <w:t>LlamaIndex</w:t>
+            </w:r>
+            <w:proofErr w:type="spellEnd"/>
+            <w:r>
+              <w:t xml:space="preserve"> Knowledge Graph</w:t>
             </w:r>
           </w:p>
         </w:tc>
@@ -6739,9 +7008,19 @@
             <w:hideMark/>
           </w:tcPr>
           <w:p>
+            <w:proofErr w:type="spellStart"/>
             <w:r>
-              <w:t>LangGraph, Haystack, DSPy</w:t>
+              <w:t>LangGraph</w:t>
             </w:r>
+            <w:proofErr w:type="spellEnd"/>
+            <w:r>
+              <w:t xml:space="preserve">, Haystack, </w:t>
+            </w:r>
+            <w:proofErr w:type="spellStart"/>
+            <w:r>
+              <w:t>DSPy</w:t>
+            </w:r>
+            <w:proofErr w:type="spellEnd"/>
           </w:p>
         </w:tc>
         <w:tc>
@@ -6778,14 +7057,7 @@
           <w:b/>
           <w:bCs/>
         </w:rPr>
-        <w:t>3</w:t>
-      </w:r>
-      <w:r>
-        <w:rPr>
-          <w:b/>
-          <w:bCs/>
-        </w:rPr>
-        <w:t>2</w:t>
+        <w:t>32</w:t>
       </w:r>
       <w:r>
         <w:rPr>
@@ -6839,14 +7111,7 @@
           <w:b/>
           <w:bCs/>
         </w:rPr>
-        <w:t>3</w:t>
-      </w:r>
-      <w:r>
-        <w:rPr>
-          <w:b/>
-          <w:bCs/>
-        </w:rPr>
-        <w:t>3</w:t>
+        <w:t>33</w:t>
       </w:r>
       <w:r>
         <w:rPr>
@@ -6862,6 +7127,77 @@
         </w:rPr>
         <w:t xml:space="preserve"> </w:t>
       </w:r>
+    </w:p>
+    <w:p>
+      <w:pPr>
+        <w:rPr>
+          <w:b/>
+          <w:bCs/>
+        </w:rPr>
+      </w:pPr>
+    </w:p>
+    <w:p>
+      <w:pPr>
+        <w:rPr>
+          <w:b/>
+          <w:bCs/>
+        </w:rPr>
+      </w:pPr>
+      <w:r>
+        <w:rPr>
+          <w:b/>
+          <w:bCs/>
+        </w:rPr>
+        <w:t>Day</w:t>
+      </w:r>
+      <w:r>
+        <w:rPr>
+          <w:b/>
+          <w:bCs/>
+        </w:rPr>
+        <w:t>34</w:t>
+      </w:r>
+      <w:r>
+        <w:rPr>
+          <w:b/>
+          <w:bCs/>
+        </w:rPr>
+        <w:t>:</w:t>
+      </w:r>
+    </w:p>
+    <w:p>
+      <w:r>
+        <w:t xml:space="preserve">About </w:t>
+      </w:r>
+      <w:r>
+        <w:t>Git</w:t>
+      </w:r>
+      <w:r>
+        <w:t xml:space="preserve">, </w:t>
+      </w:r>
+      <w:r>
+        <w:t>GitHub</w:t>
+      </w:r>
+    </w:p>
+    <w:p>
+      <w:r>
+        <w:rPr>
+          <w:b/>
+          <w:bCs/>
+        </w:rPr>
+        <w:t>Context caching in AI</w:t>
+      </w:r>
+      <w:r>
+        <w:t xml:space="preserve"> (often referred to as prompt caching) is a technique that stores previously processed AI model inputs (like documents, system instructions, or long conversations) in a fast-access server layer. This allows the AI to reuse the data instead of recalculating it from scratch, significantly lowering costs and reducing latency.</w:t>
+      </w:r>
+    </w:p>
+    <w:p>
+      <w:pPr>
+        <w:rPr>
+          <w:b/>
+          <w:bCs/>
+        </w:rPr>
+      </w:pPr>
     </w:p>
     <w:p/>
     <w:p/>
@@ -10874,6 +11210,7 @@
   <w:style w:type="character" w:default="1" w:styleId="DefaultParagraphFont">
     <w:name w:val="Default Paragraph Font"/>
     <w:uiPriority w:val="1"/>
+    <w:semiHidden/>
     <w:unhideWhenUsed/>
   </w:style>
   <w:style w:type="table" w:default="1" w:styleId="TableNormal">

</xml_diff>